<commit_message>
atualização da aula do dia 08/09/2026
</commit_message>
<xml_diff>
--- a/apostila/Projeto Space For Men.docx
+++ b/apostila/Projeto Space For Men.docx
@@ -3577,6 +3577,9 @@
         <w:ind w:left="360"/>
       </w:pPr>
       <w:r>
+        <w:rPr>
+          <w:noProof/>
+        </w:rPr>
         <w:drawing>
           <wp:inline distT="0" distB="0" distL="0" distR="0" wp14:anchorId="12965145" wp14:editId="2997342D">
             <wp:extent cx="4758055" cy="904875"/>
@@ -4360,6 +4363,9 @@
         </w:tabs>
       </w:pPr>
       <w:r>
+        <w:rPr>
+          <w:noProof/>
+        </w:rPr>
         <w:drawing>
           <wp:inline distT="0" distB="0" distL="0" distR="0" wp14:anchorId="242DBDD1" wp14:editId="36274A9A">
             <wp:extent cx="3126213" cy="3495675"/>
@@ -4904,7 +4910,15 @@
       </w:r>
       <w:proofErr w:type="spellEnd"/>
       <w:r>
-        <w:t xml:space="preserve"> através de referencia por exemplo utilizamos o nome da </w:t>
+        <w:t xml:space="preserve"> através de </w:t>
+      </w:r>
+      <w:proofErr w:type="spellStart"/>
+      <w:r>
+        <w:t>referencia</w:t>
+      </w:r>
+      <w:proofErr w:type="spellEnd"/>
+      <w:r>
+        <w:t xml:space="preserve"> por exemplo utilizamos o nome da </w:t>
       </w:r>
       <w:proofErr w:type="spellStart"/>
       <w:r>
@@ -5119,8 +5133,6 @@
       <w:r>
         <w:t>da</w:t>
       </w:r>
-      <w:bookmarkStart w:id="0" w:name="_GoBack"/>
-      <w:bookmarkEnd w:id="0"/>
       <w:r>
         <w:t xml:space="preserve"> </w:t>
       </w:r>
@@ -5272,6 +5284,943 @@
       </w:pPr>
       <w:r>
         <w:t xml:space="preserve">40- </w:t>
+      </w:r>
+      <w:r>
+        <w:t xml:space="preserve">Na </w:t>
+      </w:r>
+      <w:proofErr w:type="spellStart"/>
+      <w:r>
+        <w:t>class</w:t>
+      </w:r>
+      <w:proofErr w:type="spellEnd"/>
+      <w:r>
+        <w:t xml:space="preserve"> produtos inserimos um espaço interno que aumentou o tamanho tanto para cima como para baixo</w:t>
+      </w:r>
+    </w:p>
+    <w:p>
+      <w:pPr>
+        <w:tabs>
+          <w:tab w:val="left" w:pos="3105"/>
+        </w:tabs>
+      </w:pPr>
+      <w:r>
+        <w:drawing>
+          <wp:inline distT="0" distB="0" distL="0" distR="0" wp14:anchorId="1159EAD4" wp14:editId="2BD6A0EC">
+            <wp:extent cx="1676634" cy="1181265"/>
+            <wp:effectExtent l="0" t="0" r="0" b="0"/>
+            <wp:docPr id="51" name="Imagem 51"/>
+            <wp:cNvGraphicFramePr>
+              <a:graphicFrameLocks xmlns:a="http://schemas.openxmlformats.org/drawingml/2006/main" noChangeAspect="1"/>
+            </wp:cNvGraphicFramePr>
+            <a:graphic xmlns:a="http://schemas.openxmlformats.org/drawingml/2006/main">
+              <a:graphicData uri="http://schemas.openxmlformats.org/drawingml/2006/picture">
+                <pic:pic xmlns:pic="http://schemas.openxmlformats.org/drawingml/2006/picture">
+                  <pic:nvPicPr>
+                    <pic:cNvPr id="1" name=""/>
+                    <pic:cNvPicPr/>
+                  </pic:nvPicPr>
+                  <pic:blipFill>
+                    <a:blip r:embed="rId75"/>
+                    <a:stretch>
+                      <a:fillRect/>
+                    </a:stretch>
+                  </pic:blipFill>
+                  <pic:spPr>
+                    <a:xfrm>
+                      <a:off x="0" y="0"/>
+                      <a:ext cx="1676634" cy="1181265"/>
+                    </a:xfrm>
+                    <a:prstGeom prst="rect">
+                      <a:avLst/>
+                    </a:prstGeom>
+                  </pic:spPr>
+                </pic:pic>
+              </a:graphicData>
+            </a:graphic>
+          </wp:inline>
+        </w:drawing>
+      </w:r>
+      <w:r>
+        <w:rPr>
+          <w:noProof/>
+        </w:rPr>
+        <w:drawing>
+          <wp:inline distT="0" distB="0" distL="0" distR="0" wp14:anchorId="02F3481E">
+            <wp:extent cx="5773420" cy="3769345"/>
+            <wp:effectExtent l="0" t="0" r="0" b="3175"/>
+            <wp:docPr id="68" name="Imagem 68"/>
+            <wp:cNvGraphicFramePr>
+              <a:graphicFrameLocks xmlns:a="http://schemas.openxmlformats.org/drawingml/2006/main" noChangeAspect="1"/>
+            </wp:cNvGraphicFramePr>
+            <a:graphic xmlns:a="http://schemas.openxmlformats.org/drawingml/2006/main">
+              <a:graphicData uri="http://schemas.openxmlformats.org/drawingml/2006/picture">
+                <pic:pic xmlns:pic="http://schemas.openxmlformats.org/drawingml/2006/picture">
+                  <pic:nvPicPr>
+                    <pic:cNvPr id="0" name="Picture 2"/>
+                    <pic:cNvPicPr>
+                      <a:picLocks noChangeAspect="1" noChangeArrowheads="1"/>
+                    </pic:cNvPicPr>
+                  </pic:nvPicPr>
+                  <pic:blipFill>
+                    <a:blip r:embed="rId76">
+                      <a:extLst>
+                        <a:ext uri="{28A0092B-C50C-407E-A947-70E740481C1C}">
+                          <a14:useLocalDpi xmlns:a14="http://schemas.microsoft.com/office/drawing/2010/main" val="0"/>
+                        </a:ext>
+                      </a:extLst>
+                    </a:blip>
+                    <a:srcRect/>
+                    <a:stretch>
+                      <a:fillRect/>
+                    </a:stretch>
+                  </pic:blipFill>
+                  <pic:spPr bwMode="auto">
+                    <a:xfrm>
+                      <a:off x="0" y="0"/>
+                      <a:ext cx="5792549" cy="3781834"/>
+                    </a:xfrm>
+                    <a:prstGeom prst="rect">
+                      <a:avLst/>
+                    </a:prstGeom>
+                    <a:noFill/>
+                  </pic:spPr>
+                </pic:pic>
+              </a:graphicData>
+            </a:graphic>
+          </wp:inline>
+        </w:drawing>
+      </w:r>
+    </w:p>
+    <w:p>
+      <w:pPr>
+        <w:tabs>
+          <w:tab w:val="left" w:pos="3105"/>
+        </w:tabs>
+      </w:pPr>
+    </w:p>
+    <w:p>
+      <w:pPr>
+        <w:tabs>
+          <w:tab w:val="left" w:pos="3105"/>
+        </w:tabs>
+        <w:rPr>
+          <w:noProof/>
+        </w:rPr>
+      </w:pPr>
+      <w:r>
+        <w:t xml:space="preserve">41- </w:t>
+      </w:r>
+      <w:proofErr w:type="gramStart"/>
+      <w:r>
+        <w:t>No produtos</w:t>
+      </w:r>
+      <w:proofErr w:type="gramEnd"/>
+      <w:r>
+        <w:t xml:space="preserve"> li adicionamos um espaço interno para cima </w:t>
+      </w:r>
+      <w:r>
+        <w:t>como para baixo e para direita e esquerda</w:t>
+      </w:r>
+    </w:p>
+    <w:p>
+      <w:pPr>
+        <w:tabs>
+          <w:tab w:val="left" w:pos="3105"/>
+        </w:tabs>
+      </w:pPr>
+      <w:r>
+        <w:rPr>
+          <w:noProof/>
+        </w:rPr>
+        <w:drawing>
+          <wp:inline distT="0" distB="0" distL="0" distR="0" wp14:anchorId="70754A31" wp14:editId="5EAC3DE6">
+            <wp:extent cx="2598821" cy="1708785"/>
+            <wp:effectExtent l="0" t="0" r="0" b="5715"/>
+            <wp:docPr id="69" name="Imagem 69"/>
+            <wp:cNvGraphicFramePr>
+              <a:graphicFrameLocks xmlns:a="http://schemas.openxmlformats.org/drawingml/2006/main" noChangeAspect="1"/>
+            </wp:cNvGraphicFramePr>
+            <a:graphic xmlns:a="http://schemas.openxmlformats.org/drawingml/2006/main">
+              <a:graphicData uri="http://schemas.openxmlformats.org/drawingml/2006/picture">
+                <pic:pic xmlns:pic="http://schemas.openxmlformats.org/drawingml/2006/picture">
+                  <pic:nvPicPr>
+                    <pic:cNvPr id="0" name="Picture 3"/>
+                    <pic:cNvPicPr>
+                      <a:picLocks noChangeAspect="1" noChangeArrowheads="1"/>
+                    </pic:cNvPicPr>
+                  </pic:nvPicPr>
+                  <pic:blipFill>
+                    <a:blip r:embed="rId77">
+                      <a:extLst>
+                        <a:ext uri="{28A0092B-C50C-407E-A947-70E740481C1C}">
+                          <a14:useLocalDpi xmlns:a14="http://schemas.microsoft.com/office/drawing/2010/main" val="0"/>
+                        </a:ext>
+                      </a:extLst>
+                    </a:blip>
+                    <a:srcRect/>
+                    <a:stretch>
+                      <a:fillRect/>
+                    </a:stretch>
+                  </pic:blipFill>
+                  <pic:spPr bwMode="auto">
+                    <a:xfrm>
+                      <a:off x="0" y="0"/>
+                      <a:ext cx="2705060" cy="1778640"/>
+                    </a:xfrm>
+                    <a:prstGeom prst="rect">
+                      <a:avLst/>
+                    </a:prstGeom>
+                    <a:noFill/>
+                  </pic:spPr>
+                </pic:pic>
+              </a:graphicData>
+            </a:graphic>
+          </wp:inline>
+        </w:drawing>
+      </w:r>
+      <w:r>
+        <w:t xml:space="preserve"> </w:t>
+      </w:r>
+      <w:r>
+        <w:rPr>
+          <w:noProof/>
+        </w:rPr>
+        <w:drawing>
+          <wp:inline distT="0" distB="0" distL="0" distR="0" wp14:anchorId="74D8C068">
+            <wp:extent cx="2600960" cy="2839718"/>
+            <wp:effectExtent l="0" t="0" r="8890" b="0"/>
+            <wp:docPr id="70" name="Imagem 70"/>
+            <wp:cNvGraphicFramePr>
+              <a:graphicFrameLocks xmlns:a="http://schemas.openxmlformats.org/drawingml/2006/main" noChangeAspect="1"/>
+            </wp:cNvGraphicFramePr>
+            <a:graphic xmlns:a="http://schemas.openxmlformats.org/drawingml/2006/main">
+              <a:graphicData uri="http://schemas.openxmlformats.org/drawingml/2006/picture">
+                <pic:pic xmlns:pic="http://schemas.openxmlformats.org/drawingml/2006/picture">
+                  <pic:nvPicPr>
+                    <pic:cNvPr id="0" name="Picture 4"/>
+                    <pic:cNvPicPr>
+                      <a:picLocks noChangeAspect="1" noChangeArrowheads="1"/>
+                    </pic:cNvPicPr>
+                  </pic:nvPicPr>
+                  <pic:blipFill>
+                    <a:blip r:embed="rId78">
+                      <a:extLst>
+                        <a:ext uri="{28A0092B-C50C-407E-A947-70E740481C1C}">
+                          <a14:useLocalDpi xmlns:a14="http://schemas.microsoft.com/office/drawing/2010/main" val="0"/>
+                        </a:ext>
+                      </a:extLst>
+                    </a:blip>
+                    <a:srcRect/>
+                    <a:stretch>
+                      <a:fillRect/>
+                    </a:stretch>
+                  </pic:blipFill>
+                  <pic:spPr bwMode="auto">
+                    <a:xfrm>
+                      <a:off x="0" y="0"/>
+                      <a:ext cx="2632054" cy="2873667"/>
+                    </a:xfrm>
+                    <a:prstGeom prst="rect">
+                      <a:avLst/>
+                    </a:prstGeom>
+                    <a:noFill/>
+                  </pic:spPr>
+                </pic:pic>
+              </a:graphicData>
+            </a:graphic>
+          </wp:inline>
+        </w:drawing>
+      </w:r>
+    </w:p>
+    <w:p>
+      <w:pPr>
+        <w:tabs>
+          <w:tab w:val="left" w:pos="3105"/>
+        </w:tabs>
+      </w:pPr>
+    </w:p>
+    <w:p>
+      <w:pPr>
+        <w:tabs>
+          <w:tab w:val="left" w:pos="3105"/>
+        </w:tabs>
+      </w:pPr>
+      <w:r>
+        <w:t>42- Para ajustar o espaço utilizamos o box-</w:t>
+      </w:r>
+      <w:proofErr w:type="spellStart"/>
+      <w:r>
+        <w:t>sizing</w:t>
+      </w:r>
+      <w:proofErr w:type="spellEnd"/>
+      <w:r>
+        <w:t xml:space="preserve"> onde automaticamente ajustou o espaço</w:t>
+      </w:r>
+    </w:p>
+    <w:p>
+      <w:pPr>
+        <w:tabs>
+          <w:tab w:val="left" w:pos="3105"/>
+        </w:tabs>
+      </w:pPr>
+      <w:r>
+        <w:rPr>
+          <w:noProof/>
+        </w:rPr>
+        <w:drawing>
+          <wp:inline distT="0" distB="0" distL="0" distR="0" wp14:anchorId="436EEE64">
+            <wp:extent cx="2190750" cy="1608946"/>
+            <wp:effectExtent l="0" t="0" r="0" b="0"/>
+            <wp:docPr id="71" name="Imagem 71"/>
+            <wp:cNvGraphicFramePr>
+              <a:graphicFrameLocks xmlns:a="http://schemas.openxmlformats.org/drawingml/2006/main" noChangeAspect="1"/>
+            </wp:cNvGraphicFramePr>
+            <a:graphic xmlns:a="http://schemas.openxmlformats.org/drawingml/2006/main">
+              <a:graphicData uri="http://schemas.openxmlformats.org/drawingml/2006/picture">
+                <pic:pic xmlns:pic="http://schemas.openxmlformats.org/drawingml/2006/picture">
+                  <pic:nvPicPr>
+                    <pic:cNvPr id="0" name="Picture 5"/>
+                    <pic:cNvPicPr>
+                      <a:picLocks noChangeAspect="1" noChangeArrowheads="1"/>
+                    </pic:cNvPicPr>
+                  </pic:nvPicPr>
+                  <pic:blipFill>
+                    <a:blip r:embed="rId79">
+                      <a:extLst>
+                        <a:ext uri="{28A0092B-C50C-407E-A947-70E740481C1C}">
+                          <a14:useLocalDpi xmlns:a14="http://schemas.microsoft.com/office/drawing/2010/main" val="0"/>
+                        </a:ext>
+                      </a:extLst>
+                    </a:blip>
+                    <a:srcRect/>
+                    <a:stretch>
+                      <a:fillRect/>
+                    </a:stretch>
+                  </pic:blipFill>
+                  <pic:spPr bwMode="auto">
+                    <a:xfrm>
+                      <a:off x="0" y="0"/>
+                      <a:ext cx="2194646" cy="1611807"/>
+                    </a:xfrm>
+                    <a:prstGeom prst="rect">
+                      <a:avLst/>
+                    </a:prstGeom>
+                    <a:noFill/>
+                  </pic:spPr>
+                </pic:pic>
+              </a:graphicData>
+            </a:graphic>
+          </wp:inline>
+        </w:drawing>
+      </w:r>
+      <w:r>
+        <w:rPr>
+          <w:noProof/>
+        </w:rPr>
+        <w:drawing>
+          <wp:inline distT="0" distB="0" distL="0" distR="0" wp14:anchorId="51C18B89">
+            <wp:extent cx="4162425" cy="1915748"/>
+            <wp:effectExtent l="0" t="0" r="0" b="8890"/>
+            <wp:docPr id="72" name="Imagem 72"/>
+            <wp:cNvGraphicFramePr>
+              <a:graphicFrameLocks xmlns:a="http://schemas.openxmlformats.org/drawingml/2006/main" noChangeAspect="1"/>
+            </wp:cNvGraphicFramePr>
+            <a:graphic xmlns:a="http://schemas.openxmlformats.org/drawingml/2006/main">
+              <a:graphicData uri="http://schemas.openxmlformats.org/drawingml/2006/picture">
+                <pic:pic xmlns:pic="http://schemas.openxmlformats.org/drawingml/2006/picture">
+                  <pic:nvPicPr>
+                    <pic:cNvPr id="0" name="Picture 6"/>
+                    <pic:cNvPicPr>
+                      <a:picLocks noChangeAspect="1" noChangeArrowheads="1"/>
+                    </pic:cNvPicPr>
+                  </pic:nvPicPr>
+                  <pic:blipFill>
+                    <a:blip r:embed="rId80" cstate="print">
+                      <a:extLst>
+                        <a:ext uri="{28A0092B-C50C-407E-A947-70E740481C1C}">
+                          <a14:useLocalDpi xmlns:a14="http://schemas.microsoft.com/office/drawing/2010/main" val="0"/>
+                        </a:ext>
+                      </a:extLst>
+                    </a:blip>
+                    <a:srcRect/>
+                    <a:stretch>
+                      <a:fillRect/>
+                    </a:stretch>
+                  </pic:blipFill>
+                  <pic:spPr bwMode="auto">
+                    <a:xfrm>
+                      <a:off x="0" y="0"/>
+                      <a:ext cx="4236023" cy="1949621"/>
+                    </a:xfrm>
+                    <a:prstGeom prst="rect">
+                      <a:avLst/>
+                    </a:prstGeom>
+                    <a:noFill/>
+                  </pic:spPr>
+                </pic:pic>
+              </a:graphicData>
+            </a:graphic>
+          </wp:inline>
+        </w:drawing>
+      </w:r>
+    </w:p>
+    <w:p>
+      <w:pPr>
+        <w:tabs>
+          <w:tab w:val="left" w:pos="3105"/>
+        </w:tabs>
+      </w:pPr>
+    </w:p>
+    <w:p>
+      <w:pPr>
+        <w:tabs>
+          <w:tab w:val="left" w:pos="3105"/>
+        </w:tabs>
+      </w:pPr>
+      <w:r>
+        <w:t xml:space="preserve">43- Para arrumar o espaço entre o texto e o preço colocamos um espaço externo na </w:t>
+      </w:r>
+      <w:proofErr w:type="spellStart"/>
+      <w:r>
+        <w:t>class</w:t>
+      </w:r>
+      <w:proofErr w:type="spellEnd"/>
+      <w:r>
+        <w:t xml:space="preserve"> </w:t>
+      </w:r>
+      <w:proofErr w:type="spellStart"/>
+      <w:r>
+        <w:t>preco</w:t>
+      </w:r>
+      <w:proofErr w:type="spellEnd"/>
+      <w:r>
+        <w:t xml:space="preserve"> conforme imagem.</w:t>
+      </w:r>
+    </w:p>
+    <w:p>
+      <w:pPr>
+        <w:tabs>
+          <w:tab w:val="left" w:pos="3105"/>
+        </w:tabs>
+      </w:pPr>
+      <w:r>
+        <w:rPr>
+          <w:noProof/>
+        </w:rPr>
+        <w:drawing>
+          <wp:inline distT="0" distB="0" distL="0" distR="0" wp14:anchorId="6E92DA96" wp14:editId="12D8B085">
+            <wp:extent cx="1437154" cy="771525"/>
+            <wp:effectExtent l="0" t="0" r="0" b="0"/>
+            <wp:docPr id="73" name="Imagem 73"/>
+            <wp:cNvGraphicFramePr>
+              <a:graphicFrameLocks xmlns:a="http://schemas.openxmlformats.org/drawingml/2006/main" noChangeAspect="1"/>
+            </wp:cNvGraphicFramePr>
+            <a:graphic xmlns:a="http://schemas.openxmlformats.org/drawingml/2006/main">
+              <a:graphicData uri="http://schemas.openxmlformats.org/drawingml/2006/picture">
+                <pic:pic xmlns:pic="http://schemas.openxmlformats.org/drawingml/2006/picture">
+                  <pic:nvPicPr>
+                    <pic:cNvPr id="0" name="Picture 7"/>
+                    <pic:cNvPicPr>
+                      <a:picLocks noChangeAspect="1" noChangeArrowheads="1"/>
+                    </pic:cNvPicPr>
+                  </pic:nvPicPr>
+                  <pic:blipFill>
+                    <a:blip r:embed="rId81">
+                      <a:extLst>
+                        <a:ext uri="{28A0092B-C50C-407E-A947-70E740481C1C}">
+                          <a14:useLocalDpi xmlns:a14="http://schemas.microsoft.com/office/drawing/2010/main" val="0"/>
+                        </a:ext>
+                      </a:extLst>
+                    </a:blip>
+                    <a:srcRect/>
+                    <a:stretch>
+                      <a:fillRect/>
+                    </a:stretch>
+                  </pic:blipFill>
+                  <pic:spPr bwMode="auto">
+                    <a:xfrm>
+                      <a:off x="0" y="0"/>
+                      <a:ext cx="1534525" cy="823798"/>
+                    </a:xfrm>
+                    <a:prstGeom prst="rect">
+                      <a:avLst/>
+                    </a:prstGeom>
+                    <a:noFill/>
+                  </pic:spPr>
+                </pic:pic>
+              </a:graphicData>
+            </a:graphic>
+          </wp:inline>
+        </w:drawing>
+      </w:r>
+    </w:p>
+    <w:p>
+      <w:pPr>
+        <w:tabs>
+          <w:tab w:val="left" w:pos="3105"/>
+        </w:tabs>
+      </w:pPr>
+      <w:r>
+        <w:t xml:space="preserve">44- Tiramos a cor de fundo do produto e adicionamos uma borda conforme o código </w:t>
+      </w:r>
+    </w:p>
+    <w:p>
+      <w:pPr>
+        <w:tabs>
+          <w:tab w:val="left" w:pos="3105"/>
+        </w:tabs>
+      </w:pPr>
+      <w:r>
+        <w:rPr>
+          <w:noProof/>
+        </w:rPr>
+        <w:drawing>
+          <wp:inline distT="0" distB="0" distL="0" distR="0" wp14:anchorId="732B72C6">
+            <wp:extent cx="1845169" cy="1400175"/>
+            <wp:effectExtent l="0" t="0" r="3175" b="0"/>
+            <wp:docPr id="74" name="Imagem 74"/>
+            <wp:cNvGraphicFramePr>
+              <a:graphicFrameLocks xmlns:a="http://schemas.openxmlformats.org/drawingml/2006/main" noChangeAspect="1"/>
+            </wp:cNvGraphicFramePr>
+            <a:graphic xmlns:a="http://schemas.openxmlformats.org/drawingml/2006/main">
+              <a:graphicData uri="http://schemas.openxmlformats.org/drawingml/2006/picture">
+                <pic:pic xmlns:pic="http://schemas.openxmlformats.org/drawingml/2006/picture">
+                  <pic:nvPicPr>
+                    <pic:cNvPr id="0" name="Picture 8"/>
+                    <pic:cNvPicPr>
+                      <a:picLocks noChangeAspect="1" noChangeArrowheads="1"/>
+                    </pic:cNvPicPr>
+                  </pic:nvPicPr>
+                  <pic:blipFill>
+                    <a:blip r:embed="rId82">
+                      <a:extLst>
+                        <a:ext uri="{28A0092B-C50C-407E-A947-70E740481C1C}">
+                          <a14:useLocalDpi xmlns:a14="http://schemas.microsoft.com/office/drawing/2010/main" val="0"/>
+                        </a:ext>
+                      </a:extLst>
+                    </a:blip>
+                    <a:srcRect/>
+                    <a:stretch>
+                      <a:fillRect/>
+                    </a:stretch>
+                  </pic:blipFill>
+                  <pic:spPr bwMode="auto">
+                    <a:xfrm>
+                      <a:off x="0" y="0"/>
+                      <a:ext cx="1854161" cy="1406999"/>
+                    </a:xfrm>
+                    <a:prstGeom prst="rect">
+                      <a:avLst/>
+                    </a:prstGeom>
+                    <a:noFill/>
+                  </pic:spPr>
+                </pic:pic>
+              </a:graphicData>
+            </a:graphic>
+          </wp:inline>
+        </w:drawing>
+      </w:r>
+      <w:r>
+        <w:rPr>
+          <w:noProof/>
+        </w:rPr>
+        <w:drawing>
+          <wp:inline distT="0" distB="0" distL="0" distR="0" wp14:anchorId="00850B40">
+            <wp:extent cx="2647676" cy="1323975"/>
+            <wp:effectExtent l="0" t="0" r="635" b="0"/>
+            <wp:docPr id="75" name="Imagem 75"/>
+            <wp:cNvGraphicFramePr>
+              <a:graphicFrameLocks xmlns:a="http://schemas.openxmlformats.org/drawingml/2006/main" noChangeAspect="1"/>
+            </wp:cNvGraphicFramePr>
+            <a:graphic xmlns:a="http://schemas.openxmlformats.org/drawingml/2006/main">
+              <a:graphicData uri="http://schemas.openxmlformats.org/drawingml/2006/picture">
+                <pic:pic xmlns:pic="http://schemas.openxmlformats.org/drawingml/2006/picture">
+                  <pic:nvPicPr>
+                    <pic:cNvPr id="0" name="Picture 9"/>
+                    <pic:cNvPicPr>
+                      <a:picLocks noChangeAspect="1" noChangeArrowheads="1"/>
+                    </pic:cNvPicPr>
+                  </pic:nvPicPr>
+                  <pic:blipFill>
+                    <a:blip r:embed="rId83">
+                      <a:extLst>
+                        <a:ext uri="{28A0092B-C50C-407E-A947-70E740481C1C}">
+                          <a14:useLocalDpi xmlns:a14="http://schemas.microsoft.com/office/drawing/2010/main" val="0"/>
+                        </a:ext>
+                      </a:extLst>
+                    </a:blip>
+                    <a:srcRect/>
+                    <a:stretch>
+                      <a:fillRect/>
+                    </a:stretch>
+                  </pic:blipFill>
+                  <pic:spPr bwMode="auto">
+                    <a:xfrm>
+                      <a:off x="0" y="0"/>
+                      <a:ext cx="2817172" cy="1408732"/>
+                    </a:xfrm>
+                    <a:prstGeom prst="rect">
+                      <a:avLst/>
+                    </a:prstGeom>
+                    <a:noFill/>
+                  </pic:spPr>
+                </pic:pic>
+              </a:graphicData>
+            </a:graphic>
+          </wp:inline>
+        </w:drawing>
+      </w:r>
+    </w:p>
+    <w:p>
+      <w:pPr>
+        <w:tabs>
+          <w:tab w:val="left" w:pos="3105"/>
+        </w:tabs>
+      </w:pPr>
+    </w:p>
+    <w:p>
+      <w:pPr>
+        <w:tabs>
+          <w:tab w:val="left" w:pos="3105"/>
+        </w:tabs>
+      </w:pPr>
+      <w:r>
+        <w:t xml:space="preserve">45- </w:t>
+      </w:r>
+      <w:r>
+        <w:t xml:space="preserve">Arredondamos os cantos da nossa borda utilizamos o </w:t>
+      </w:r>
+      <w:proofErr w:type="spellStart"/>
+      <w:r>
+        <w:t>border-radios</w:t>
+      </w:r>
+      <w:proofErr w:type="spellEnd"/>
+      <w:r>
+        <w:t>: 10px</w:t>
+      </w:r>
+    </w:p>
+    <w:p>
+      <w:pPr>
+        <w:tabs>
+          <w:tab w:val="left" w:pos="3105"/>
+        </w:tabs>
+      </w:pPr>
+      <w:r>
+        <w:rPr>
+          <w:noProof/>
+        </w:rPr>
+        <w:drawing>
+          <wp:inline distT="0" distB="0" distL="0" distR="0" wp14:anchorId="1CAA2D48">
+            <wp:extent cx="2715260" cy="2296160"/>
+            <wp:effectExtent l="0" t="0" r="8890" b="8890"/>
+            <wp:docPr id="76" name="Imagem 76"/>
+            <wp:cNvGraphicFramePr>
+              <a:graphicFrameLocks xmlns:a="http://schemas.openxmlformats.org/drawingml/2006/main" noChangeAspect="1"/>
+            </wp:cNvGraphicFramePr>
+            <a:graphic xmlns:a="http://schemas.openxmlformats.org/drawingml/2006/main">
+              <a:graphicData uri="http://schemas.openxmlformats.org/drawingml/2006/picture">
+                <pic:pic xmlns:pic="http://schemas.openxmlformats.org/drawingml/2006/picture">
+                  <pic:nvPicPr>
+                    <pic:cNvPr id="0" name="Picture 10"/>
+                    <pic:cNvPicPr>
+                      <a:picLocks noChangeAspect="1" noChangeArrowheads="1"/>
+                    </pic:cNvPicPr>
+                  </pic:nvPicPr>
+                  <pic:blipFill>
+                    <a:blip r:embed="rId84">
+                      <a:extLst>
+                        <a:ext uri="{28A0092B-C50C-407E-A947-70E740481C1C}">
+                          <a14:useLocalDpi xmlns:a14="http://schemas.microsoft.com/office/drawing/2010/main" val="0"/>
+                        </a:ext>
+                      </a:extLst>
+                    </a:blip>
+                    <a:srcRect/>
+                    <a:stretch>
+                      <a:fillRect/>
+                    </a:stretch>
+                  </pic:blipFill>
+                  <pic:spPr bwMode="auto">
+                    <a:xfrm>
+                      <a:off x="0" y="0"/>
+                      <a:ext cx="2715260" cy="2296160"/>
+                    </a:xfrm>
+                    <a:prstGeom prst="rect">
+                      <a:avLst/>
+                    </a:prstGeom>
+                    <a:noFill/>
+                  </pic:spPr>
+                </pic:pic>
+              </a:graphicData>
+            </a:graphic>
+          </wp:inline>
+        </w:drawing>
+      </w:r>
+    </w:p>
+    <w:p>
+      <w:pPr>
+        <w:tabs>
+          <w:tab w:val="left" w:pos="3105"/>
+        </w:tabs>
+      </w:pPr>
+    </w:p>
+    <w:p>
+      <w:pPr>
+        <w:tabs>
+          <w:tab w:val="left" w:pos="3105"/>
+        </w:tabs>
+      </w:pPr>
+      <w:r>
+        <w:t>46- Vamos trabalhar com o comportamento quando o usuário ao passar o mouse sobre o elemento ele realiza uma ação nessa situação vamos trabalhar com o menu ao passar o mouse o elemento muda de cor utilizando o houver.</w:t>
+      </w:r>
+    </w:p>
+    <w:p>
+      <w:pPr>
+        <w:tabs>
+          <w:tab w:val="left" w:pos="3105"/>
+        </w:tabs>
+      </w:pPr>
+      <w:r>
+        <w:rPr>
+          <w:noProof/>
+        </w:rPr>
+        <w:drawing>
+          <wp:inline distT="0" distB="0" distL="0" distR="0" wp14:anchorId="1DEA36B8">
+            <wp:extent cx="1685925" cy="581025"/>
+            <wp:effectExtent l="0" t="0" r="9525" b="9525"/>
+            <wp:docPr id="77" name="Imagem 77"/>
+            <wp:cNvGraphicFramePr>
+              <a:graphicFrameLocks xmlns:a="http://schemas.openxmlformats.org/drawingml/2006/main" noChangeAspect="1"/>
+            </wp:cNvGraphicFramePr>
+            <a:graphic xmlns:a="http://schemas.openxmlformats.org/drawingml/2006/main">
+              <a:graphicData uri="http://schemas.openxmlformats.org/drawingml/2006/picture">
+                <pic:pic xmlns:pic="http://schemas.openxmlformats.org/drawingml/2006/picture">
+                  <pic:nvPicPr>
+                    <pic:cNvPr id="0" name="Picture 11"/>
+                    <pic:cNvPicPr>
+                      <a:picLocks noChangeAspect="1" noChangeArrowheads="1"/>
+                    </pic:cNvPicPr>
+                  </pic:nvPicPr>
+                  <pic:blipFill>
+                    <a:blip r:embed="rId85">
+                      <a:extLst>
+                        <a:ext uri="{28A0092B-C50C-407E-A947-70E740481C1C}">
+                          <a14:useLocalDpi xmlns:a14="http://schemas.microsoft.com/office/drawing/2010/main" val="0"/>
+                        </a:ext>
+                      </a:extLst>
+                    </a:blip>
+                    <a:srcRect/>
+                    <a:stretch>
+                      <a:fillRect/>
+                    </a:stretch>
+                  </pic:blipFill>
+                  <pic:spPr bwMode="auto">
+                    <a:xfrm>
+                      <a:off x="0" y="0"/>
+                      <a:ext cx="1685925" cy="581025"/>
+                    </a:xfrm>
+                    <a:prstGeom prst="rect">
+                      <a:avLst/>
+                    </a:prstGeom>
+                    <a:noFill/>
+                  </pic:spPr>
+                </pic:pic>
+              </a:graphicData>
+            </a:graphic>
+          </wp:inline>
+        </w:drawing>
+      </w:r>
+      <w:r>
+        <w:rPr>
+          <w:noProof/>
+        </w:rPr>
+        <w:drawing>
+          <wp:inline distT="0" distB="0" distL="0" distR="0" wp14:anchorId="09423917">
+            <wp:extent cx="4116070" cy="1069064"/>
+            <wp:effectExtent l="0" t="0" r="0" b="0"/>
+            <wp:docPr id="78" name="Imagem 78"/>
+            <wp:cNvGraphicFramePr>
+              <a:graphicFrameLocks xmlns:a="http://schemas.openxmlformats.org/drawingml/2006/main" noChangeAspect="1"/>
+            </wp:cNvGraphicFramePr>
+            <a:graphic xmlns:a="http://schemas.openxmlformats.org/drawingml/2006/main">
+              <a:graphicData uri="http://schemas.openxmlformats.org/drawingml/2006/picture">
+                <pic:pic xmlns:pic="http://schemas.openxmlformats.org/drawingml/2006/picture">
+                  <pic:nvPicPr>
+                    <pic:cNvPr id="0" name="Picture 12"/>
+                    <pic:cNvPicPr>
+                      <a:picLocks noChangeAspect="1" noChangeArrowheads="1"/>
+                    </pic:cNvPicPr>
+                  </pic:nvPicPr>
+                  <pic:blipFill>
+                    <a:blip r:embed="rId86">
+                      <a:extLst>
+                        <a:ext uri="{28A0092B-C50C-407E-A947-70E740481C1C}">
+                          <a14:useLocalDpi xmlns:a14="http://schemas.microsoft.com/office/drawing/2010/main" val="0"/>
+                        </a:ext>
+                      </a:extLst>
+                    </a:blip>
+                    <a:srcRect/>
+                    <a:stretch>
+                      <a:fillRect/>
+                    </a:stretch>
+                  </pic:blipFill>
+                  <pic:spPr bwMode="auto">
+                    <a:xfrm>
+                      <a:off x="0" y="0"/>
+                      <a:ext cx="4171680" cy="1083508"/>
+                    </a:xfrm>
+                    <a:prstGeom prst="rect">
+                      <a:avLst/>
+                    </a:prstGeom>
+                    <a:noFill/>
+                  </pic:spPr>
+                </pic:pic>
+              </a:graphicData>
+            </a:graphic>
+          </wp:inline>
+        </w:drawing>
+      </w:r>
+    </w:p>
+    <w:p>
+      <w:pPr>
+        <w:tabs>
+          <w:tab w:val="left" w:pos="3105"/>
+        </w:tabs>
+      </w:pPr>
+    </w:p>
+    <w:p>
+      <w:pPr>
+        <w:tabs>
+          <w:tab w:val="left" w:pos="3105"/>
+        </w:tabs>
+      </w:pPr>
+      <w:r>
+        <w:t>47- Ainda trabalhando com houver ao passar o mouse adicionamos uma linha em cada item do menu</w:t>
+      </w:r>
+    </w:p>
+    <w:p>
+      <w:pPr>
+        <w:tabs>
+          <w:tab w:val="left" w:pos="3105"/>
+        </w:tabs>
+      </w:pPr>
+      <w:r>
+        <w:rPr>
+          <w:noProof/>
+        </w:rPr>
+        <w:drawing>
+          <wp:inline distT="0" distB="0" distL="0" distR="0" wp14:anchorId="01F88137">
+            <wp:extent cx="1600200" cy="496292"/>
+            <wp:effectExtent l="0" t="0" r="0" b="0"/>
+            <wp:docPr id="79" name="Imagem 79"/>
+            <wp:cNvGraphicFramePr>
+              <a:graphicFrameLocks xmlns:a="http://schemas.openxmlformats.org/drawingml/2006/main" noChangeAspect="1"/>
+            </wp:cNvGraphicFramePr>
+            <a:graphic xmlns:a="http://schemas.openxmlformats.org/drawingml/2006/main">
+              <a:graphicData uri="http://schemas.openxmlformats.org/drawingml/2006/picture">
+                <pic:pic xmlns:pic="http://schemas.openxmlformats.org/drawingml/2006/picture">
+                  <pic:nvPicPr>
+                    <pic:cNvPr id="0" name="Picture 13"/>
+                    <pic:cNvPicPr>
+                      <a:picLocks noChangeAspect="1" noChangeArrowheads="1"/>
+                    </pic:cNvPicPr>
+                  </pic:nvPicPr>
+                  <pic:blipFill>
+                    <a:blip r:embed="rId87">
+                      <a:extLst>
+                        <a:ext uri="{28A0092B-C50C-407E-A947-70E740481C1C}">
+                          <a14:useLocalDpi xmlns:a14="http://schemas.microsoft.com/office/drawing/2010/main" val="0"/>
+                        </a:ext>
+                      </a:extLst>
+                    </a:blip>
+                    <a:srcRect/>
+                    <a:stretch>
+                      <a:fillRect/>
+                    </a:stretch>
+                  </pic:blipFill>
+                  <pic:spPr bwMode="auto">
+                    <a:xfrm>
+                      <a:off x="0" y="0"/>
+                      <a:ext cx="1736270" cy="538493"/>
+                    </a:xfrm>
+                    <a:prstGeom prst="rect">
+                      <a:avLst/>
+                    </a:prstGeom>
+                    <a:noFill/>
+                  </pic:spPr>
+                </pic:pic>
+              </a:graphicData>
+            </a:graphic>
+          </wp:inline>
+        </w:drawing>
+      </w:r>
+    </w:p>
+    <w:p>
+      <w:pPr>
+        <w:tabs>
+          <w:tab w:val="left" w:pos="3105"/>
+        </w:tabs>
+      </w:pPr>
+      <w:r>
+        <w:t xml:space="preserve">48- Mudamos a cor da borda ao passar o mouse </w:t>
+      </w:r>
+    </w:p>
+    <w:p>
+      <w:pPr>
+        <w:tabs>
+          <w:tab w:val="left" w:pos="3105"/>
+        </w:tabs>
+      </w:pPr>
+      <w:bookmarkStart w:id="0" w:name="_GoBack"/>
+      <w:bookmarkEnd w:id="0"/>
+      <w:r>
+        <w:rPr>
+          <w:noProof/>
+        </w:rPr>
+        <w:drawing>
+          <wp:inline distT="0" distB="0" distL="0" distR="0" wp14:anchorId="75427C59">
+            <wp:extent cx="2362835" cy="581025"/>
+            <wp:effectExtent l="0" t="0" r="0" b="9525"/>
+            <wp:docPr id="80" name="Imagem 80"/>
+            <wp:cNvGraphicFramePr>
+              <a:graphicFrameLocks xmlns:a="http://schemas.openxmlformats.org/drawingml/2006/main" noChangeAspect="1"/>
+            </wp:cNvGraphicFramePr>
+            <a:graphic xmlns:a="http://schemas.openxmlformats.org/drawingml/2006/main">
+              <a:graphicData uri="http://schemas.openxmlformats.org/drawingml/2006/picture">
+                <pic:pic xmlns:pic="http://schemas.openxmlformats.org/drawingml/2006/picture">
+                  <pic:nvPicPr>
+                    <pic:cNvPr id="0" name="Picture 14"/>
+                    <pic:cNvPicPr>
+                      <a:picLocks noChangeAspect="1" noChangeArrowheads="1"/>
+                    </pic:cNvPicPr>
+                  </pic:nvPicPr>
+                  <pic:blipFill>
+                    <a:blip r:embed="rId88">
+                      <a:extLst>
+                        <a:ext uri="{28A0092B-C50C-407E-A947-70E740481C1C}">
+                          <a14:useLocalDpi xmlns:a14="http://schemas.microsoft.com/office/drawing/2010/main" val="0"/>
+                        </a:ext>
+                      </a:extLst>
+                    </a:blip>
+                    <a:srcRect/>
+                    <a:stretch>
+                      <a:fillRect/>
+                    </a:stretch>
+                  </pic:blipFill>
+                  <pic:spPr bwMode="auto">
+                    <a:xfrm>
+                      <a:off x="0" y="0"/>
+                      <a:ext cx="2362835" cy="581025"/>
+                    </a:xfrm>
+                    <a:prstGeom prst="rect">
+                      <a:avLst/>
+                    </a:prstGeom>
+                    <a:noFill/>
+                  </pic:spPr>
+                </pic:pic>
+              </a:graphicData>
+            </a:graphic>
+          </wp:inline>
+        </w:drawing>
       </w:r>
     </w:p>
     <w:sectPr>
@@ -6537,7 +7486,7 @@
 </file>
 
 <file path=customXml/itemProps1.xml><?xml version="1.0" encoding="utf-8"?>
-<ds:datastoreItem xmlns:ds="http://schemas.openxmlformats.org/officeDocument/2006/customXml" ds:itemID="{2425DE80-170C-4C93-A7AE-2ACD27163615}">
+<ds:datastoreItem xmlns:ds="http://schemas.openxmlformats.org/officeDocument/2006/customXml" ds:itemID="{FA83BB4C-E3C8-4EB7-9E89-7CC60A5CAB41}">
   <ds:schemaRefs>
     <ds:schemaRef ds:uri="http://schemas.openxmlformats.org/officeDocument/2006/bibliography"/>
   </ds:schemaRefs>

</xml_diff>

<commit_message>
atualização da aula do dia 10/09/2026
</commit_message>
<xml_diff>
--- a/apostila/Projeto Space For Men.docx
+++ b/apostila/Projeto Space For Men.docx
@@ -5304,6 +5304,9 @@
         </w:tabs>
       </w:pPr>
       <w:r>
+        <w:rPr>
+          <w:noProof/>
+        </w:rPr>
         <w:drawing>
           <wp:inline distT="0" distB="0" distL="0" distR="0" wp14:anchorId="1159EAD4" wp14:editId="2BD6A0EC">
             <wp:extent cx="1676634" cy="1181265"/>
@@ -6170,8 +6173,6 @@
           <w:tab w:val="left" w:pos="3105"/>
         </w:tabs>
       </w:pPr>
-      <w:bookmarkStart w:id="0" w:name="_GoBack"/>
-      <w:bookmarkEnd w:id="0"/>
       <w:r>
         <w:rPr>
           <w:noProof/>
@@ -6222,6 +6223,441 @@
           </wp:inline>
         </w:drawing>
       </w:r>
+    </w:p>
+    <w:p>
+      <w:pPr>
+        <w:tabs>
+          <w:tab w:val="left" w:pos="3105"/>
+        </w:tabs>
+      </w:pPr>
+    </w:p>
+    <w:p>
+      <w:pPr>
+        <w:tabs>
+          <w:tab w:val="left" w:pos="3105"/>
+        </w:tabs>
+      </w:pPr>
+      <w:r>
+        <w:t xml:space="preserve">49- Mudamos a cor da borda ao clicar sobre ela utilizando o </w:t>
+      </w:r>
+      <w:proofErr w:type="spellStart"/>
+      <w:r>
+        <w:t>active</w:t>
+      </w:r>
+      <w:proofErr w:type="spellEnd"/>
+    </w:p>
+    <w:p>
+      <w:pPr>
+        <w:tabs>
+          <w:tab w:val="left" w:pos="3105"/>
+        </w:tabs>
+      </w:pPr>
+      <w:r>
+        <w:rPr>
+          <w:noProof/>
+        </w:rPr>
+        <w:drawing>
+          <wp:inline distT="0" distB="0" distL="0" distR="0" wp14:anchorId="0851B0EB" wp14:editId="3D5F1FC8">
+            <wp:extent cx="2210108" cy="628738"/>
+            <wp:effectExtent l="0" t="0" r="0" b="0"/>
+            <wp:docPr id="81" name="Imagem 81"/>
+            <wp:cNvGraphicFramePr>
+              <a:graphicFrameLocks xmlns:a="http://schemas.openxmlformats.org/drawingml/2006/main" noChangeAspect="1"/>
+            </wp:cNvGraphicFramePr>
+            <a:graphic xmlns:a="http://schemas.openxmlformats.org/drawingml/2006/main">
+              <a:graphicData uri="http://schemas.openxmlformats.org/drawingml/2006/picture">
+                <pic:pic xmlns:pic="http://schemas.openxmlformats.org/drawingml/2006/picture">
+                  <pic:nvPicPr>
+                    <pic:cNvPr id="1" name=""/>
+                    <pic:cNvPicPr/>
+                  </pic:nvPicPr>
+                  <pic:blipFill>
+                    <a:blip r:embed="rId89"/>
+                    <a:stretch>
+                      <a:fillRect/>
+                    </a:stretch>
+                  </pic:blipFill>
+                  <pic:spPr>
+                    <a:xfrm>
+                      <a:off x="0" y="0"/>
+                      <a:ext cx="2210108" cy="628738"/>
+                    </a:xfrm>
+                    <a:prstGeom prst="rect">
+                      <a:avLst/>
+                    </a:prstGeom>
+                  </pic:spPr>
+                </pic:pic>
+              </a:graphicData>
+            </a:graphic>
+          </wp:inline>
+        </w:drawing>
+      </w:r>
+      <w:r>
+        <w:rPr>
+          <w:noProof/>
+        </w:rPr>
+        <w:drawing>
+          <wp:inline distT="0" distB="0" distL="0" distR="0" wp14:anchorId="6E20A41B">
+            <wp:extent cx="4329864" cy="2095500"/>
+            <wp:effectExtent l="0" t="0" r="0" b="0"/>
+            <wp:docPr id="82" name="Imagem 82"/>
+            <wp:cNvGraphicFramePr>
+              <a:graphicFrameLocks xmlns:a="http://schemas.openxmlformats.org/drawingml/2006/main" noChangeAspect="1"/>
+            </wp:cNvGraphicFramePr>
+            <a:graphic xmlns:a="http://schemas.openxmlformats.org/drawingml/2006/main">
+              <a:graphicData uri="http://schemas.openxmlformats.org/drawingml/2006/picture">
+                <pic:pic xmlns:pic="http://schemas.openxmlformats.org/drawingml/2006/picture">
+                  <pic:nvPicPr>
+                    <pic:cNvPr id="0" name="Picture 2"/>
+                    <pic:cNvPicPr>
+                      <a:picLocks noChangeAspect="1" noChangeArrowheads="1"/>
+                    </pic:cNvPicPr>
+                  </pic:nvPicPr>
+                  <pic:blipFill>
+                    <a:blip r:embed="rId90">
+                      <a:extLst>
+                        <a:ext uri="{28A0092B-C50C-407E-A947-70E740481C1C}">
+                          <a14:useLocalDpi xmlns:a14="http://schemas.microsoft.com/office/drawing/2010/main" val="0"/>
+                        </a:ext>
+                      </a:extLst>
+                    </a:blip>
+                    <a:srcRect/>
+                    <a:stretch>
+                      <a:fillRect/>
+                    </a:stretch>
+                  </pic:blipFill>
+                  <pic:spPr bwMode="auto">
+                    <a:xfrm>
+                      <a:off x="0" y="0"/>
+                      <a:ext cx="4366520" cy="2113240"/>
+                    </a:xfrm>
+                    <a:prstGeom prst="rect">
+                      <a:avLst/>
+                    </a:prstGeom>
+                    <a:noFill/>
+                  </pic:spPr>
+                </pic:pic>
+              </a:graphicData>
+            </a:graphic>
+          </wp:inline>
+        </w:drawing>
+      </w:r>
+    </w:p>
+    <w:p>
+      <w:pPr>
+        <w:tabs>
+          <w:tab w:val="left" w:pos="3105"/>
+        </w:tabs>
+      </w:pPr>
+      <w:r>
+        <w:t xml:space="preserve">50- </w:t>
+      </w:r>
+      <w:r>
+        <w:t xml:space="preserve">Agora vamos deixar a nossa pagina mais interativa colocando um hover no </w:t>
+      </w:r>
+      <w:r>
+        <w:t>título</w:t>
+      </w:r>
+      <w:r>
+        <w:t xml:space="preserve">, </w:t>
+      </w:r>
+      <w:r>
+        <w:t>ou seja,</w:t>
+      </w:r>
+      <w:r>
+        <w:t xml:space="preserve"> vamos passar o mouse ele vai aumentar </w:t>
+      </w:r>
+      <w:r>
+        <w:t>o tamanho passando uma impressão que a imagem está se movendo.</w:t>
+      </w:r>
+    </w:p>
+    <w:p>
+      <w:pPr>
+        <w:tabs>
+          <w:tab w:val="left" w:pos="3105"/>
+        </w:tabs>
+      </w:pPr>
+      <w:r>
+        <w:rPr>
+          <w:noProof/>
+        </w:rPr>
+        <w:drawing>
+          <wp:inline distT="0" distB="0" distL="0" distR="0" wp14:anchorId="77612E46">
+            <wp:extent cx="1819275" cy="466725"/>
+            <wp:effectExtent l="0" t="0" r="9525" b="9525"/>
+            <wp:docPr id="83" name="Imagem 83"/>
+            <wp:cNvGraphicFramePr>
+              <a:graphicFrameLocks xmlns:a="http://schemas.openxmlformats.org/drawingml/2006/main" noChangeAspect="1"/>
+            </wp:cNvGraphicFramePr>
+            <a:graphic xmlns:a="http://schemas.openxmlformats.org/drawingml/2006/main">
+              <a:graphicData uri="http://schemas.openxmlformats.org/drawingml/2006/picture">
+                <pic:pic xmlns:pic="http://schemas.openxmlformats.org/drawingml/2006/picture">
+                  <pic:nvPicPr>
+                    <pic:cNvPr id="0" name="Picture 3"/>
+                    <pic:cNvPicPr>
+                      <a:picLocks noChangeAspect="1" noChangeArrowheads="1"/>
+                    </pic:cNvPicPr>
+                  </pic:nvPicPr>
+                  <pic:blipFill>
+                    <a:blip r:embed="rId91">
+                      <a:extLst>
+                        <a:ext uri="{28A0092B-C50C-407E-A947-70E740481C1C}">
+                          <a14:useLocalDpi xmlns:a14="http://schemas.microsoft.com/office/drawing/2010/main" val="0"/>
+                        </a:ext>
+                      </a:extLst>
+                    </a:blip>
+                    <a:srcRect/>
+                    <a:stretch>
+                      <a:fillRect/>
+                    </a:stretch>
+                  </pic:blipFill>
+                  <pic:spPr bwMode="auto">
+                    <a:xfrm>
+                      <a:off x="0" y="0"/>
+                      <a:ext cx="1819275" cy="466725"/>
+                    </a:xfrm>
+                    <a:prstGeom prst="rect">
+                      <a:avLst/>
+                    </a:prstGeom>
+                    <a:noFill/>
+                  </pic:spPr>
+                </pic:pic>
+              </a:graphicData>
+            </a:graphic>
+          </wp:inline>
+        </w:drawing>
+      </w:r>
+    </w:p>
+    <w:p>
+      <w:pPr>
+        <w:tabs>
+          <w:tab w:val="left" w:pos="3105"/>
+        </w:tabs>
+      </w:pPr>
+    </w:p>
+    <w:p>
+      <w:pPr>
+        <w:tabs>
+          <w:tab w:val="left" w:pos="3105"/>
+        </w:tabs>
+      </w:pPr>
+    </w:p>
+    <w:p>
+      <w:pPr>
+        <w:tabs>
+          <w:tab w:val="left" w:pos="3105"/>
+        </w:tabs>
+      </w:pPr>
+      <w:r>
+        <w:t xml:space="preserve">51- Adicionamos uma imagem ao </w:t>
+      </w:r>
+      <w:proofErr w:type="spellStart"/>
+      <w:r>
+        <w:t>footer</w:t>
+      </w:r>
+      <w:proofErr w:type="spellEnd"/>
+      <w:r>
+        <w:t xml:space="preserve"> conforme </w:t>
+      </w:r>
+      <w:r>
+        <w:t xml:space="preserve">código </w:t>
+      </w:r>
+    </w:p>
+    <w:p>
+      <w:pPr>
+        <w:tabs>
+          <w:tab w:val="left" w:pos="3105"/>
+        </w:tabs>
+      </w:pPr>
+      <w:r>
+        <w:rPr>
+          <w:noProof/>
+        </w:rPr>
+        <w:drawing>
+          <wp:inline distT="0" distB="0" distL="0" distR="0" wp14:anchorId="55D650B5">
+            <wp:extent cx="3858260" cy="304800"/>
+            <wp:effectExtent l="0" t="0" r="8890" b="0"/>
+            <wp:docPr id="84" name="Imagem 84"/>
+            <wp:cNvGraphicFramePr>
+              <a:graphicFrameLocks xmlns:a="http://schemas.openxmlformats.org/drawingml/2006/main" noChangeAspect="1"/>
+            </wp:cNvGraphicFramePr>
+            <a:graphic xmlns:a="http://schemas.openxmlformats.org/drawingml/2006/main">
+              <a:graphicData uri="http://schemas.openxmlformats.org/drawingml/2006/picture">
+                <pic:pic xmlns:pic="http://schemas.openxmlformats.org/drawingml/2006/picture">
+                  <pic:nvPicPr>
+                    <pic:cNvPr id="0" name="Picture 4"/>
+                    <pic:cNvPicPr>
+                      <a:picLocks noChangeAspect="1" noChangeArrowheads="1"/>
+                    </pic:cNvPicPr>
+                  </pic:nvPicPr>
+                  <pic:blipFill>
+                    <a:blip r:embed="rId92">
+                      <a:extLst>
+                        <a:ext uri="{28A0092B-C50C-407E-A947-70E740481C1C}">
+                          <a14:useLocalDpi xmlns:a14="http://schemas.microsoft.com/office/drawing/2010/main" val="0"/>
+                        </a:ext>
+                      </a:extLst>
+                    </a:blip>
+                    <a:srcRect/>
+                    <a:stretch>
+                      <a:fillRect/>
+                    </a:stretch>
+                  </pic:blipFill>
+                  <pic:spPr bwMode="auto">
+                    <a:xfrm>
+                      <a:off x="0" y="0"/>
+                      <a:ext cx="3858260" cy="304800"/>
+                    </a:xfrm>
+                    <a:prstGeom prst="rect">
+                      <a:avLst/>
+                    </a:prstGeom>
+                    <a:noFill/>
+                  </pic:spPr>
+                </pic:pic>
+              </a:graphicData>
+            </a:graphic>
+          </wp:inline>
+        </w:drawing>
+      </w:r>
+    </w:p>
+    <w:p>
+      <w:pPr>
+        <w:tabs>
+          <w:tab w:val="left" w:pos="3105"/>
+        </w:tabs>
+      </w:pPr>
+    </w:p>
+    <w:p>
+      <w:pPr>
+        <w:tabs>
+          <w:tab w:val="left" w:pos="3105"/>
+        </w:tabs>
+      </w:pPr>
+      <w:r>
+        <w:t xml:space="preserve">52- Como a imagem do </w:t>
+      </w:r>
+      <w:proofErr w:type="spellStart"/>
+      <w:r>
+        <w:t>footer</w:t>
+      </w:r>
+      <w:proofErr w:type="spellEnd"/>
+      <w:r>
+        <w:t xml:space="preserve"> é branca precisamos adicionar uma cor de fundo </w:t>
+      </w:r>
+    </w:p>
+    <w:p>
+      <w:pPr>
+        <w:tabs>
+          <w:tab w:val="left" w:pos="3105"/>
+        </w:tabs>
+      </w:pPr>
+      <w:r>
+        <w:rPr>
+          <w:noProof/>
+        </w:rPr>
+        <w:drawing>
+          <wp:inline distT="0" distB="0" distL="0" distR="0" wp14:anchorId="0BB7F124">
+            <wp:extent cx="2534285" cy="657225"/>
+            <wp:effectExtent l="0" t="0" r="0" b="9525"/>
+            <wp:docPr id="85" name="Imagem 85"/>
+            <wp:cNvGraphicFramePr>
+              <a:graphicFrameLocks xmlns:a="http://schemas.openxmlformats.org/drawingml/2006/main" noChangeAspect="1"/>
+            </wp:cNvGraphicFramePr>
+            <a:graphic xmlns:a="http://schemas.openxmlformats.org/drawingml/2006/main">
+              <a:graphicData uri="http://schemas.openxmlformats.org/drawingml/2006/picture">
+                <pic:pic xmlns:pic="http://schemas.openxmlformats.org/drawingml/2006/picture">
+                  <pic:nvPicPr>
+                    <pic:cNvPr id="0" name="Picture 5"/>
+                    <pic:cNvPicPr>
+                      <a:picLocks noChangeAspect="1" noChangeArrowheads="1"/>
+                    </pic:cNvPicPr>
+                  </pic:nvPicPr>
+                  <pic:blipFill>
+                    <a:blip r:embed="rId93">
+                      <a:extLst>
+                        <a:ext uri="{28A0092B-C50C-407E-A947-70E740481C1C}">
+                          <a14:useLocalDpi xmlns:a14="http://schemas.microsoft.com/office/drawing/2010/main" val="0"/>
+                        </a:ext>
+                      </a:extLst>
+                    </a:blip>
+                    <a:srcRect/>
+                    <a:stretch>
+                      <a:fillRect/>
+                    </a:stretch>
+                  </pic:blipFill>
+                  <pic:spPr bwMode="auto">
+                    <a:xfrm>
+                      <a:off x="0" y="0"/>
+                      <a:ext cx="2534285" cy="657225"/>
+                    </a:xfrm>
+                    <a:prstGeom prst="rect">
+                      <a:avLst/>
+                    </a:prstGeom>
+                    <a:noFill/>
+                  </pic:spPr>
+                </pic:pic>
+              </a:graphicData>
+            </a:graphic>
+          </wp:inline>
+        </w:drawing>
+      </w:r>
+    </w:p>
+    <w:p>
+      <w:pPr>
+        <w:tabs>
+          <w:tab w:val="left" w:pos="3105"/>
+        </w:tabs>
+      </w:pPr>
+    </w:p>
+    <w:p>
+      <w:pPr>
+        <w:tabs>
+          <w:tab w:val="left" w:pos="3105"/>
+        </w:tabs>
+      </w:pPr>
+      <w:r>
+        <w:t xml:space="preserve">53- Inserimos um </w:t>
+      </w:r>
+      <w:r>
+        <w:t>parágrafo</w:t>
+      </w:r>
+      <w:r>
+        <w:t xml:space="preserve"> no </w:t>
+      </w:r>
+      <w:proofErr w:type="spellStart"/>
+      <w:r>
+        <w:t>footer</w:t>
+      </w:r>
+      <w:proofErr w:type="spellEnd"/>
+      <w:r>
+        <w:t xml:space="preserve"> e centralizamos os conteúdos dentro dele</w:t>
+      </w:r>
+      <w:r>
+        <w:t xml:space="preserve">             </w:t>
+      </w:r>
+      <w:bookmarkStart w:id="0" w:name="_GoBack"/>
+      <w:bookmarkEnd w:id="0"/>
+    </w:p>
+    <w:p>
+      <w:pPr>
+        <w:tabs>
+          <w:tab w:val="left" w:pos="3105"/>
+        </w:tabs>
+      </w:pPr>
+    </w:p>
+    <w:p>
+      <w:pPr>
+        <w:tabs>
+          <w:tab w:val="left" w:pos="3105"/>
+        </w:tabs>
+      </w:pPr>
+    </w:p>
+    <w:p>
+      <w:pPr>
+        <w:tabs>
+          <w:tab w:val="left" w:pos="3105"/>
+        </w:tabs>
+      </w:pPr>
     </w:p>
     <w:sectPr>
       <w:pgSz w:w="11906" w:h="16838"/>
@@ -7486,7 +7922,7 @@
 </file>
 
 <file path=customXml/itemProps1.xml><?xml version="1.0" encoding="utf-8"?>
-<ds:datastoreItem xmlns:ds="http://schemas.openxmlformats.org/officeDocument/2006/customXml" ds:itemID="{FA83BB4C-E3C8-4EB7-9E89-7CC60A5CAB41}">
+<ds:datastoreItem xmlns:ds="http://schemas.openxmlformats.org/officeDocument/2006/customXml" ds:itemID="{E08F937B-C8F8-4B2E-A0C9-C5BE97E8A75F}">
   <ds:schemaRefs>
     <ds:schemaRef ds:uri="http://schemas.openxmlformats.org/officeDocument/2006/bibliography"/>
   </ds:schemaRefs>

</xml_diff>

<commit_message>
atualização da aula 10/09/2026
</commit_message>
<xml_diff>
--- a/apostila/Projeto Space For Men.docx
+++ b/apostila/Projeto Space For Men.docx
@@ -6633,10 +6633,423 @@
         <w:t xml:space="preserve"> e centralizamos os conteúdos dentro dele</w:t>
       </w:r>
       <w:r>
-        <w:t xml:space="preserve">             </w:t>
+        <w:t xml:space="preserve">         </w:t>
+      </w:r>
+    </w:p>
+    <w:p>
+      <w:pPr>
+        <w:tabs>
+          <w:tab w:val="left" w:pos="3105"/>
+        </w:tabs>
+      </w:pPr>
+      <w:r>
+        <w:t xml:space="preserve">    </w:t>
+      </w:r>
+      <w:r>
+        <w:drawing>
+          <wp:inline distT="0" distB="0" distL="0" distR="0" wp14:anchorId="77F61D54" wp14:editId="358295AB">
+            <wp:extent cx="3343275" cy="863547"/>
+            <wp:effectExtent l="0" t="0" r="0" b="0"/>
+            <wp:docPr id="86" name="Imagem 86"/>
+            <wp:cNvGraphicFramePr>
+              <a:graphicFrameLocks xmlns:a="http://schemas.openxmlformats.org/drawingml/2006/main" noChangeAspect="1"/>
+            </wp:cNvGraphicFramePr>
+            <a:graphic xmlns:a="http://schemas.openxmlformats.org/drawingml/2006/main">
+              <a:graphicData uri="http://schemas.openxmlformats.org/drawingml/2006/picture">
+                <pic:pic xmlns:pic="http://schemas.openxmlformats.org/drawingml/2006/picture">
+                  <pic:nvPicPr>
+                    <pic:cNvPr id="1" name=""/>
+                    <pic:cNvPicPr/>
+                  </pic:nvPicPr>
+                  <pic:blipFill>
+                    <a:blip r:embed="rId94"/>
+                    <a:stretch>
+                      <a:fillRect/>
+                    </a:stretch>
+                  </pic:blipFill>
+                  <pic:spPr>
+                    <a:xfrm>
+                      <a:off x="0" y="0"/>
+                      <a:ext cx="3411011" cy="881043"/>
+                    </a:xfrm>
+                    <a:prstGeom prst="rect">
+                      <a:avLst/>
+                    </a:prstGeom>
+                  </pic:spPr>
+                </pic:pic>
+              </a:graphicData>
+            </a:graphic>
+          </wp:inline>
+        </w:drawing>
+      </w:r>
+    </w:p>
+    <w:p>
+      <w:pPr>
+        <w:tabs>
+          <w:tab w:val="left" w:pos="3105"/>
+        </w:tabs>
+      </w:pPr>
+    </w:p>
+    <w:p>
+      <w:pPr>
+        <w:tabs>
+          <w:tab w:val="left" w:pos="3105"/>
+        </w:tabs>
+      </w:pPr>
+      <w:r>
+        <w:t xml:space="preserve">54- Colocamos uma imagem de fundo no site ao contrario do </w:t>
+      </w:r>
+      <w:proofErr w:type="spellStart"/>
+      <w:r>
+        <w:t>html</w:t>
+      </w:r>
+      <w:proofErr w:type="spellEnd"/>
+      <w:r>
+        <w:t xml:space="preserve"> colocamos uma imagem de fundo pelo CSS e quando realizamos tal função a natureza da imagem e ficar se repetindo no site.</w:t>
+      </w:r>
+    </w:p>
+    <w:p>
+      <w:pPr>
+        <w:tabs>
+          <w:tab w:val="left" w:pos="3105"/>
+        </w:tabs>
+      </w:pPr>
+      <w:r>
+        <w:t>Se não quisemos que isso aconteça precisamos adicionar o comando.</w:t>
+      </w:r>
+    </w:p>
+    <w:p>
+      <w:pPr>
+        <w:tabs>
+          <w:tab w:val="left" w:pos="3105"/>
+        </w:tabs>
+      </w:pPr>
+    </w:p>
+    <w:p>
+      <w:pPr>
+        <w:tabs>
+          <w:tab w:val="left" w:pos="3105"/>
+        </w:tabs>
+      </w:pPr>
+      <w:r>
+        <w:t xml:space="preserve"> </w:t>
+      </w:r>
+      <w:r>
+        <w:rPr>
+          <w:noProof/>
+        </w:rPr>
+        <w:drawing>
+          <wp:inline distT="0" distB="0" distL="0" distR="0" wp14:anchorId="5D831B6A">
+            <wp:extent cx="3067685" cy="1095375"/>
+            <wp:effectExtent l="0" t="0" r="0" b="9525"/>
+            <wp:docPr id="87" name="Imagem 87"/>
+            <wp:cNvGraphicFramePr>
+              <a:graphicFrameLocks xmlns:a="http://schemas.openxmlformats.org/drawingml/2006/main" noChangeAspect="1"/>
+            </wp:cNvGraphicFramePr>
+            <a:graphic xmlns:a="http://schemas.openxmlformats.org/drawingml/2006/main">
+              <a:graphicData uri="http://schemas.openxmlformats.org/drawingml/2006/picture">
+                <pic:pic xmlns:pic="http://schemas.openxmlformats.org/drawingml/2006/picture">
+                  <pic:nvPicPr>
+                    <pic:cNvPr id="0" name="Picture 2"/>
+                    <pic:cNvPicPr>
+                      <a:picLocks noChangeAspect="1" noChangeArrowheads="1"/>
+                    </pic:cNvPicPr>
+                  </pic:nvPicPr>
+                  <pic:blipFill>
+                    <a:blip r:embed="rId95">
+                      <a:extLst>
+                        <a:ext uri="{28A0092B-C50C-407E-A947-70E740481C1C}">
+                          <a14:useLocalDpi xmlns:a14="http://schemas.microsoft.com/office/drawing/2010/main" val="0"/>
+                        </a:ext>
+                      </a:extLst>
+                    </a:blip>
+                    <a:srcRect/>
+                    <a:stretch>
+                      <a:fillRect/>
+                    </a:stretch>
+                  </pic:blipFill>
+                  <pic:spPr bwMode="auto">
+                    <a:xfrm>
+                      <a:off x="0" y="0"/>
+                      <a:ext cx="3067685" cy="1095375"/>
+                    </a:xfrm>
+                    <a:prstGeom prst="rect">
+                      <a:avLst/>
+                    </a:prstGeom>
+                    <a:noFill/>
+                  </pic:spPr>
+                </pic:pic>
+              </a:graphicData>
+            </a:graphic>
+          </wp:inline>
+        </w:drawing>
+      </w:r>
+    </w:p>
+    <w:p>
+      <w:pPr>
+        <w:tabs>
+          <w:tab w:val="left" w:pos="3105"/>
+        </w:tabs>
+      </w:pPr>
+    </w:p>
+    <w:p>
+      <w:pPr>
+        <w:tabs>
+          <w:tab w:val="left" w:pos="3105"/>
+        </w:tabs>
+      </w:pPr>
+      <w:r>
+        <w:t xml:space="preserve">55- </w:t>
+      </w:r>
+      <w:r>
+        <w:t xml:space="preserve">No </w:t>
+      </w:r>
+      <w:proofErr w:type="spellStart"/>
+      <w:r>
+        <w:t>footer</w:t>
+      </w:r>
+      <w:proofErr w:type="spellEnd"/>
+      <w:r>
+        <w:t xml:space="preserve"> colocamos uma imagem de fundo preta se fez necessário mudar a cor da letra do paragrafo (White) </w:t>
+      </w:r>
+    </w:p>
+    <w:p>
+      <w:pPr>
+        <w:tabs>
+          <w:tab w:val="left" w:pos="3105"/>
+        </w:tabs>
+      </w:pPr>
+      <w:r>
+        <w:t>Aumentamos o espaço interno tanto para cima como para baixo e diminuímos o tamanho da fonte</w:t>
+      </w:r>
+    </w:p>
+    <w:p>
+      <w:pPr>
+        <w:tabs>
+          <w:tab w:val="left" w:pos="3105"/>
+        </w:tabs>
+      </w:pPr>
+      <w:r>
+        <w:rPr>
+          <w:noProof/>
+        </w:rPr>
+        <w:drawing>
+          <wp:inline distT="0" distB="0" distL="0" distR="0" wp14:anchorId="566021DA">
+            <wp:extent cx="3267710" cy="1543050"/>
+            <wp:effectExtent l="0" t="0" r="8890" b="0"/>
+            <wp:docPr id="88" name="Imagem 88"/>
+            <wp:cNvGraphicFramePr>
+              <a:graphicFrameLocks xmlns:a="http://schemas.openxmlformats.org/drawingml/2006/main" noChangeAspect="1"/>
+            </wp:cNvGraphicFramePr>
+            <a:graphic xmlns:a="http://schemas.openxmlformats.org/drawingml/2006/main">
+              <a:graphicData uri="http://schemas.openxmlformats.org/drawingml/2006/picture">
+                <pic:pic xmlns:pic="http://schemas.openxmlformats.org/drawingml/2006/picture">
+                  <pic:nvPicPr>
+                    <pic:cNvPr id="0" name="Picture 3"/>
+                    <pic:cNvPicPr>
+                      <a:picLocks noChangeAspect="1" noChangeArrowheads="1"/>
+                    </pic:cNvPicPr>
+                  </pic:nvPicPr>
+                  <pic:blipFill>
+                    <a:blip r:embed="rId96">
+                      <a:extLst>
+                        <a:ext uri="{28A0092B-C50C-407E-A947-70E740481C1C}">
+                          <a14:useLocalDpi xmlns:a14="http://schemas.microsoft.com/office/drawing/2010/main" val="0"/>
+                        </a:ext>
+                      </a:extLst>
+                    </a:blip>
+                    <a:srcRect/>
+                    <a:stretch>
+                      <a:fillRect/>
+                    </a:stretch>
+                  </pic:blipFill>
+                  <pic:spPr bwMode="auto">
+                    <a:xfrm>
+                      <a:off x="0" y="0"/>
+                      <a:ext cx="3267710" cy="1543050"/>
+                    </a:xfrm>
+                    <a:prstGeom prst="rect">
+                      <a:avLst/>
+                    </a:prstGeom>
+                    <a:noFill/>
+                  </pic:spPr>
+                </pic:pic>
+              </a:graphicData>
+            </a:graphic>
+          </wp:inline>
+        </w:drawing>
+      </w:r>
+    </w:p>
+    <w:p>
+      <w:pPr>
+        <w:tabs>
+          <w:tab w:val="left" w:pos="3105"/>
+        </w:tabs>
+      </w:pPr>
+    </w:p>
+    <w:p>
+      <w:pPr>
+        <w:tabs>
+          <w:tab w:val="left" w:pos="3105"/>
+        </w:tabs>
+      </w:pPr>
+      <w:r>
+        <w:t>56- Criamos uma nova pagina contatos.html e contato.CSS</w:t>
+      </w:r>
+      <w:r>
+        <w:t xml:space="preserve"> copiamos o cabeçalho (header) da </w:t>
+      </w:r>
+      <w:proofErr w:type="spellStart"/>
+      <w:r>
+        <w:t>pagina</w:t>
+      </w:r>
+      <w:proofErr w:type="spellEnd"/>
+      <w:r>
+        <w:t xml:space="preserve"> produtos e colocamos na </w:t>
+      </w:r>
+      <w:proofErr w:type="spellStart"/>
+      <w:r>
+        <w:t>pagina</w:t>
+      </w:r>
+      <w:proofErr w:type="spellEnd"/>
+      <w:r>
+        <w:t xml:space="preserve"> contatos e repetimos o mesmo processo no </w:t>
+      </w:r>
+      <w:proofErr w:type="spellStart"/>
+      <w:r>
+        <w:t>css</w:t>
+      </w:r>
+      <w:proofErr w:type="spellEnd"/>
+      <w:r>
+        <w:t xml:space="preserve"> com isso finalizamos o menu que já estava pronto </w:t>
+      </w:r>
+    </w:p>
+    <w:p>
+      <w:pPr>
+        <w:tabs>
+          <w:tab w:val="left" w:pos="3105"/>
+        </w:tabs>
+      </w:pPr>
+      <w:r>
+        <w:drawing>
+          <wp:inline distT="0" distB="0" distL="0" distR="0" wp14:anchorId="1BFFB973" wp14:editId="3520FF89">
+            <wp:extent cx="4490720" cy="2133600"/>
+            <wp:effectExtent l="0" t="0" r="5080" b="0"/>
+            <wp:docPr id="89" name="Imagem 89"/>
+            <wp:cNvGraphicFramePr>
+              <a:graphicFrameLocks xmlns:a="http://schemas.openxmlformats.org/drawingml/2006/main" noChangeAspect="1"/>
+            </wp:cNvGraphicFramePr>
+            <a:graphic xmlns:a="http://schemas.openxmlformats.org/drawingml/2006/main">
+              <a:graphicData uri="http://schemas.openxmlformats.org/drawingml/2006/picture">
+                <pic:pic xmlns:pic="http://schemas.openxmlformats.org/drawingml/2006/picture">
+                  <pic:nvPicPr>
+                    <pic:cNvPr id="1" name=""/>
+                    <pic:cNvPicPr/>
+                  </pic:nvPicPr>
+                  <pic:blipFill>
+                    <a:blip r:embed="rId97"/>
+                    <a:stretch>
+                      <a:fillRect/>
+                    </a:stretch>
+                  </pic:blipFill>
+                  <pic:spPr>
+                    <a:xfrm>
+                      <a:off x="0" y="0"/>
+                      <a:ext cx="4586529" cy="2179120"/>
+                    </a:xfrm>
+                    <a:prstGeom prst="rect">
+                      <a:avLst/>
+                    </a:prstGeom>
+                  </pic:spPr>
+                </pic:pic>
+              </a:graphicData>
+            </a:graphic>
+          </wp:inline>
+        </w:drawing>
+      </w:r>
+      <w:r>
+        <w:rPr>
+          <w:noProof/>
+        </w:rPr>
+        <w:drawing>
+          <wp:inline distT="0" distB="0" distL="0" distR="0" wp14:anchorId="3E1ACEC0">
+            <wp:extent cx="1876425" cy="3672638"/>
+            <wp:effectExtent l="0" t="0" r="0" b="4445"/>
+            <wp:docPr id="90" name="Imagem 90"/>
+            <wp:cNvGraphicFramePr>
+              <a:graphicFrameLocks xmlns:a="http://schemas.openxmlformats.org/drawingml/2006/main" noChangeAspect="1"/>
+            </wp:cNvGraphicFramePr>
+            <a:graphic xmlns:a="http://schemas.openxmlformats.org/drawingml/2006/main">
+              <a:graphicData uri="http://schemas.openxmlformats.org/drawingml/2006/picture">
+                <pic:pic xmlns:pic="http://schemas.openxmlformats.org/drawingml/2006/picture">
+                  <pic:nvPicPr>
+                    <pic:cNvPr id="0" name="Picture 4"/>
+                    <pic:cNvPicPr>
+                      <a:picLocks noChangeAspect="1" noChangeArrowheads="1"/>
+                    </pic:cNvPicPr>
+                  </pic:nvPicPr>
+                  <pic:blipFill>
+                    <a:blip r:embed="rId98">
+                      <a:extLst>
+                        <a:ext uri="{28A0092B-C50C-407E-A947-70E740481C1C}">
+                          <a14:useLocalDpi xmlns:a14="http://schemas.microsoft.com/office/drawing/2010/main" val="0"/>
+                        </a:ext>
+                      </a:extLst>
+                    </a:blip>
+                    <a:srcRect/>
+                    <a:stretch>
+                      <a:fillRect/>
+                    </a:stretch>
+                  </pic:blipFill>
+                  <pic:spPr bwMode="auto">
+                    <a:xfrm>
+                      <a:off x="0" y="0"/>
+                      <a:ext cx="1978949" cy="3873304"/>
+                    </a:xfrm>
+                    <a:prstGeom prst="rect">
+                      <a:avLst/>
+                    </a:prstGeom>
+                    <a:noFill/>
+                  </pic:spPr>
+                </pic:pic>
+              </a:graphicData>
+            </a:graphic>
+          </wp:inline>
+        </w:drawing>
+      </w:r>
+    </w:p>
+    <w:p>
+      <w:pPr>
+        <w:tabs>
+          <w:tab w:val="left" w:pos="3105"/>
+        </w:tabs>
+      </w:pPr>
+    </w:p>
+    <w:p>
+      <w:pPr>
+        <w:tabs>
+          <w:tab w:val="left" w:pos="3105"/>
+        </w:tabs>
+      </w:pPr>
+      <w:r>
+        <w:t xml:space="preserve">57-                              </w:t>
       </w:r>
       <w:bookmarkStart w:id="0" w:name="_GoBack"/>
       <w:bookmarkEnd w:id="0"/>
+    </w:p>
+    <w:p>
+      <w:pPr>
+        <w:tabs>
+          <w:tab w:val="left" w:pos="3105"/>
+        </w:tabs>
+      </w:pPr>
+    </w:p>
+    <w:p>
+      <w:pPr>
+        <w:tabs>
+          <w:tab w:val="left" w:pos="3105"/>
+        </w:tabs>
+      </w:pPr>
     </w:p>
     <w:p>
       <w:pPr>
@@ -7922,7 +8335,7 @@
 </file>
 
 <file path=customXml/itemProps1.xml><?xml version="1.0" encoding="utf-8"?>
-<ds:datastoreItem xmlns:ds="http://schemas.openxmlformats.org/officeDocument/2006/customXml" ds:itemID="{E08F937B-C8F8-4B2E-A0C9-C5BE97E8A75F}">
+<ds:datastoreItem xmlns:ds="http://schemas.openxmlformats.org/officeDocument/2006/customXml" ds:itemID="{63AE467F-B02C-4F2C-A6E3-9AD1AA5D63DF}">
   <ds:schemaRefs>
     <ds:schemaRef ds:uri="http://schemas.openxmlformats.org/officeDocument/2006/bibliography"/>
   </ds:schemaRefs>

</xml_diff>

<commit_message>
atualização da aula 22/09/2026
</commit_message>
<xml_diff>
--- a/apostila/Projeto Space For Men.docx
+++ b/apostila/Projeto Space For Men.docx
@@ -8790,21 +8790,19 @@
       </w:r>
       <w:proofErr w:type="spellEnd"/>
       <w:r>
-        <w:t xml:space="preserve"> inputs-padrão e adicionamos nos inputs os quais queríamos que ficassem um a abaixo do outro</w:t>
-      </w:r>
-      <w:bookmarkStart w:id="0" w:name="_GoBack"/>
-      <w:bookmarkEnd w:id="0"/>
-      <w:r>
-        <w:t xml:space="preserve"> </w:t>
-      </w:r>
-    </w:p>
-    <w:p>
-      <w:pPr>
-        <w:tabs>
-          <w:tab w:val="left" w:pos="3105"/>
-        </w:tabs>
-      </w:pPr>
-      <w:r>
+        <w:t xml:space="preserve"> inputs-padrão e adicionamos nos inputs os quais queríamos que ficassem um a abaixo do outro </w:t>
+      </w:r>
+    </w:p>
+    <w:p>
+      <w:pPr>
+        <w:tabs>
+          <w:tab w:val="left" w:pos="3105"/>
+        </w:tabs>
+      </w:pPr>
+      <w:r>
+        <w:rPr>
+          <w:noProof/>
+        </w:rPr>
         <w:drawing>
           <wp:inline distT="0" distB="0" distL="0" distR="0" wp14:anchorId="562A0845" wp14:editId="7601E0B6">
             <wp:extent cx="3772426" cy="1114581"/>
@@ -8905,6 +8903,1159 @@
           <w:tab w:val="left" w:pos="3105"/>
         </w:tabs>
       </w:pPr>
+      <w:r>
+        <w:t xml:space="preserve">71- Adicionamos uma </w:t>
+      </w:r>
+      <w:proofErr w:type="spellStart"/>
+      <w:proofErr w:type="gramStart"/>
+      <w:r>
+        <w:t>class</w:t>
+      </w:r>
+      <w:proofErr w:type="spellEnd"/>
+      <w:r>
+        <w:t xml:space="preserve">  na</w:t>
+      </w:r>
+      <w:proofErr w:type="gramEnd"/>
+      <w:r>
+        <w:t xml:space="preserve"> </w:t>
+      </w:r>
+      <w:proofErr w:type="spellStart"/>
+      <w:r>
+        <w:t>label</w:t>
+      </w:r>
+      <w:proofErr w:type="spellEnd"/>
+      <w:r>
+        <w:t xml:space="preserve"> </w:t>
+      </w:r>
+      <w:proofErr w:type="spellStart"/>
+      <w:r>
+        <w:t>chekbox</w:t>
+      </w:r>
+      <w:proofErr w:type="spellEnd"/>
+      <w:r>
+        <w:t xml:space="preserve"> para dar um espaço tanto para cima como para baixo</w:t>
+      </w:r>
+    </w:p>
+    <w:p>
+      <w:pPr>
+        <w:tabs>
+          <w:tab w:val="left" w:pos="3105"/>
+        </w:tabs>
+      </w:pPr>
+      <w:r>
+        <w:drawing>
+          <wp:inline distT="0" distB="0" distL="0" distR="0" wp14:anchorId="4E5CD7B4" wp14:editId="50825DAD">
+            <wp:extent cx="5106113" cy="485843"/>
+            <wp:effectExtent l="0" t="0" r="0" b="9525"/>
+            <wp:docPr id="114" name="Imagem 114"/>
+            <wp:cNvGraphicFramePr>
+              <a:graphicFrameLocks xmlns:a="http://schemas.openxmlformats.org/drawingml/2006/main" noChangeAspect="1"/>
+            </wp:cNvGraphicFramePr>
+            <a:graphic xmlns:a="http://schemas.openxmlformats.org/drawingml/2006/main">
+              <a:graphicData uri="http://schemas.openxmlformats.org/drawingml/2006/picture">
+                <pic:pic xmlns:pic="http://schemas.openxmlformats.org/drawingml/2006/picture">
+                  <pic:nvPicPr>
+                    <pic:cNvPr id="1" name=""/>
+                    <pic:cNvPicPr/>
+                  </pic:nvPicPr>
+                  <pic:blipFill>
+                    <a:blip r:embed="rId122"/>
+                    <a:stretch>
+                      <a:fillRect/>
+                    </a:stretch>
+                  </pic:blipFill>
+                  <pic:spPr>
+                    <a:xfrm>
+                      <a:off x="0" y="0"/>
+                      <a:ext cx="5106113" cy="485843"/>
+                    </a:xfrm>
+                    <a:prstGeom prst="rect">
+                      <a:avLst/>
+                    </a:prstGeom>
+                  </pic:spPr>
+                </pic:pic>
+              </a:graphicData>
+            </a:graphic>
+          </wp:inline>
+        </w:drawing>
+      </w:r>
+      <w:r>
+        <w:rPr>
+          <w:noProof/>
+        </w:rPr>
+        <w:drawing>
+          <wp:inline distT="0" distB="0" distL="0" distR="0" wp14:anchorId="2B9149E2">
+            <wp:extent cx="1247775" cy="600075"/>
+            <wp:effectExtent l="0" t="0" r="9525" b="9525"/>
+            <wp:docPr id="115" name="Imagem 115"/>
+            <wp:cNvGraphicFramePr>
+              <a:graphicFrameLocks xmlns:a="http://schemas.openxmlformats.org/drawingml/2006/main" noChangeAspect="1"/>
+            </wp:cNvGraphicFramePr>
+            <a:graphic xmlns:a="http://schemas.openxmlformats.org/drawingml/2006/main">
+              <a:graphicData uri="http://schemas.openxmlformats.org/drawingml/2006/picture">
+                <pic:pic xmlns:pic="http://schemas.openxmlformats.org/drawingml/2006/picture">
+                  <pic:nvPicPr>
+                    <pic:cNvPr id="0" name="Picture 2"/>
+                    <pic:cNvPicPr>
+                      <a:picLocks noChangeAspect="1" noChangeArrowheads="1"/>
+                    </pic:cNvPicPr>
+                  </pic:nvPicPr>
+                  <pic:blipFill>
+                    <a:blip r:embed="rId123">
+                      <a:extLst>
+                        <a:ext uri="{28A0092B-C50C-407E-A947-70E740481C1C}">
+                          <a14:useLocalDpi xmlns:a14="http://schemas.microsoft.com/office/drawing/2010/main" val="0"/>
+                        </a:ext>
+                      </a:extLst>
+                    </a:blip>
+                    <a:srcRect/>
+                    <a:stretch>
+                      <a:fillRect/>
+                    </a:stretch>
+                  </pic:blipFill>
+                  <pic:spPr bwMode="auto">
+                    <a:xfrm>
+                      <a:off x="0" y="0"/>
+                      <a:ext cx="1247775" cy="600075"/>
+                    </a:xfrm>
+                    <a:prstGeom prst="rect">
+                      <a:avLst/>
+                    </a:prstGeom>
+                    <a:noFill/>
+                  </pic:spPr>
+                </pic:pic>
+              </a:graphicData>
+            </a:graphic>
+          </wp:inline>
+        </w:drawing>
+      </w:r>
+    </w:p>
+    <w:p>
+      <w:pPr>
+        <w:tabs>
+          <w:tab w:val="left" w:pos="3105"/>
+        </w:tabs>
+      </w:pPr>
+    </w:p>
+    <w:p>
+      <w:pPr>
+        <w:tabs>
+          <w:tab w:val="left" w:pos="3105"/>
+        </w:tabs>
+      </w:pPr>
+      <w:r>
+        <w:t xml:space="preserve">72- </w:t>
+      </w:r>
+      <w:r>
+        <w:t xml:space="preserve">Inserimos um paragrafo fazendo qual é a preferência de horário e adicionamos </w:t>
+      </w:r>
+      <w:proofErr w:type="spellStart"/>
+      <w:r>
+        <w:t>select</w:t>
+      </w:r>
+      <w:proofErr w:type="spellEnd"/>
+      <w:r>
+        <w:t xml:space="preserve"> com </w:t>
+      </w:r>
+      <w:proofErr w:type="spellStart"/>
+      <w:r>
+        <w:t>option</w:t>
+      </w:r>
+      <w:proofErr w:type="spellEnd"/>
+      <w:r>
+        <w:t xml:space="preserve"> no </w:t>
+      </w:r>
+      <w:proofErr w:type="spellStart"/>
+      <w:r>
+        <w:t>html</w:t>
+      </w:r>
+      <w:proofErr w:type="spellEnd"/>
+      <w:r>
+        <w:t xml:space="preserve"> conforme código</w:t>
+      </w:r>
+    </w:p>
+    <w:p>
+      <w:pPr>
+        <w:tabs>
+          <w:tab w:val="left" w:pos="3105"/>
+        </w:tabs>
+      </w:pPr>
+      <w:r>
+        <w:drawing>
+          <wp:inline distT="0" distB="0" distL="0" distR="0" wp14:anchorId="1B559E48" wp14:editId="7501F852">
+            <wp:extent cx="2695951" cy="1390844"/>
+            <wp:effectExtent l="0" t="0" r="9525" b="0"/>
+            <wp:docPr id="116" name="Imagem 116"/>
+            <wp:cNvGraphicFramePr>
+              <a:graphicFrameLocks xmlns:a="http://schemas.openxmlformats.org/drawingml/2006/main" noChangeAspect="1"/>
+            </wp:cNvGraphicFramePr>
+            <a:graphic xmlns:a="http://schemas.openxmlformats.org/drawingml/2006/main">
+              <a:graphicData uri="http://schemas.openxmlformats.org/drawingml/2006/picture">
+                <pic:pic xmlns:pic="http://schemas.openxmlformats.org/drawingml/2006/picture">
+                  <pic:nvPicPr>
+                    <pic:cNvPr id="1" name=""/>
+                    <pic:cNvPicPr/>
+                  </pic:nvPicPr>
+                  <pic:blipFill>
+                    <a:blip r:embed="rId124"/>
+                    <a:stretch>
+                      <a:fillRect/>
+                    </a:stretch>
+                  </pic:blipFill>
+                  <pic:spPr>
+                    <a:xfrm>
+                      <a:off x="0" y="0"/>
+                      <a:ext cx="2695951" cy="1390844"/>
+                    </a:xfrm>
+                    <a:prstGeom prst="rect">
+                      <a:avLst/>
+                    </a:prstGeom>
+                  </pic:spPr>
+                </pic:pic>
+              </a:graphicData>
+            </a:graphic>
+          </wp:inline>
+        </w:drawing>
+      </w:r>
+      <w:r>
+        <w:rPr>
+          <w:noProof/>
+        </w:rPr>
+        <w:drawing>
+          <wp:inline distT="0" distB="0" distL="0" distR="0" wp14:anchorId="0BDF816D">
+            <wp:extent cx="1514475" cy="1028700"/>
+            <wp:effectExtent l="0" t="0" r="9525" b="0"/>
+            <wp:docPr id="117" name="Imagem 117"/>
+            <wp:cNvGraphicFramePr>
+              <a:graphicFrameLocks xmlns:a="http://schemas.openxmlformats.org/drawingml/2006/main" noChangeAspect="1"/>
+            </wp:cNvGraphicFramePr>
+            <a:graphic xmlns:a="http://schemas.openxmlformats.org/drawingml/2006/main">
+              <a:graphicData uri="http://schemas.openxmlformats.org/drawingml/2006/picture">
+                <pic:pic xmlns:pic="http://schemas.openxmlformats.org/drawingml/2006/picture">
+                  <pic:nvPicPr>
+                    <pic:cNvPr id="0" name="Picture 3"/>
+                    <pic:cNvPicPr>
+                      <a:picLocks noChangeAspect="1" noChangeArrowheads="1"/>
+                    </pic:cNvPicPr>
+                  </pic:nvPicPr>
+                  <pic:blipFill>
+                    <a:blip r:embed="rId125">
+                      <a:extLst>
+                        <a:ext uri="{28A0092B-C50C-407E-A947-70E740481C1C}">
+                          <a14:useLocalDpi xmlns:a14="http://schemas.microsoft.com/office/drawing/2010/main" val="0"/>
+                        </a:ext>
+                      </a:extLst>
+                    </a:blip>
+                    <a:srcRect/>
+                    <a:stretch>
+                      <a:fillRect/>
+                    </a:stretch>
+                  </pic:blipFill>
+                  <pic:spPr bwMode="auto">
+                    <a:xfrm>
+                      <a:off x="0" y="0"/>
+                      <a:ext cx="1514475" cy="1028700"/>
+                    </a:xfrm>
+                    <a:prstGeom prst="rect">
+                      <a:avLst/>
+                    </a:prstGeom>
+                    <a:noFill/>
+                  </pic:spPr>
+                </pic:pic>
+              </a:graphicData>
+            </a:graphic>
+          </wp:inline>
+        </w:drawing>
+      </w:r>
+    </w:p>
+    <w:p>
+      <w:pPr>
+        <w:tabs>
+          <w:tab w:val="left" w:pos="3105"/>
+        </w:tabs>
+      </w:pPr>
+    </w:p>
+    <w:p>
+      <w:pPr>
+        <w:tabs>
+          <w:tab w:val="left" w:pos="3105"/>
+        </w:tabs>
+      </w:pPr>
+      <w:r>
+        <w:t xml:space="preserve">73- </w:t>
+      </w:r>
+      <w:r>
+        <w:t xml:space="preserve">Entramos no site (mobile inputs </w:t>
+      </w:r>
+      <w:proofErr w:type="spellStart"/>
+      <w:r>
+        <w:t>types</w:t>
+      </w:r>
+      <w:proofErr w:type="spellEnd"/>
+      <w:r>
+        <w:t xml:space="preserve">) para verificar os tipos de inputs para dispositivos mobile e alteramos em nosso formulário alguns </w:t>
+      </w:r>
+      <w:proofErr w:type="gramStart"/>
+      <w:r>
+        <w:t>tipos  para</w:t>
+      </w:r>
+      <w:proofErr w:type="gramEnd"/>
+      <w:r>
+        <w:t xml:space="preserve"> ficar compatível com os dispositivos de celulares</w:t>
+      </w:r>
+    </w:p>
+    <w:p>
+      <w:pPr>
+        <w:tabs>
+          <w:tab w:val="left" w:pos="3105"/>
+        </w:tabs>
+      </w:pPr>
+      <w:r>
+        <w:rPr>
+          <w:noProof/>
+        </w:rPr>
+        <w:drawing>
+          <wp:inline distT="0" distB="0" distL="0" distR="0" wp14:anchorId="5302B7AF">
+            <wp:extent cx="3791585" cy="1438275"/>
+            <wp:effectExtent l="0" t="0" r="0" b="9525"/>
+            <wp:docPr id="119" name="Imagem 119"/>
+            <wp:cNvGraphicFramePr>
+              <a:graphicFrameLocks xmlns:a="http://schemas.openxmlformats.org/drawingml/2006/main" noChangeAspect="1"/>
+            </wp:cNvGraphicFramePr>
+            <a:graphic xmlns:a="http://schemas.openxmlformats.org/drawingml/2006/main">
+              <a:graphicData uri="http://schemas.openxmlformats.org/drawingml/2006/picture">
+                <pic:pic xmlns:pic="http://schemas.openxmlformats.org/drawingml/2006/picture">
+                  <pic:nvPicPr>
+                    <pic:cNvPr id="0" name="Picture 5"/>
+                    <pic:cNvPicPr>
+                      <a:picLocks noChangeAspect="1" noChangeArrowheads="1"/>
+                    </pic:cNvPicPr>
+                  </pic:nvPicPr>
+                  <pic:blipFill>
+                    <a:blip r:embed="rId126">
+                      <a:extLst>
+                        <a:ext uri="{28A0092B-C50C-407E-A947-70E740481C1C}">
+                          <a14:useLocalDpi xmlns:a14="http://schemas.microsoft.com/office/drawing/2010/main" val="0"/>
+                        </a:ext>
+                      </a:extLst>
+                    </a:blip>
+                    <a:srcRect/>
+                    <a:stretch>
+                      <a:fillRect/>
+                    </a:stretch>
+                  </pic:blipFill>
+                  <pic:spPr bwMode="auto">
+                    <a:xfrm>
+                      <a:off x="0" y="0"/>
+                      <a:ext cx="3791585" cy="1438275"/>
+                    </a:xfrm>
+                    <a:prstGeom prst="rect">
+                      <a:avLst/>
+                    </a:prstGeom>
+                    <a:noFill/>
+                  </pic:spPr>
+                </pic:pic>
+              </a:graphicData>
+            </a:graphic>
+          </wp:inline>
+        </w:drawing>
+      </w:r>
+    </w:p>
+    <w:p>
+      <w:pPr>
+        <w:tabs>
+          <w:tab w:val="left" w:pos="3105"/>
+        </w:tabs>
+      </w:pPr>
+    </w:p>
+    <w:p>
+      <w:pPr>
+        <w:tabs>
+          <w:tab w:val="left" w:pos="3105"/>
+        </w:tabs>
+      </w:pPr>
+      <w:r>
+        <w:t xml:space="preserve">74- </w:t>
+      </w:r>
+      <w:r>
+        <w:t xml:space="preserve">Quando queremos que alguns campos sejam obrigatórios no formulário usamos o </w:t>
+      </w:r>
+      <w:proofErr w:type="spellStart"/>
+      <w:r>
+        <w:t>required</w:t>
+      </w:r>
+      <w:proofErr w:type="spellEnd"/>
+      <w:r>
+        <w:t xml:space="preserve"> no input (</w:t>
+      </w:r>
+      <w:proofErr w:type="spellStart"/>
+      <w:r>
+        <w:t>obs</w:t>
+      </w:r>
+      <w:proofErr w:type="spellEnd"/>
+      <w:r>
+        <w:t xml:space="preserve">: se usamos o tipo de input </w:t>
+      </w:r>
+      <w:proofErr w:type="gramStart"/>
+      <w:r>
+        <w:t>correto</w:t>
+      </w:r>
+      <w:proofErr w:type="gramEnd"/>
+      <w:r>
+        <w:t xml:space="preserve"> correto com por exemplo </w:t>
+      </w:r>
+      <w:proofErr w:type="spellStart"/>
+      <w:r>
+        <w:t>email</w:t>
+      </w:r>
+      <w:proofErr w:type="spellEnd"/>
+      <w:r>
+        <w:t xml:space="preserve"> se não tiver correto a grafia ele também não envia)</w:t>
+      </w:r>
+    </w:p>
+    <w:p>
+      <w:pPr>
+        <w:tabs>
+          <w:tab w:val="left" w:pos="3105"/>
+        </w:tabs>
+      </w:pPr>
+      <w:r>
+        <w:rPr>
+          <w:noProof/>
+        </w:rPr>
+        <w:drawing>
+          <wp:inline distT="0" distB="0" distL="0" distR="0" wp14:anchorId="4F9A9949">
+            <wp:extent cx="4229735" cy="1323975"/>
+            <wp:effectExtent l="0" t="0" r="0" b="9525"/>
+            <wp:docPr id="120" name="Imagem 120"/>
+            <wp:cNvGraphicFramePr>
+              <a:graphicFrameLocks xmlns:a="http://schemas.openxmlformats.org/drawingml/2006/main" noChangeAspect="1"/>
+            </wp:cNvGraphicFramePr>
+            <a:graphic xmlns:a="http://schemas.openxmlformats.org/drawingml/2006/main">
+              <a:graphicData uri="http://schemas.openxmlformats.org/drawingml/2006/picture">
+                <pic:pic xmlns:pic="http://schemas.openxmlformats.org/drawingml/2006/picture">
+                  <pic:nvPicPr>
+                    <pic:cNvPr id="0" name="Picture 6"/>
+                    <pic:cNvPicPr>
+                      <a:picLocks noChangeAspect="1" noChangeArrowheads="1"/>
+                    </pic:cNvPicPr>
+                  </pic:nvPicPr>
+                  <pic:blipFill>
+                    <a:blip r:embed="rId127">
+                      <a:extLst>
+                        <a:ext uri="{28A0092B-C50C-407E-A947-70E740481C1C}">
+                          <a14:useLocalDpi xmlns:a14="http://schemas.microsoft.com/office/drawing/2010/main" val="0"/>
+                        </a:ext>
+                      </a:extLst>
+                    </a:blip>
+                    <a:srcRect/>
+                    <a:stretch>
+                      <a:fillRect/>
+                    </a:stretch>
+                  </pic:blipFill>
+                  <pic:spPr bwMode="auto">
+                    <a:xfrm>
+                      <a:off x="0" y="0"/>
+                      <a:ext cx="4229735" cy="1323975"/>
+                    </a:xfrm>
+                    <a:prstGeom prst="rect">
+                      <a:avLst/>
+                    </a:prstGeom>
+                    <a:noFill/>
+                  </pic:spPr>
+                </pic:pic>
+              </a:graphicData>
+            </a:graphic>
+          </wp:inline>
+        </w:drawing>
+      </w:r>
+    </w:p>
+    <w:p>
+      <w:pPr>
+        <w:tabs>
+          <w:tab w:val="left" w:pos="3105"/>
+        </w:tabs>
+      </w:pPr>
+    </w:p>
+    <w:p>
+      <w:pPr>
+        <w:tabs>
+          <w:tab w:val="left" w:pos="3105"/>
+        </w:tabs>
+      </w:pPr>
+      <w:r>
+        <w:t xml:space="preserve">75- Utilizamos o </w:t>
+      </w:r>
+      <w:proofErr w:type="spellStart"/>
+      <w:r>
+        <w:t>placeholder</w:t>
+      </w:r>
+      <w:proofErr w:type="spellEnd"/>
+      <w:r>
+        <w:t xml:space="preserve"> para deixar exemplo dentro dos inputs </w:t>
+      </w:r>
+      <w:proofErr w:type="gramStart"/>
+      <w:r>
+        <w:t>como  deve</w:t>
+      </w:r>
+      <w:proofErr w:type="gramEnd"/>
+      <w:r>
+        <w:t xml:space="preserve"> ser preenchido</w:t>
+      </w:r>
+    </w:p>
+    <w:p>
+      <w:pPr>
+        <w:tabs>
+          <w:tab w:val="left" w:pos="3105"/>
+        </w:tabs>
+      </w:pPr>
+      <w:r>
+        <w:rPr>
+          <w:noProof/>
+        </w:rPr>
+        <w:drawing>
+          <wp:inline distT="0" distB="0" distL="0" distR="0" wp14:anchorId="63669CD9">
+            <wp:extent cx="6049010" cy="952500"/>
+            <wp:effectExtent l="0" t="0" r="8890" b="0"/>
+            <wp:docPr id="121" name="Imagem 121"/>
+            <wp:cNvGraphicFramePr>
+              <a:graphicFrameLocks xmlns:a="http://schemas.openxmlformats.org/drawingml/2006/main" noChangeAspect="1"/>
+            </wp:cNvGraphicFramePr>
+            <a:graphic xmlns:a="http://schemas.openxmlformats.org/drawingml/2006/main">
+              <a:graphicData uri="http://schemas.openxmlformats.org/drawingml/2006/picture">
+                <pic:pic xmlns:pic="http://schemas.openxmlformats.org/drawingml/2006/picture">
+                  <pic:nvPicPr>
+                    <pic:cNvPr id="0" name="Picture 7"/>
+                    <pic:cNvPicPr>
+                      <a:picLocks noChangeAspect="1" noChangeArrowheads="1"/>
+                    </pic:cNvPicPr>
+                  </pic:nvPicPr>
+                  <pic:blipFill>
+                    <a:blip r:embed="rId128">
+                      <a:extLst>
+                        <a:ext uri="{28A0092B-C50C-407E-A947-70E740481C1C}">
+                          <a14:useLocalDpi xmlns:a14="http://schemas.microsoft.com/office/drawing/2010/main" val="0"/>
+                        </a:ext>
+                      </a:extLst>
+                    </a:blip>
+                    <a:srcRect/>
+                    <a:stretch>
+                      <a:fillRect/>
+                    </a:stretch>
+                  </pic:blipFill>
+                  <pic:spPr bwMode="auto">
+                    <a:xfrm>
+                      <a:off x="0" y="0"/>
+                      <a:ext cx="6049010" cy="952500"/>
+                    </a:xfrm>
+                    <a:prstGeom prst="rect">
+                      <a:avLst/>
+                    </a:prstGeom>
+                    <a:noFill/>
+                  </pic:spPr>
+                </pic:pic>
+              </a:graphicData>
+            </a:graphic>
+          </wp:inline>
+        </w:drawing>
+      </w:r>
+    </w:p>
+    <w:p>
+      <w:pPr>
+        <w:tabs>
+          <w:tab w:val="left" w:pos="3105"/>
+        </w:tabs>
+      </w:pPr>
+      <w:r>
+        <w:rPr>
+          <w:noProof/>
+        </w:rPr>
+        <w:drawing>
+          <wp:inline distT="0" distB="0" distL="0" distR="0" wp14:anchorId="264C2213">
+            <wp:extent cx="3734435" cy="1181100"/>
+            <wp:effectExtent l="0" t="0" r="0" b="0"/>
+            <wp:docPr id="122" name="Imagem 122"/>
+            <wp:cNvGraphicFramePr>
+              <a:graphicFrameLocks xmlns:a="http://schemas.openxmlformats.org/drawingml/2006/main" noChangeAspect="1"/>
+            </wp:cNvGraphicFramePr>
+            <a:graphic xmlns:a="http://schemas.openxmlformats.org/drawingml/2006/main">
+              <a:graphicData uri="http://schemas.openxmlformats.org/drawingml/2006/picture">
+                <pic:pic xmlns:pic="http://schemas.openxmlformats.org/drawingml/2006/picture">
+                  <pic:nvPicPr>
+                    <pic:cNvPr id="0" name="Picture 8"/>
+                    <pic:cNvPicPr>
+                      <a:picLocks noChangeAspect="1" noChangeArrowheads="1"/>
+                    </pic:cNvPicPr>
+                  </pic:nvPicPr>
+                  <pic:blipFill>
+                    <a:blip r:embed="rId129">
+                      <a:extLst>
+                        <a:ext uri="{28A0092B-C50C-407E-A947-70E740481C1C}">
+                          <a14:useLocalDpi xmlns:a14="http://schemas.microsoft.com/office/drawing/2010/main" val="0"/>
+                        </a:ext>
+                      </a:extLst>
+                    </a:blip>
+                    <a:srcRect/>
+                    <a:stretch>
+                      <a:fillRect/>
+                    </a:stretch>
+                  </pic:blipFill>
+                  <pic:spPr bwMode="auto">
+                    <a:xfrm>
+                      <a:off x="0" y="0"/>
+                      <a:ext cx="3734435" cy="1181100"/>
+                    </a:xfrm>
+                    <a:prstGeom prst="rect">
+                      <a:avLst/>
+                    </a:prstGeom>
+                    <a:noFill/>
+                  </pic:spPr>
+                </pic:pic>
+              </a:graphicData>
+            </a:graphic>
+          </wp:inline>
+        </w:drawing>
+      </w:r>
+    </w:p>
+    <w:p>
+      <w:pPr>
+        <w:shd w:val="clear" w:color="auto" w:fill="121314"/>
+        <w:spacing w:line="285" w:lineRule="atLeast"/>
+        <w:rPr>
+          <w:rFonts w:ascii="Consolas" w:eastAsia="Times New Roman" w:hAnsi="Consolas" w:cs="Times New Roman"/>
+          <w:color w:val="BBBEBF"/>
+          <w:sz w:val="21"/>
+          <w:szCs w:val="21"/>
+          <w:lang w:eastAsia="pt-BR"/>
+        </w:rPr>
+      </w:pPr>
+    </w:p>
+    <w:p>
+      <w:pPr>
+        <w:tabs>
+          <w:tab w:val="left" w:pos="3105"/>
+        </w:tabs>
+      </w:pPr>
+    </w:p>
+    <w:p>
+      <w:pPr>
+        <w:tabs>
+          <w:tab w:val="left" w:pos="3105"/>
+        </w:tabs>
+      </w:pPr>
+      <w:r>
+        <w:t xml:space="preserve">76- </w:t>
+      </w:r>
+      <w:proofErr w:type="gramStart"/>
+      <w:r>
+        <w:t>Trocamos  as</w:t>
+      </w:r>
+      <w:proofErr w:type="gramEnd"/>
+      <w:r>
+        <w:t xml:space="preserve"> </w:t>
+      </w:r>
+      <w:proofErr w:type="spellStart"/>
+      <w:r>
+        <w:t>div</w:t>
+      </w:r>
+      <w:proofErr w:type="spellEnd"/>
+      <w:r>
+        <w:t xml:space="preserve"> do formulário por </w:t>
+      </w:r>
+      <w:proofErr w:type="spellStart"/>
+      <w:r>
+        <w:t>fieldser</w:t>
+      </w:r>
+      <w:proofErr w:type="spellEnd"/>
+      <w:r>
+        <w:t xml:space="preserve">(conjuntos de campos) e os parágrafos </w:t>
+      </w:r>
+      <w:proofErr w:type="spellStart"/>
+      <w:r>
+        <w:t>pppor</w:t>
+      </w:r>
+      <w:proofErr w:type="spellEnd"/>
+      <w:r>
+        <w:t xml:space="preserve"> </w:t>
+      </w:r>
+      <w:proofErr w:type="spellStart"/>
+      <w:r>
+        <w:t>legend</w:t>
+      </w:r>
+      <w:proofErr w:type="spellEnd"/>
+      <w:r>
+        <w:t xml:space="preserve"> sendo uma forma de trabalhar quando estamos tratando de formulário e no </w:t>
+      </w:r>
+      <w:proofErr w:type="spellStart"/>
+      <w:r>
+        <w:t>css</w:t>
+      </w:r>
+      <w:proofErr w:type="spellEnd"/>
+      <w:r>
+        <w:t xml:space="preserve"> as </w:t>
+      </w:r>
+      <w:proofErr w:type="spellStart"/>
+      <w:r>
+        <w:t>legend</w:t>
+      </w:r>
+      <w:proofErr w:type="spellEnd"/>
+      <w:r>
+        <w:t xml:space="preserve"> ficaram com as mesmas configurações  das </w:t>
+      </w:r>
+      <w:proofErr w:type="spellStart"/>
+      <w:r>
+        <w:t>label</w:t>
+      </w:r>
+      <w:proofErr w:type="spellEnd"/>
+    </w:p>
+    <w:p>
+      <w:pPr>
+        <w:tabs>
+          <w:tab w:val="left" w:pos="3105"/>
+        </w:tabs>
+      </w:pPr>
+      <w:r>
+        <w:drawing>
+          <wp:inline distT="0" distB="0" distL="0" distR="0" wp14:anchorId="45D0F34A" wp14:editId="43E5B867">
+            <wp:extent cx="4674529" cy="3019425"/>
+            <wp:effectExtent l="0" t="0" r="0" b="0"/>
+            <wp:docPr id="123" name="Imagem 123"/>
+            <wp:cNvGraphicFramePr>
+              <a:graphicFrameLocks xmlns:a="http://schemas.openxmlformats.org/drawingml/2006/main" noChangeAspect="1"/>
+            </wp:cNvGraphicFramePr>
+            <a:graphic xmlns:a="http://schemas.openxmlformats.org/drawingml/2006/main">
+              <a:graphicData uri="http://schemas.openxmlformats.org/drawingml/2006/picture">
+                <pic:pic xmlns:pic="http://schemas.openxmlformats.org/drawingml/2006/picture">
+                  <pic:nvPicPr>
+                    <pic:cNvPr id="1" name=""/>
+                    <pic:cNvPicPr/>
+                  </pic:nvPicPr>
+                  <pic:blipFill>
+                    <a:blip r:embed="rId130"/>
+                    <a:stretch>
+                      <a:fillRect/>
+                    </a:stretch>
+                  </pic:blipFill>
+                  <pic:spPr>
+                    <a:xfrm>
+                      <a:off x="0" y="0"/>
+                      <a:ext cx="4735780" cy="3058989"/>
+                    </a:xfrm>
+                    <a:prstGeom prst="rect">
+                      <a:avLst/>
+                    </a:prstGeom>
+                  </pic:spPr>
+                </pic:pic>
+              </a:graphicData>
+            </a:graphic>
+          </wp:inline>
+        </w:drawing>
+      </w:r>
+      <w:r>
+        <w:rPr>
+          <w:noProof/>
+        </w:rPr>
+        <w:drawing>
+          <wp:inline distT="0" distB="0" distL="0" distR="0" wp14:anchorId="549CF2DA">
+            <wp:extent cx="1390650" cy="895350"/>
+            <wp:effectExtent l="0" t="0" r="0" b="0"/>
+            <wp:docPr id="124" name="Imagem 124"/>
+            <wp:cNvGraphicFramePr>
+              <a:graphicFrameLocks xmlns:a="http://schemas.openxmlformats.org/drawingml/2006/main" noChangeAspect="1"/>
+            </wp:cNvGraphicFramePr>
+            <a:graphic xmlns:a="http://schemas.openxmlformats.org/drawingml/2006/main">
+              <a:graphicData uri="http://schemas.openxmlformats.org/drawingml/2006/picture">
+                <pic:pic xmlns:pic="http://schemas.openxmlformats.org/drawingml/2006/picture">
+                  <pic:nvPicPr>
+                    <pic:cNvPr id="0" name="Picture 9"/>
+                    <pic:cNvPicPr>
+                      <a:picLocks noChangeAspect="1" noChangeArrowheads="1"/>
+                    </pic:cNvPicPr>
+                  </pic:nvPicPr>
+                  <pic:blipFill>
+                    <a:blip r:embed="rId131">
+                      <a:extLst>
+                        <a:ext uri="{28A0092B-C50C-407E-A947-70E740481C1C}">
+                          <a14:useLocalDpi xmlns:a14="http://schemas.microsoft.com/office/drawing/2010/main" val="0"/>
+                        </a:ext>
+                      </a:extLst>
+                    </a:blip>
+                    <a:srcRect/>
+                    <a:stretch>
+                      <a:fillRect/>
+                    </a:stretch>
+                  </pic:blipFill>
+                  <pic:spPr bwMode="auto">
+                    <a:xfrm>
+                      <a:off x="0" y="0"/>
+                      <a:ext cx="1390650" cy="895350"/>
+                    </a:xfrm>
+                    <a:prstGeom prst="rect">
+                      <a:avLst/>
+                    </a:prstGeom>
+                    <a:noFill/>
+                  </pic:spPr>
+                </pic:pic>
+              </a:graphicData>
+            </a:graphic>
+          </wp:inline>
+        </w:drawing>
+      </w:r>
+    </w:p>
+    <w:p>
+      <w:pPr>
+        <w:tabs>
+          <w:tab w:val="left" w:pos="3105"/>
+        </w:tabs>
+      </w:pPr>
+    </w:p>
+    <w:p>
+      <w:pPr>
+        <w:tabs>
+          <w:tab w:val="left" w:pos="3105"/>
+        </w:tabs>
+      </w:pPr>
+    </w:p>
+    <w:p>
+      <w:pPr>
+        <w:tabs>
+          <w:tab w:val="left" w:pos="3105"/>
+        </w:tabs>
+      </w:pPr>
+    </w:p>
+    <w:p>
+      <w:pPr>
+        <w:tabs>
+          <w:tab w:val="left" w:pos="3105"/>
+        </w:tabs>
+      </w:pPr>
+      <w:r>
+        <w:t xml:space="preserve">77- </w:t>
+      </w:r>
+      <w:r>
+        <w:t xml:space="preserve">No </w:t>
+      </w:r>
+      <w:proofErr w:type="spellStart"/>
+      <w:r>
+        <w:t>html</w:t>
+      </w:r>
+      <w:proofErr w:type="spellEnd"/>
+      <w:r>
+        <w:t xml:space="preserve"> inserimos uma </w:t>
+      </w:r>
+      <w:proofErr w:type="spellStart"/>
+      <w:r>
+        <w:t>class</w:t>
+      </w:r>
+      <w:proofErr w:type="spellEnd"/>
+      <w:r>
+        <w:t xml:space="preserve"> “enviar” no botão e no </w:t>
+      </w:r>
+      <w:proofErr w:type="spellStart"/>
+      <w:r>
+        <w:t>css</w:t>
+      </w:r>
+      <w:proofErr w:type="spellEnd"/>
+      <w:r>
+        <w:t xml:space="preserve"> aumentamos a largura e o espaço interno tanto para cima como para baixo</w:t>
+      </w:r>
+    </w:p>
+    <w:p>
+      <w:pPr>
+        <w:tabs>
+          <w:tab w:val="left" w:pos="3105"/>
+        </w:tabs>
+      </w:pPr>
+      <w:r>
+        <w:rPr>
+          <w:noProof/>
+        </w:rPr>
+        <w:drawing>
+          <wp:inline distT="0" distB="0" distL="0" distR="0" wp14:anchorId="53F8111A">
+            <wp:extent cx="3677285" cy="219075"/>
+            <wp:effectExtent l="0" t="0" r="0" b="9525"/>
+            <wp:docPr id="125" name="Imagem 125"/>
+            <wp:cNvGraphicFramePr>
+              <a:graphicFrameLocks xmlns:a="http://schemas.openxmlformats.org/drawingml/2006/main" noChangeAspect="1"/>
+            </wp:cNvGraphicFramePr>
+            <a:graphic xmlns:a="http://schemas.openxmlformats.org/drawingml/2006/main">
+              <a:graphicData uri="http://schemas.openxmlformats.org/drawingml/2006/picture">
+                <pic:pic xmlns:pic="http://schemas.openxmlformats.org/drawingml/2006/picture">
+                  <pic:nvPicPr>
+                    <pic:cNvPr id="0" name="Picture 10"/>
+                    <pic:cNvPicPr>
+                      <a:picLocks noChangeAspect="1" noChangeArrowheads="1"/>
+                    </pic:cNvPicPr>
+                  </pic:nvPicPr>
+                  <pic:blipFill>
+                    <a:blip r:embed="rId132">
+                      <a:extLst>
+                        <a:ext uri="{28A0092B-C50C-407E-A947-70E740481C1C}">
+                          <a14:useLocalDpi xmlns:a14="http://schemas.microsoft.com/office/drawing/2010/main" val="0"/>
+                        </a:ext>
+                      </a:extLst>
+                    </a:blip>
+                    <a:srcRect/>
+                    <a:stretch>
+                      <a:fillRect/>
+                    </a:stretch>
+                  </pic:blipFill>
+                  <pic:spPr bwMode="auto">
+                    <a:xfrm>
+                      <a:off x="0" y="0"/>
+                      <a:ext cx="3677285" cy="219075"/>
+                    </a:xfrm>
+                    <a:prstGeom prst="rect">
+                      <a:avLst/>
+                    </a:prstGeom>
+                    <a:noFill/>
+                  </pic:spPr>
+                </pic:pic>
+              </a:graphicData>
+            </a:graphic>
+          </wp:inline>
+        </w:drawing>
+      </w:r>
+    </w:p>
+    <w:p>
+      <w:pPr>
+        <w:tabs>
+          <w:tab w:val="left" w:pos="3105"/>
+        </w:tabs>
+      </w:pPr>
+      <w:r>
+        <w:rPr>
+          <w:noProof/>
+        </w:rPr>
+        <w:drawing>
+          <wp:inline distT="0" distB="0" distL="0" distR="0" wp14:anchorId="52FE12F0">
+            <wp:extent cx="1419225" cy="742950"/>
+            <wp:effectExtent l="0" t="0" r="9525" b="0"/>
+            <wp:docPr id="126" name="Imagem 126"/>
+            <wp:cNvGraphicFramePr>
+              <a:graphicFrameLocks xmlns:a="http://schemas.openxmlformats.org/drawingml/2006/main" noChangeAspect="1"/>
+            </wp:cNvGraphicFramePr>
+            <a:graphic xmlns:a="http://schemas.openxmlformats.org/drawingml/2006/main">
+              <a:graphicData uri="http://schemas.openxmlformats.org/drawingml/2006/picture">
+                <pic:pic xmlns:pic="http://schemas.openxmlformats.org/drawingml/2006/picture">
+                  <pic:nvPicPr>
+                    <pic:cNvPr id="0" name="Picture 11"/>
+                    <pic:cNvPicPr>
+                      <a:picLocks noChangeAspect="1" noChangeArrowheads="1"/>
+                    </pic:cNvPicPr>
+                  </pic:nvPicPr>
+                  <pic:blipFill>
+                    <a:blip r:embed="rId133">
+                      <a:extLst>
+                        <a:ext uri="{28A0092B-C50C-407E-A947-70E740481C1C}">
+                          <a14:useLocalDpi xmlns:a14="http://schemas.microsoft.com/office/drawing/2010/main" val="0"/>
+                        </a:ext>
+                      </a:extLst>
+                    </a:blip>
+                    <a:srcRect/>
+                    <a:stretch>
+                      <a:fillRect/>
+                    </a:stretch>
+                  </pic:blipFill>
+                  <pic:spPr bwMode="auto">
+                    <a:xfrm>
+                      <a:off x="0" y="0"/>
+                      <a:ext cx="1419225" cy="742950"/>
+                    </a:xfrm>
+                    <a:prstGeom prst="rect">
+                      <a:avLst/>
+                    </a:prstGeom>
+                    <a:noFill/>
+                  </pic:spPr>
+                </pic:pic>
+              </a:graphicData>
+            </a:graphic>
+          </wp:inline>
+        </w:drawing>
+      </w:r>
+    </w:p>
+    <w:p>
+      <w:pPr>
+        <w:tabs>
+          <w:tab w:val="left" w:pos="3105"/>
+        </w:tabs>
+      </w:pPr>
+    </w:p>
+    <w:p>
+      <w:pPr>
+        <w:tabs>
+          <w:tab w:val="left" w:pos="3105"/>
+        </w:tabs>
+      </w:pPr>
+      <w:r>
+        <w:t>78-</w:t>
+      </w:r>
+      <w:r>
+        <w:t xml:space="preserve"> </w:t>
+      </w:r>
+      <w:r>
+        <w:t xml:space="preserve">Trabalhamos com o botão enviar: fizemos </w:t>
+      </w:r>
+    </w:p>
+    <w:p>
+      <w:pPr>
+        <w:pStyle w:val="PargrafodaLista"/>
+        <w:numPr>
+          <w:ilvl w:val="0"/>
+          <w:numId w:val="3"/>
+        </w:numPr>
+        <w:tabs>
+          <w:tab w:val="left" w:pos="3105"/>
+        </w:tabs>
+      </w:pPr>
+      <w:r>
+        <w:t xml:space="preserve">Colocamos uma cor de fundo </w:t>
+      </w:r>
+    </w:p>
+    <w:p>
+      <w:pPr>
+        <w:pStyle w:val="PargrafodaLista"/>
+        <w:numPr>
+          <w:ilvl w:val="0"/>
+          <w:numId w:val="3"/>
+        </w:numPr>
+        <w:tabs>
+          <w:tab w:val="left" w:pos="3105"/>
+        </w:tabs>
+      </w:pPr>
+      <w:proofErr w:type="gramStart"/>
+      <w:r>
+        <w:t>Mudamos  a</w:t>
+      </w:r>
+      <w:proofErr w:type="gramEnd"/>
+      <w:r>
+        <w:t xml:space="preserve"> cor da letra para branco </w:t>
+      </w:r>
+    </w:p>
+    <w:p>
+      <w:pPr>
+        <w:pStyle w:val="PargrafodaLista"/>
+        <w:numPr>
+          <w:ilvl w:val="0"/>
+          <w:numId w:val="3"/>
+        </w:numPr>
+        <w:tabs>
+          <w:tab w:val="left" w:pos="3105"/>
+        </w:tabs>
+      </w:pPr>
+      <w:r>
+        <w:t>Deixamos mais encorpado e negrito</w:t>
+      </w:r>
+    </w:p>
+    <w:p>
+      <w:pPr>
+        <w:pStyle w:val="PargrafodaLista"/>
+        <w:numPr>
+          <w:ilvl w:val="0"/>
+          <w:numId w:val="3"/>
+        </w:numPr>
+        <w:tabs>
+          <w:tab w:val="left" w:pos="3105"/>
+        </w:tabs>
+      </w:pPr>
+      <w:r>
+        <w:t xml:space="preserve">Aumentamos o tamanho da fonte  </w:t>
+      </w:r>
+    </w:p>
+    <w:p>
+      <w:pPr>
+        <w:pStyle w:val="PargrafodaLista"/>
+        <w:numPr>
+          <w:ilvl w:val="0"/>
+          <w:numId w:val="3"/>
+        </w:numPr>
+        <w:tabs>
+          <w:tab w:val="left" w:pos="3105"/>
+        </w:tabs>
+      </w:pPr>
+      <w:r>
+        <w:t xml:space="preserve">Tiramos a borda do botão </w:t>
+      </w:r>
+    </w:p>
+    <w:p>
+      <w:pPr>
+        <w:pStyle w:val="PargrafodaLista"/>
+        <w:numPr>
+          <w:ilvl w:val="0"/>
+          <w:numId w:val="3"/>
+        </w:numPr>
+        <w:tabs>
+          <w:tab w:val="left" w:pos="3105"/>
+        </w:tabs>
+      </w:pPr>
+      <w:r>
+        <w:t xml:space="preserve">E arredondamos os cantos </w:t>
+      </w:r>
+      <w:r>
+        <w:t xml:space="preserve"> </w:t>
+      </w:r>
+      <w:bookmarkStart w:id="0" w:name="_GoBack"/>
+      <w:bookmarkEnd w:id="0"/>
+      <w:r>
+        <w:t xml:space="preserve"> </w:t>
+      </w:r>
+    </w:p>
+    <w:p>
+      <w:pPr>
+        <w:tabs>
+          <w:tab w:val="left" w:pos="3105"/>
+        </w:tabs>
+      </w:pPr>
+      <w:r>
+        <w:rPr>
+          <w:noProof/>
+        </w:rPr>
+        <w:drawing>
+          <wp:inline distT="0" distB="0" distL="0" distR="0" wp14:anchorId="32CB67AF">
+            <wp:extent cx="2066925" cy="1619250"/>
+            <wp:effectExtent l="0" t="0" r="9525" b="0"/>
+            <wp:docPr id="127" name="Imagem 127"/>
+            <wp:cNvGraphicFramePr>
+              <a:graphicFrameLocks xmlns:a="http://schemas.openxmlformats.org/drawingml/2006/main" noChangeAspect="1"/>
+            </wp:cNvGraphicFramePr>
+            <a:graphic xmlns:a="http://schemas.openxmlformats.org/drawingml/2006/main">
+              <a:graphicData uri="http://schemas.openxmlformats.org/drawingml/2006/picture">
+                <pic:pic xmlns:pic="http://schemas.openxmlformats.org/drawingml/2006/picture">
+                  <pic:nvPicPr>
+                    <pic:cNvPr id="0" name="Picture 12"/>
+                    <pic:cNvPicPr>
+                      <a:picLocks noChangeAspect="1" noChangeArrowheads="1"/>
+                    </pic:cNvPicPr>
+                  </pic:nvPicPr>
+                  <pic:blipFill>
+                    <a:blip r:embed="rId134">
+                      <a:extLst>
+                        <a:ext uri="{28A0092B-C50C-407E-A947-70E740481C1C}">
+                          <a14:useLocalDpi xmlns:a14="http://schemas.microsoft.com/office/drawing/2010/main" val="0"/>
+                        </a:ext>
+                      </a:extLst>
+                    </a:blip>
+                    <a:srcRect/>
+                    <a:stretch>
+                      <a:fillRect/>
+                    </a:stretch>
+                  </pic:blipFill>
+                  <pic:spPr bwMode="auto">
+                    <a:xfrm>
+                      <a:off x="0" y="0"/>
+                      <a:ext cx="2066925" cy="1619250"/>
+                    </a:xfrm>
+                    <a:prstGeom prst="rect">
+                      <a:avLst/>
+                    </a:prstGeom>
+                    <a:noFill/>
+                  </pic:spPr>
+                </pic:pic>
+              </a:graphicData>
+            </a:graphic>
+          </wp:inline>
+        </w:drawing>
+      </w:r>
     </w:p>
     <w:p>
       <w:pPr>
@@ -10225,7 +11376,7 @@
 </file>
 
 <file path=customXml/itemProps1.xml><?xml version="1.0" encoding="utf-8"?>
-<ds:datastoreItem xmlns:ds="http://schemas.openxmlformats.org/officeDocument/2006/customXml" ds:itemID="{57D99763-F5ED-4A8F-93FE-259487A83514}">
+<ds:datastoreItem xmlns:ds="http://schemas.openxmlformats.org/officeDocument/2006/customXml" ds:itemID="{A25E8060-80C4-4D9F-9D27-6C0704809BE8}">
   <ds:schemaRefs>
     <ds:schemaRef ds:uri="http://schemas.openxmlformats.org/officeDocument/2006/bibliography"/>
   </ds:schemaRefs>

</xml_diff>

<commit_message>
atualização da aula 28/09/2026
</commit_message>
<xml_diff>
--- a/apostila/Projeto Space For Men.docx
+++ b/apostila/Projeto Space For Men.docx
@@ -10173,6 +10173,9 @@
         <w:t xml:space="preserve">  </w:t>
       </w:r>
       <w:r>
+        <w:rPr>
+          <w:noProof/>
+        </w:rPr>
         <w:drawing>
           <wp:inline distT="0" distB="0" distL="0" distR="0" wp14:anchorId="055CFEF2" wp14:editId="63605342">
             <wp:extent cx="2838846" cy="2695951"/>
@@ -10371,6 +10374,9 @@
         </w:tabs>
       </w:pPr>
       <w:r>
+        <w:rPr>
+          <w:noProof/>
+        </w:rPr>
         <w:drawing>
           <wp:inline distT="0" distB="0" distL="0" distR="0" wp14:anchorId="20CC94F5" wp14:editId="164E55B0">
             <wp:extent cx="1324160" cy="4629796"/>
@@ -10535,7 +10541,15 @@
       </w:r>
       <w:proofErr w:type="spellEnd"/>
       <w:r>
-        <w:t xml:space="preserve"> do header que o nosso menu que já se encontrava pronto na outra pagina e o </w:t>
+        <w:t xml:space="preserve"> do header que o nosso menu que já se encontrava pronto na outra </w:t>
+      </w:r>
+      <w:proofErr w:type="spellStart"/>
+      <w:r>
+        <w:t>pagina</w:t>
+      </w:r>
+      <w:proofErr w:type="spellEnd"/>
+      <w:r>
+        <w:t xml:space="preserve"> e o </w:t>
       </w:r>
       <w:proofErr w:type="spellStart"/>
       <w:r>
@@ -10561,6 +10575,9 @@
         </w:tabs>
       </w:pPr>
       <w:r>
+        <w:rPr>
+          <w:noProof/>
+        </w:rPr>
         <w:drawing>
           <wp:inline distT="0" distB="0" distL="0" distR="0" wp14:anchorId="01497331" wp14:editId="76D87C56">
             <wp:extent cx="3943900" cy="1562318"/>
@@ -10661,8 +10678,1875 @@
           <w:tab w:val="left" w:pos="3105"/>
         </w:tabs>
       </w:pPr>
+      <w:r>
+        <w:t>84- Aumentamos a largura da imagem do banner para ocupar 100</w:t>
+      </w:r>
+      <w:r>
+        <w:t xml:space="preserve">% de espaço na pagina e centralizamos no meio demos uma largura para o </w:t>
+      </w:r>
+      <w:proofErr w:type="spellStart"/>
+      <w:r>
+        <w:t>main</w:t>
+      </w:r>
+      <w:proofErr w:type="spellEnd"/>
+      <w:r>
+        <w:t xml:space="preserve"> e centralizamos o conteúdo dentro dele</w:t>
+      </w:r>
+    </w:p>
+    <w:p>
+      <w:pPr>
+        <w:tabs>
+          <w:tab w:val="left" w:pos="3105"/>
+        </w:tabs>
+      </w:pPr>
+      <w:r>
+        <w:rPr>
+          <w:noProof/>
+        </w:rPr>
+        <w:drawing>
+          <wp:inline distT="0" distB="0" distL="0" distR="0" wp14:anchorId="71FFC269" wp14:editId="4A116AF0">
+            <wp:extent cx="1400370" cy="1810003"/>
+            <wp:effectExtent l="0" t="0" r="0" b="0"/>
+            <wp:docPr id="133" name="Imagem 133"/>
+            <wp:cNvGraphicFramePr>
+              <a:graphicFrameLocks xmlns:a="http://schemas.openxmlformats.org/drawingml/2006/main" noChangeAspect="1"/>
+            </wp:cNvGraphicFramePr>
+            <a:graphic xmlns:a="http://schemas.openxmlformats.org/drawingml/2006/main">
+              <a:graphicData uri="http://schemas.openxmlformats.org/drawingml/2006/picture">
+                <pic:pic xmlns:pic="http://schemas.openxmlformats.org/drawingml/2006/picture">
+                  <pic:nvPicPr>
+                    <pic:cNvPr id="1" name=""/>
+                    <pic:cNvPicPr/>
+                  </pic:nvPicPr>
+                  <pic:blipFill>
+                    <a:blip r:embed="rId141"/>
+                    <a:stretch>
+                      <a:fillRect/>
+                    </a:stretch>
+                  </pic:blipFill>
+                  <pic:spPr>
+                    <a:xfrm>
+                      <a:off x="0" y="0"/>
+                      <a:ext cx="1400370" cy="1810003"/>
+                    </a:xfrm>
+                    <a:prstGeom prst="rect">
+                      <a:avLst/>
+                    </a:prstGeom>
+                  </pic:spPr>
+                </pic:pic>
+              </a:graphicData>
+            </a:graphic>
+          </wp:inline>
+        </w:drawing>
+      </w:r>
+    </w:p>
+    <w:p>
+      <w:pPr>
+        <w:tabs>
+          <w:tab w:val="left" w:pos="3105"/>
+        </w:tabs>
+      </w:pPr>
+    </w:p>
+    <w:p>
+      <w:pPr>
+        <w:tabs>
+          <w:tab w:val="left" w:pos="3105"/>
+        </w:tabs>
+      </w:pPr>
+    </w:p>
+    <w:p>
+      <w:pPr>
+        <w:tabs>
+          <w:tab w:val="left" w:pos="3105"/>
+        </w:tabs>
+      </w:pPr>
+    </w:p>
+    <w:p>
+      <w:pPr>
+        <w:tabs>
+          <w:tab w:val="left" w:pos="3105"/>
+        </w:tabs>
+      </w:pPr>
+      <w:r>
+        <w:t xml:space="preserve">85- Na pagina do index.html trocamos as </w:t>
+      </w:r>
+      <w:proofErr w:type="spellStart"/>
+      <w:r>
+        <w:t>divs</w:t>
+      </w:r>
+      <w:proofErr w:type="spellEnd"/>
+      <w:r>
+        <w:t xml:space="preserve"> por </w:t>
+      </w:r>
+      <w:proofErr w:type="spellStart"/>
+      <w:r>
+        <w:t>section</w:t>
+      </w:r>
+      <w:proofErr w:type="spellEnd"/>
+      <w:r>
+        <w:t xml:space="preserve"> a diferença entre </w:t>
+      </w:r>
+      <w:proofErr w:type="spellStart"/>
+      <w:r>
+        <w:t>div</w:t>
+      </w:r>
+      <w:proofErr w:type="spellEnd"/>
+      <w:r>
+        <w:t xml:space="preserve"> e </w:t>
+      </w:r>
+      <w:proofErr w:type="spellStart"/>
+      <w:r>
+        <w:t>section</w:t>
+      </w:r>
+      <w:proofErr w:type="spellEnd"/>
+      <w:r>
+        <w:t xml:space="preserve"> é que a </w:t>
+      </w:r>
+      <w:proofErr w:type="spellStart"/>
+      <w:r>
+        <w:t>div</w:t>
+      </w:r>
+      <w:proofErr w:type="spellEnd"/>
+      <w:r>
+        <w:t xml:space="preserve"> geralmente é usada para conteúdo visual dentro dela e não necessariamente são correspondentes ao mesmo assunto </w:t>
+      </w:r>
+    </w:p>
+    <w:p>
+      <w:pPr>
+        <w:tabs>
+          <w:tab w:val="left" w:pos="3105"/>
+        </w:tabs>
+      </w:pPr>
+      <w:r>
+        <w:t xml:space="preserve">Ao </w:t>
+      </w:r>
+      <w:proofErr w:type="spellStart"/>
+      <w:r>
+        <w:t>contrario</w:t>
+      </w:r>
+      <w:proofErr w:type="spellEnd"/>
+      <w:r>
+        <w:t xml:space="preserve"> da </w:t>
+      </w:r>
+      <w:proofErr w:type="spellStart"/>
+      <w:r>
+        <w:t>div</w:t>
+      </w:r>
+      <w:proofErr w:type="spellEnd"/>
+      <w:r>
+        <w:t xml:space="preserve"> o </w:t>
+      </w:r>
+      <w:proofErr w:type="spellStart"/>
+      <w:r>
+        <w:t>section</w:t>
+      </w:r>
+      <w:proofErr w:type="spellEnd"/>
+      <w:r>
+        <w:t xml:space="preserve"> cria uma divisão na pagina em que o conteúdo interno </w:t>
+      </w:r>
+      <w:proofErr w:type="gramStart"/>
+      <w:r>
+        <w:t>esta</w:t>
+      </w:r>
+      <w:proofErr w:type="gramEnd"/>
+      <w:r>
+        <w:t xml:space="preserve"> relacionado e um único tema ou seja ao mesmo assunto então por motivo trocamos </w:t>
+      </w:r>
+      <w:proofErr w:type="spellStart"/>
+      <w:r>
+        <w:t>div</w:t>
+      </w:r>
+      <w:proofErr w:type="spellEnd"/>
+      <w:r>
+        <w:t xml:space="preserve"> por </w:t>
+      </w:r>
+      <w:proofErr w:type="spellStart"/>
+      <w:r>
+        <w:t>section</w:t>
+      </w:r>
+      <w:proofErr w:type="spellEnd"/>
+      <w:r>
+        <w:t xml:space="preserve"> e o </w:t>
+      </w:r>
+      <w:proofErr w:type="spellStart"/>
+      <w:r>
+        <w:t>div</w:t>
+      </w:r>
+      <w:proofErr w:type="spellEnd"/>
+      <w:r>
+        <w:t xml:space="preserve"> benefícios </w:t>
+      </w:r>
+    </w:p>
+    <w:p>
+      <w:pPr>
+        <w:tabs>
+          <w:tab w:val="left" w:pos="3105"/>
+        </w:tabs>
+      </w:pPr>
+      <w:r>
+        <w:rPr>
+          <w:noProof/>
+        </w:rPr>
+        <w:drawing>
+          <wp:inline distT="0" distB="0" distL="0" distR="0" wp14:anchorId="33BFDEC5">
+            <wp:extent cx="2028825" cy="209550"/>
+            <wp:effectExtent l="0" t="0" r="9525" b="0"/>
+            <wp:docPr id="134" name="Imagem 134"/>
+            <wp:cNvGraphicFramePr>
+              <a:graphicFrameLocks xmlns:a="http://schemas.openxmlformats.org/drawingml/2006/main" noChangeAspect="1"/>
+            </wp:cNvGraphicFramePr>
+            <a:graphic xmlns:a="http://schemas.openxmlformats.org/drawingml/2006/main">
+              <a:graphicData uri="http://schemas.openxmlformats.org/drawingml/2006/picture">
+                <pic:pic xmlns:pic="http://schemas.openxmlformats.org/drawingml/2006/picture">
+                  <pic:nvPicPr>
+                    <pic:cNvPr id="0" name="Picture 2"/>
+                    <pic:cNvPicPr>
+                      <a:picLocks noChangeAspect="1" noChangeArrowheads="1"/>
+                    </pic:cNvPicPr>
+                  </pic:nvPicPr>
+                  <pic:blipFill>
+                    <a:blip r:embed="rId142">
+                      <a:extLst>
+                        <a:ext uri="{28A0092B-C50C-407E-A947-70E740481C1C}">
+                          <a14:useLocalDpi xmlns:a14="http://schemas.microsoft.com/office/drawing/2010/main" val="0"/>
+                        </a:ext>
+                      </a:extLst>
+                    </a:blip>
+                    <a:srcRect/>
+                    <a:stretch>
+                      <a:fillRect/>
+                    </a:stretch>
+                  </pic:blipFill>
+                  <pic:spPr bwMode="auto">
+                    <a:xfrm>
+                      <a:off x="0" y="0"/>
+                      <a:ext cx="2028825" cy="209550"/>
+                    </a:xfrm>
+                    <a:prstGeom prst="rect">
+                      <a:avLst/>
+                    </a:prstGeom>
+                    <a:noFill/>
+                  </pic:spPr>
+                </pic:pic>
+              </a:graphicData>
+            </a:graphic>
+          </wp:inline>
+        </w:drawing>
+      </w:r>
+      <w:r>
+        <w:rPr>
+          <w:noProof/>
+        </w:rPr>
+        <w:drawing>
+          <wp:inline distT="0" distB="0" distL="0" distR="0" wp14:anchorId="6E12AA28">
+            <wp:extent cx="1819275" cy="247650"/>
+            <wp:effectExtent l="0" t="0" r="9525" b="0"/>
+            <wp:docPr id="135" name="Imagem 135"/>
+            <wp:cNvGraphicFramePr>
+              <a:graphicFrameLocks xmlns:a="http://schemas.openxmlformats.org/drawingml/2006/main" noChangeAspect="1"/>
+            </wp:cNvGraphicFramePr>
+            <a:graphic xmlns:a="http://schemas.openxmlformats.org/drawingml/2006/main">
+              <a:graphicData uri="http://schemas.openxmlformats.org/drawingml/2006/picture">
+                <pic:pic xmlns:pic="http://schemas.openxmlformats.org/drawingml/2006/picture">
+                  <pic:nvPicPr>
+                    <pic:cNvPr id="0" name="Picture 3"/>
+                    <pic:cNvPicPr>
+                      <a:picLocks noChangeAspect="1" noChangeArrowheads="1"/>
+                    </pic:cNvPicPr>
+                  </pic:nvPicPr>
+                  <pic:blipFill>
+                    <a:blip r:embed="rId143">
+                      <a:extLst>
+                        <a:ext uri="{28A0092B-C50C-407E-A947-70E740481C1C}">
+                          <a14:useLocalDpi xmlns:a14="http://schemas.microsoft.com/office/drawing/2010/main" val="0"/>
+                        </a:ext>
+                      </a:extLst>
+                    </a:blip>
+                    <a:srcRect/>
+                    <a:stretch>
+                      <a:fillRect/>
+                    </a:stretch>
+                  </pic:blipFill>
+                  <pic:spPr bwMode="auto">
+                    <a:xfrm>
+                      <a:off x="0" y="0"/>
+                      <a:ext cx="1819275" cy="247650"/>
+                    </a:xfrm>
+                    <a:prstGeom prst="rect">
+                      <a:avLst/>
+                    </a:prstGeom>
+                    <a:noFill/>
+                  </pic:spPr>
+                </pic:pic>
+              </a:graphicData>
+            </a:graphic>
+          </wp:inline>
+        </w:drawing>
+      </w:r>
+    </w:p>
+    <w:p>
+      <w:pPr>
+        <w:tabs>
+          <w:tab w:val="left" w:pos="3105"/>
+        </w:tabs>
+      </w:pPr>
+      <w:r>
+        <w:t xml:space="preserve">86- Adicionamos a </w:t>
+      </w:r>
+      <w:proofErr w:type="spellStart"/>
+      <w:r>
+        <w:t>class</w:t>
+      </w:r>
+      <w:proofErr w:type="spellEnd"/>
+      <w:r>
+        <w:t xml:space="preserve"> </w:t>
+      </w:r>
+      <w:proofErr w:type="spellStart"/>
+      <w:r>
+        <w:t>titulo</w:t>
+      </w:r>
+      <w:proofErr w:type="spellEnd"/>
+      <w:r>
+        <w:t>-</w:t>
+      </w:r>
+      <w:proofErr w:type="spellStart"/>
+      <w:r>
+        <w:t>Princinal</w:t>
+      </w:r>
+      <w:proofErr w:type="spellEnd"/>
+      <w:r>
+        <w:t xml:space="preserve"> no h2 e h3 na nossa pagina centralizando </w:t>
+      </w:r>
+      <w:proofErr w:type="gramStart"/>
+      <w:r>
+        <w:t>os  subtítulos</w:t>
+      </w:r>
+      <w:proofErr w:type="gramEnd"/>
+      <w:r>
+        <w:t xml:space="preserve"> e aumentando o tamanho da fonte utilizando a medida (em) que significa um em é igual a medida padrão do navegado 2em é o dobro da medida padrão e assim por diante ao  utilizamos.</w:t>
+      </w:r>
+    </w:p>
+    <w:p>
+      <w:pPr>
+        <w:tabs>
+          <w:tab w:val="left" w:pos="3105"/>
+        </w:tabs>
+      </w:pPr>
+      <w:r>
+        <w:t xml:space="preserve">E para finalizar colocamos um espaço externo para baixo de 1em </w:t>
+      </w:r>
+      <w:proofErr w:type="spellStart"/>
+      <w:r>
+        <w:t>próximadamente</w:t>
+      </w:r>
+      <w:proofErr w:type="spellEnd"/>
+      <w:r>
+        <w:t xml:space="preserve"> 16px com </w:t>
+      </w:r>
+      <w:proofErr w:type="spellStart"/>
+      <w:r>
+        <w:t>margin</w:t>
+      </w:r>
+      <w:proofErr w:type="spellEnd"/>
+      <w:r>
+        <w:t xml:space="preserve"> 0 0 1em</w:t>
+      </w:r>
+    </w:p>
+    <w:p>
+      <w:pPr>
+        <w:tabs>
+          <w:tab w:val="left" w:pos="3105"/>
+        </w:tabs>
+      </w:pPr>
+    </w:p>
+    <w:p>
+      <w:pPr>
+        <w:tabs>
+          <w:tab w:val="left" w:pos="3105"/>
+        </w:tabs>
+      </w:pPr>
+      <w:r>
+        <w:rPr>
+          <w:noProof/>
+        </w:rPr>
+        <w:drawing>
+          <wp:inline distT="0" distB="0" distL="0" distR="0" wp14:anchorId="72BBD738">
+            <wp:extent cx="1343025" cy="923925"/>
+            <wp:effectExtent l="0" t="0" r="9525" b="9525"/>
+            <wp:docPr id="136" name="Imagem 136"/>
+            <wp:cNvGraphicFramePr>
+              <a:graphicFrameLocks xmlns:a="http://schemas.openxmlformats.org/drawingml/2006/main" noChangeAspect="1"/>
+            </wp:cNvGraphicFramePr>
+            <a:graphic xmlns:a="http://schemas.openxmlformats.org/drawingml/2006/main">
+              <a:graphicData uri="http://schemas.openxmlformats.org/drawingml/2006/picture">
+                <pic:pic xmlns:pic="http://schemas.openxmlformats.org/drawingml/2006/picture">
+                  <pic:nvPicPr>
+                    <pic:cNvPr id="0" name="Picture 4"/>
+                    <pic:cNvPicPr>
+                      <a:picLocks noChangeAspect="1" noChangeArrowheads="1"/>
+                    </pic:cNvPicPr>
+                  </pic:nvPicPr>
+                  <pic:blipFill>
+                    <a:blip r:embed="rId144">
+                      <a:extLst>
+                        <a:ext uri="{28A0092B-C50C-407E-A947-70E740481C1C}">
+                          <a14:useLocalDpi xmlns:a14="http://schemas.microsoft.com/office/drawing/2010/main" val="0"/>
+                        </a:ext>
+                      </a:extLst>
+                    </a:blip>
+                    <a:srcRect/>
+                    <a:stretch>
+                      <a:fillRect/>
+                    </a:stretch>
+                  </pic:blipFill>
+                  <pic:spPr bwMode="auto">
+                    <a:xfrm>
+                      <a:off x="0" y="0"/>
+                      <a:ext cx="1343025" cy="923925"/>
+                    </a:xfrm>
+                    <a:prstGeom prst="rect">
+                      <a:avLst/>
+                    </a:prstGeom>
+                    <a:noFill/>
+                  </pic:spPr>
+                </pic:pic>
+              </a:graphicData>
+            </a:graphic>
+          </wp:inline>
+        </w:drawing>
+      </w:r>
+    </w:p>
+    <w:p>
+      <w:pPr>
+        <w:tabs>
+          <w:tab w:val="left" w:pos="3105"/>
+        </w:tabs>
+      </w:pPr>
+    </w:p>
+    <w:p>
+      <w:pPr>
+        <w:tabs>
+          <w:tab w:val="left" w:pos="3105"/>
+        </w:tabs>
+      </w:pPr>
+      <w:r>
+        <w:t xml:space="preserve">87- </w:t>
+      </w:r>
+      <w:r>
+        <w:t xml:space="preserve">Para colocar um espaço entre os parágrafos da nossa seção principal utilizamos o seguinte código </w:t>
+      </w:r>
+    </w:p>
+    <w:p>
+      <w:pPr>
+        <w:tabs>
+          <w:tab w:val="left" w:pos="3105"/>
+        </w:tabs>
+      </w:pPr>
+      <w:r>
+        <w:rPr>
+          <w:noProof/>
+        </w:rPr>
+        <w:drawing>
+          <wp:inline distT="0" distB="0" distL="0" distR="0" wp14:anchorId="1D17C221">
+            <wp:extent cx="1381125" cy="533400"/>
+            <wp:effectExtent l="0" t="0" r="9525" b="0"/>
+            <wp:docPr id="137" name="Imagem 137"/>
+            <wp:cNvGraphicFramePr>
+              <a:graphicFrameLocks xmlns:a="http://schemas.openxmlformats.org/drawingml/2006/main" noChangeAspect="1"/>
+            </wp:cNvGraphicFramePr>
+            <a:graphic xmlns:a="http://schemas.openxmlformats.org/drawingml/2006/main">
+              <a:graphicData uri="http://schemas.openxmlformats.org/drawingml/2006/picture">
+                <pic:pic xmlns:pic="http://schemas.openxmlformats.org/drawingml/2006/picture">
+                  <pic:nvPicPr>
+                    <pic:cNvPr id="0" name="Picture 5"/>
+                    <pic:cNvPicPr>
+                      <a:picLocks noChangeAspect="1" noChangeArrowheads="1"/>
+                    </pic:cNvPicPr>
+                  </pic:nvPicPr>
+                  <pic:blipFill>
+                    <a:blip r:embed="rId145">
+                      <a:extLst>
+                        <a:ext uri="{28A0092B-C50C-407E-A947-70E740481C1C}">
+                          <a14:useLocalDpi xmlns:a14="http://schemas.microsoft.com/office/drawing/2010/main" val="0"/>
+                        </a:ext>
+                      </a:extLst>
+                    </a:blip>
+                    <a:srcRect/>
+                    <a:stretch>
+                      <a:fillRect/>
+                    </a:stretch>
+                  </pic:blipFill>
+                  <pic:spPr bwMode="auto">
+                    <a:xfrm>
+                      <a:off x="0" y="0"/>
+                      <a:ext cx="1381125" cy="533400"/>
+                    </a:xfrm>
+                    <a:prstGeom prst="rect">
+                      <a:avLst/>
+                    </a:prstGeom>
+                    <a:noFill/>
+                  </pic:spPr>
+                </pic:pic>
+              </a:graphicData>
+            </a:graphic>
+          </wp:inline>
+        </w:drawing>
+      </w:r>
+    </w:p>
+    <w:p>
+      <w:pPr>
+        <w:tabs>
+          <w:tab w:val="left" w:pos="3105"/>
+        </w:tabs>
+      </w:pPr>
+    </w:p>
+    <w:p>
+      <w:pPr>
+        <w:tabs>
+          <w:tab w:val="left" w:pos="3105"/>
+        </w:tabs>
+      </w:pPr>
+      <w:r>
+        <w:t xml:space="preserve">88- </w:t>
+      </w:r>
+      <w:proofErr w:type="gramStart"/>
+      <w:r>
+        <w:t>utilizando</w:t>
+      </w:r>
+      <w:proofErr w:type="gramEnd"/>
+      <w:r>
+        <w:t xml:space="preserve"> o </w:t>
+      </w:r>
+      <w:proofErr w:type="spellStart"/>
+      <w:r>
+        <w:t>css</w:t>
+      </w:r>
+      <w:proofErr w:type="spellEnd"/>
+      <w:r>
+        <w:t xml:space="preserve"> como </w:t>
+      </w:r>
+      <w:proofErr w:type="spellStart"/>
+      <w:r>
+        <w:t>referencia</w:t>
+      </w:r>
+      <w:proofErr w:type="spellEnd"/>
+      <w:r>
+        <w:t xml:space="preserve"> para aplicar as propriedades usamos os seguintes código </w:t>
+      </w:r>
+    </w:p>
+    <w:p>
+      <w:pPr>
+        <w:pStyle w:val="PargrafodaLista"/>
+        <w:numPr>
+          <w:ilvl w:val="0"/>
+          <w:numId w:val="3"/>
+        </w:numPr>
+        <w:tabs>
+          <w:tab w:val="left" w:pos="3105"/>
+        </w:tabs>
+      </w:pPr>
+      <w:r>
+        <w:t xml:space="preserve">Encorpamos o texto </w:t>
+      </w:r>
+      <w:r>
+        <w:t xml:space="preserve">deixando em negrito </w:t>
+      </w:r>
+      <w:proofErr w:type="gramStart"/>
+      <w:r>
+        <w:t>(.principal</w:t>
+      </w:r>
+      <w:proofErr w:type="gramEnd"/>
+      <w:r>
+        <w:t xml:space="preserve"> Strong)</w:t>
+      </w:r>
+    </w:p>
+    <w:p>
+      <w:pPr>
+        <w:pStyle w:val="PargrafodaLista"/>
+        <w:numPr>
+          <w:ilvl w:val="0"/>
+          <w:numId w:val="3"/>
+        </w:numPr>
+        <w:tabs>
+          <w:tab w:val="left" w:pos="3105"/>
+        </w:tabs>
+      </w:pPr>
+      <w:r>
+        <w:t xml:space="preserve">Deixando o texto em </w:t>
+      </w:r>
+      <w:proofErr w:type="spellStart"/>
+      <w:r>
+        <w:t>italic</w:t>
+      </w:r>
+      <w:proofErr w:type="spellEnd"/>
+      <w:r>
+        <w:t xml:space="preserve"> </w:t>
+      </w:r>
+      <w:proofErr w:type="gramStart"/>
+      <w:r>
+        <w:t>(.</w:t>
+      </w:r>
+      <w:proofErr w:type="spellStart"/>
+      <w:r>
+        <w:t>pricipal</w:t>
+      </w:r>
+      <w:proofErr w:type="spellEnd"/>
+      <w:proofErr w:type="gramEnd"/>
+      <w:r>
+        <w:t xml:space="preserve"> em)</w:t>
+      </w:r>
+    </w:p>
+    <w:p>
+      <w:pPr>
+        <w:tabs>
+          <w:tab w:val="left" w:pos="3105"/>
+        </w:tabs>
+        <w:ind w:left="720"/>
+      </w:pPr>
+      <w:r>
+        <w:rPr>
+          <w:noProof/>
+        </w:rPr>
+        <w:drawing>
+          <wp:inline distT="0" distB="0" distL="0" distR="0" wp14:anchorId="075BB2E2">
+            <wp:extent cx="1533525" cy="1171575"/>
+            <wp:effectExtent l="0" t="0" r="9525" b="9525"/>
+            <wp:docPr id="138" name="Imagem 138"/>
+            <wp:cNvGraphicFramePr>
+              <a:graphicFrameLocks xmlns:a="http://schemas.openxmlformats.org/drawingml/2006/main" noChangeAspect="1"/>
+            </wp:cNvGraphicFramePr>
+            <a:graphic xmlns:a="http://schemas.openxmlformats.org/drawingml/2006/main">
+              <a:graphicData uri="http://schemas.openxmlformats.org/drawingml/2006/picture">
+                <pic:pic xmlns:pic="http://schemas.openxmlformats.org/drawingml/2006/picture">
+                  <pic:nvPicPr>
+                    <pic:cNvPr id="0" name="Picture 6"/>
+                    <pic:cNvPicPr>
+                      <a:picLocks noChangeAspect="1" noChangeArrowheads="1"/>
+                    </pic:cNvPicPr>
+                  </pic:nvPicPr>
+                  <pic:blipFill>
+                    <a:blip r:embed="rId146">
+                      <a:extLst>
+                        <a:ext uri="{28A0092B-C50C-407E-A947-70E740481C1C}">
+                          <a14:useLocalDpi xmlns:a14="http://schemas.microsoft.com/office/drawing/2010/main" val="0"/>
+                        </a:ext>
+                      </a:extLst>
+                    </a:blip>
+                    <a:srcRect/>
+                    <a:stretch>
+                      <a:fillRect/>
+                    </a:stretch>
+                  </pic:blipFill>
+                  <pic:spPr bwMode="auto">
+                    <a:xfrm>
+                      <a:off x="0" y="0"/>
+                      <a:ext cx="1533525" cy="1171575"/>
+                    </a:xfrm>
+                    <a:prstGeom prst="rect">
+                      <a:avLst/>
+                    </a:prstGeom>
+                    <a:noFill/>
+                  </pic:spPr>
+                </pic:pic>
+              </a:graphicData>
+            </a:graphic>
+          </wp:inline>
+        </w:drawing>
+      </w:r>
+      <w:r>
+        <w:rPr>
+          <w:noProof/>
+        </w:rPr>
+        <w:drawing>
+          <wp:inline distT="0" distB="0" distL="0" distR="0" wp14:anchorId="0DC09F13">
+            <wp:extent cx="5773420" cy="1476518"/>
+            <wp:effectExtent l="0" t="0" r="0" b="9525"/>
+            <wp:docPr id="139" name="Imagem 139"/>
+            <wp:cNvGraphicFramePr>
+              <a:graphicFrameLocks xmlns:a="http://schemas.openxmlformats.org/drawingml/2006/main" noChangeAspect="1"/>
+            </wp:cNvGraphicFramePr>
+            <a:graphic xmlns:a="http://schemas.openxmlformats.org/drawingml/2006/main">
+              <a:graphicData uri="http://schemas.openxmlformats.org/drawingml/2006/picture">
+                <pic:pic xmlns:pic="http://schemas.openxmlformats.org/drawingml/2006/picture">
+                  <pic:nvPicPr>
+                    <pic:cNvPr id="0" name="Picture 7"/>
+                    <pic:cNvPicPr>
+                      <a:picLocks noChangeAspect="1" noChangeArrowheads="1"/>
+                    </pic:cNvPicPr>
+                  </pic:nvPicPr>
+                  <pic:blipFill>
+                    <a:blip r:embed="rId147">
+                      <a:extLst>
+                        <a:ext uri="{28A0092B-C50C-407E-A947-70E740481C1C}">
+                          <a14:useLocalDpi xmlns:a14="http://schemas.microsoft.com/office/drawing/2010/main" val="0"/>
+                        </a:ext>
+                      </a:extLst>
+                    </a:blip>
+                    <a:srcRect/>
+                    <a:stretch>
+                      <a:fillRect/>
+                    </a:stretch>
+                  </pic:blipFill>
+                  <pic:spPr bwMode="auto">
+                    <a:xfrm>
+                      <a:off x="0" y="0"/>
+                      <a:ext cx="5799226" cy="1483118"/>
+                    </a:xfrm>
+                    <a:prstGeom prst="rect">
+                      <a:avLst/>
+                    </a:prstGeom>
+                    <a:noFill/>
+                  </pic:spPr>
+                </pic:pic>
+              </a:graphicData>
+            </a:graphic>
+          </wp:inline>
+        </w:drawing>
+      </w:r>
+    </w:p>
+    <w:p>
+      <w:pPr>
+        <w:tabs>
+          <w:tab w:val="left" w:pos="3105"/>
+        </w:tabs>
+        <w:ind w:left="720"/>
+      </w:pPr>
+      <w:r>
+        <w:rPr>
+          <w:noProof/>
+        </w:rPr>
+        <w:drawing>
+          <wp:inline distT="0" distB="0" distL="0" distR="0" wp14:anchorId="53FBF585">
+            <wp:extent cx="3296285" cy="180975"/>
+            <wp:effectExtent l="0" t="0" r="0" b="9525"/>
+            <wp:docPr id="140" name="Imagem 140"/>
+            <wp:cNvGraphicFramePr>
+              <a:graphicFrameLocks xmlns:a="http://schemas.openxmlformats.org/drawingml/2006/main" noChangeAspect="1"/>
+            </wp:cNvGraphicFramePr>
+            <a:graphic xmlns:a="http://schemas.openxmlformats.org/drawingml/2006/main">
+              <a:graphicData uri="http://schemas.openxmlformats.org/drawingml/2006/picture">
+                <pic:pic xmlns:pic="http://schemas.openxmlformats.org/drawingml/2006/picture">
+                  <pic:nvPicPr>
+                    <pic:cNvPr id="0" name="Picture 8"/>
+                    <pic:cNvPicPr>
+                      <a:picLocks noChangeAspect="1" noChangeArrowheads="1"/>
+                    </pic:cNvPicPr>
+                  </pic:nvPicPr>
+                  <pic:blipFill>
+                    <a:blip r:embed="rId148">
+                      <a:extLst>
+                        <a:ext uri="{28A0092B-C50C-407E-A947-70E740481C1C}">
+                          <a14:useLocalDpi xmlns:a14="http://schemas.microsoft.com/office/drawing/2010/main" val="0"/>
+                        </a:ext>
+                      </a:extLst>
+                    </a:blip>
+                    <a:srcRect/>
+                    <a:stretch>
+                      <a:fillRect/>
+                    </a:stretch>
+                  </pic:blipFill>
+                  <pic:spPr bwMode="auto">
+                    <a:xfrm>
+                      <a:off x="0" y="0"/>
+                      <a:ext cx="3296285" cy="180975"/>
+                    </a:xfrm>
+                    <a:prstGeom prst="rect">
+                      <a:avLst/>
+                    </a:prstGeom>
+                    <a:noFill/>
+                  </pic:spPr>
+                </pic:pic>
+              </a:graphicData>
+            </a:graphic>
+          </wp:inline>
+        </w:drawing>
+      </w:r>
+    </w:p>
+    <w:p>
+      <w:pPr>
+        <w:tabs>
+          <w:tab w:val="left" w:pos="3105"/>
+        </w:tabs>
+        <w:ind w:left="720"/>
+      </w:pPr>
+    </w:p>
+    <w:p>
+      <w:pPr>
+        <w:tabs>
+          <w:tab w:val="left" w:pos="3105"/>
+        </w:tabs>
+        <w:ind w:left="720"/>
+      </w:pPr>
+    </w:p>
+    <w:p>
+      <w:pPr>
+        <w:tabs>
+          <w:tab w:val="left" w:pos="3105"/>
+        </w:tabs>
+        <w:ind w:left="720"/>
+      </w:pPr>
+      <w:r>
+        <w:t>89- Diminuímos o tamanho da imagem ut</w:t>
+      </w:r>
+      <w:r>
+        <w:t>i</w:t>
+      </w:r>
+      <w:r>
+        <w:t xml:space="preserve">lizando </w:t>
+      </w:r>
+      <w:proofErr w:type="gramStart"/>
+      <w:r>
+        <w:t xml:space="preserve">o </w:t>
+      </w:r>
+      <w:r>
+        <w:t xml:space="preserve"> </w:t>
+      </w:r>
+      <w:r>
+        <w:t>seguinte</w:t>
+      </w:r>
+      <w:proofErr w:type="gramEnd"/>
+      <w:r>
+        <w:t xml:space="preserve"> comando</w:t>
+      </w:r>
+    </w:p>
+    <w:p>
+      <w:pPr>
+        <w:tabs>
+          <w:tab w:val="left" w:pos="3105"/>
+        </w:tabs>
+        <w:ind w:left="720"/>
+      </w:pPr>
+      <w:r>
+        <w:rPr>
+          <w:noProof/>
+        </w:rPr>
+        <w:drawing>
+          <wp:inline distT="0" distB="0" distL="0" distR="0" wp14:anchorId="3AD97A7D">
+            <wp:extent cx="1382891" cy="533400"/>
+            <wp:effectExtent l="0" t="0" r="8255" b="0"/>
+            <wp:docPr id="141" name="Imagem 141"/>
+            <wp:cNvGraphicFramePr>
+              <a:graphicFrameLocks xmlns:a="http://schemas.openxmlformats.org/drawingml/2006/main" noChangeAspect="1"/>
+            </wp:cNvGraphicFramePr>
+            <a:graphic xmlns:a="http://schemas.openxmlformats.org/drawingml/2006/main">
+              <a:graphicData uri="http://schemas.openxmlformats.org/drawingml/2006/picture">
+                <pic:pic xmlns:pic="http://schemas.openxmlformats.org/drawingml/2006/picture">
+                  <pic:nvPicPr>
+                    <pic:cNvPr id="0" name="Picture 9"/>
+                    <pic:cNvPicPr>
+                      <a:picLocks noChangeAspect="1" noChangeArrowheads="1"/>
+                    </pic:cNvPicPr>
+                  </pic:nvPicPr>
+                  <pic:blipFill>
+                    <a:blip r:embed="rId149">
+                      <a:extLst>
+                        <a:ext uri="{28A0092B-C50C-407E-A947-70E740481C1C}">
+                          <a14:useLocalDpi xmlns:a14="http://schemas.microsoft.com/office/drawing/2010/main" val="0"/>
+                        </a:ext>
+                      </a:extLst>
+                    </a:blip>
+                    <a:srcRect/>
+                    <a:stretch>
+                      <a:fillRect/>
+                    </a:stretch>
+                  </pic:blipFill>
+                  <pic:spPr bwMode="auto">
+                    <a:xfrm>
+                      <a:off x="0" y="0"/>
+                      <a:ext cx="1637782" cy="631715"/>
+                    </a:xfrm>
+                    <a:prstGeom prst="rect">
+                      <a:avLst/>
+                    </a:prstGeom>
+                    <a:noFill/>
+                  </pic:spPr>
+                </pic:pic>
+              </a:graphicData>
+            </a:graphic>
+          </wp:inline>
+        </w:drawing>
+      </w:r>
+    </w:p>
+    <w:p>
+      <w:pPr>
+        <w:tabs>
+          <w:tab w:val="left" w:pos="3105"/>
+        </w:tabs>
+        <w:ind w:left="720"/>
+      </w:pPr>
+    </w:p>
+    <w:p>
+      <w:pPr>
+        <w:tabs>
+          <w:tab w:val="left" w:pos="3105"/>
+        </w:tabs>
+        <w:ind w:left="720"/>
+      </w:pPr>
+      <w:r>
+        <w:t xml:space="preserve">90- Inserimos uma imagem no </w:t>
+      </w:r>
+      <w:proofErr w:type="spellStart"/>
+      <w:r>
+        <w:t>section</w:t>
+      </w:r>
+      <w:proofErr w:type="spellEnd"/>
+      <w:r>
+        <w:t xml:space="preserve"> principal logo a baixo do h2 e diminuímos o tamanho dela</w:t>
+      </w:r>
+    </w:p>
+    <w:p>
+      <w:pPr>
+        <w:tabs>
+          <w:tab w:val="left" w:pos="3105"/>
+        </w:tabs>
+        <w:ind w:left="720"/>
+      </w:pPr>
+      <w:r>
+        <w:drawing>
+          <wp:inline distT="0" distB="0" distL="0" distR="0" wp14:anchorId="1A6672BC" wp14:editId="009EB0A7">
+            <wp:extent cx="4477375" cy="600159"/>
+            <wp:effectExtent l="0" t="0" r="0" b="9525"/>
+            <wp:docPr id="144" name="Imagem 144"/>
+            <wp:cNvGraphicFramePr>
+              <a:graphicFrameLocks xmlns:a="http://schemas.openxmlformats.org/drawingml/2006/main" noChangeAspect="1"/>
+            </wp:cNvGraphicFramePr>
+            <a:graphic xmlns:a="http://schemas.openxmlformats.org/drawingml/2006/main">
+              <a:graphicData uri="http://schemas.openxmlformats.org/drawingml/2006/picture">
+                <pic:pic xmlns:pic="http://schemas.openxmlformats.org/drawingml/2006/picture">
+                  <pic:nvPicPr>
+                    <pic:cNvPr id="1" name=""/>
+                    <pic:cNvPicPr/>
+                  </pic:nvPicPr>
+                  <pic:blipFill>
+                    <a:blip r:embed="rId150"/>
+                    <a:stretch>
+                      <a:fillRect/>
+                    </a:stretch>
+                  </pic:blipFill>
+                  <pic:spPr>
+                    <a:xfrm>
+                      <a:off x="0" y="0"/>
+                      <a:ext cx="4477375" cy="600159"/>
+                    </a:xfrm>
+                    <a:prstGeom prst="rect">
+                      <a:avLst/>
+                    </a:prstGeom>
+                  </pic:spPr>
+                </pic:pic>
+              </a:graphicData>
+            </a:graphic>
+          </wp:inline>
+        </w:drawing>
+      </w:r>
+    </w:p>
+    <w:p>
+      <w:pPr>
+        <w:tabs>
+          <w:tab w:val="left" w:pos="3105"/>
+        </w:tabs>
+        <w:ind w:left="720"/>
+      </w:pPr>
+      <w:r>
+        <w:t xml:space="preserve"> </w:t>
+      </w:r>
+      <w:r>
+        <w:tab/>
+      </w:r>
+      <w:r>
+        <w:rPr>
+          <w:noProof/>
+        </w:rPr>
+        <w:drawing>
+          <wp:inline distT="0" distB="0" distL="0" distR="0" wp14:anchorId="598F447E">
+            <wp:extent cx="1114425" cy="542925"/>
+            <wp:effectExtent l="0" t="0" r="9525" b="9525"/>
+            <wp:docPr id="143" name="Imagem 143"/>
+            <wp:cNvGraphicFramePr>
+              <a:graphicFrameLocks xmlns:a="http://schemas.openxmlformats.org/drawingml/2006/main" noChangeAspect="1"/>
+            </wp:cNvGraphicFramePr>
+            <a:graphic xmlns:a="http://schemas.openxmlformats.org/drawingml/2006/main">
+              <a:graphicData uri="http://schemas.openxmlformats.org/drawingml/2006/picture">
+                <pic:pic xmlns:pic="http://schemas.openxmlformats.org/drawingml/2006/picture">
+                  <pic:nvPicPr>
+                    <pic:cNvPr id="0" name="Picture 10"/>
+                    <pic:cNvPicPr>
+                      <a:picLocks noChangeAspect="1" noChangeArrowheads="1"/>
+                    </pic:cNvPicPr>
+                  </pic:nvPicPr>
+                  <pic:blipFill>
+                    <a:blip r:embed="rId151">
+                      <a:extLst>
+                        <a:ext uri="{28A0092B-C50C-407E-A947-70E740481C1C}">
+                          <a14:useLocalDpi xmlns:a14="http://schemas.microsoft.com/office/drawing/2010/main" val="0"/>
+                        </a:ext>
+                      </a:extLst>
+                    </a:blip>
+                    <a:srcRect/>
+                    <a:stretch>
+                      <a:fillRect/>
+                    </a:stretch>
+                  </pic:blipFill>
+                  <pic:spPr bwMode="auto">
+                    <a:xfrm>
+                      <a:off x="0" y="0"/>
+                      <a:ext cx="1114425" cy="542925"/>
+                    </a:xfrm>
+                    <a:prstGeom prst="rect">
+                      <a:avLst/>
+                    </a:prstGeom>
+                    <a:noFill/>
+                  </pic:spPr>
+                </pic:pic>
+              </a:graphicData>
+            </a:graphic>
+          </wp:inline>
+        </w:drawing>
+      </w:r>
+    </w:p>
+    <w:p>
+      <w:pPr>
+        <w:tabs>
+          <w:tab w:val="left" w:pos="3105"/>
+        </w:tabs>
+        <w:ind w:left="720"/>
+      </w:pPr>
+    </w:p>
+    <w:p>
+      <w:pPr>
+        <w:tabs>
+          <w:tab w:val="left" w:pos="3105"/>
+        </w:tabs>
+        <w:ind w:left="720"/>
+      </w:pPr>
+      <w:r>
+        <w:t xml:space="preserve">91- Para colocar o texto ao lado da imagem utilizamos uma técnica de flutuação chamada </w:t>
+      </w:r>
+      <w:proofErr w:type="spellStart"/>
+      <w:r>
+        <w:t>flo</w:t>
+      </w:r>
+      <w:r>
+        <w:t>a</w:t>
+      </w:r>
+      <w:r>
+        <w:t>t</w:t>
+      </w:r>
+      <w:proofErr w:type="spellEnd"/>
+      <w:r>
+        <w:t xml:space="preserve">, quando utilizamos esse recurso o elemento descola da pagina o que </w:t>
+      </w:r>
+      <w:proofErr w:type="gramStart"/>
+      <w:r>
+        <w:t>esta</w:t>
+      </w:r>
+      <w:proofErr w:type="gramEnd"/>
+      <w:r>
+        <w:t xml:space="preserve"> em baixo para cima, se atentando a sua sobra, continua virtualmente o espaço </w:t>
+      </w:r>
+    </w:p>
+    <w:p>
+      <w:pPr>
+        <w:tabs>
+          <w:tab w:val="left" w:pos="3105"/>
+        </w:tabs>
+        <w:ind w:left="720"/>
+      </w:pPr>
+      <w:r>
+        <w:rPr>
+          <w:noProof/>
+        </w:rPr>
+        <w:drawing>
+          <wp:inline distT="0" distB="0" distL="0" distR="0" wp14:anchorId="143DA1B2" wp14:editId="1B70DF2A">
+            <wp:extent cx="4795335" cy="1047750"/>
+            <wp:effectExtent l="0" t="0" r="5715" b="0"/>
+            <wp:docPr id="146" name="Imagem 146"/>
+            <wp:cNvGraphicFramePr>
+              <a:graphicFrameLocks xmlns:a="http://schemas.openxmlformats.org/drawingml/2006/main" noChangeAspect="1"/>
+            </wp:cNvGraphicFramePr>
+            <a:graphic xmlns:a="http://schemas.openxmlformats.org/drawingml/2006/main">
+              <a:graphicData uri="http://schemas.openxmlformats.org/drawingml/2006/picture">
+                <pic:pic xmlns:pic="http://schemas.openxmlformats.org/drawingml/2006/picture">
+                  <pic:nvPicPr>
+                    <pic:cNvPr id="0" name="Picture 3"/>
+                    <pic:cNvPicPr>
+                      <a:picLocks noChangeAspect="1" noChangeArrowheads="1"/>
+                    </pic:cNvPicPr>
+                  </pic:nvPicPr>
+                  <pic:blipFill>
+                    <a:blip r:embed="rId152">
+                      <a:extLst>
+                        <a:ext uri="{28A0092B-C50C-407E-A947-70E740481C1C}">
+                          <a14:useLocalDpi xmlns:a14="http://schemas.microsoft.com/office/drawing/2010/main" val="0"/>
+                        </a:ext>
+                      </a:extLst>
+                    </a:blip>
+                    <a:srcRect/>
+                    <a:stretch>
+                      <a:fillRect/>
+                    </a:stretch>
+                  </pic:blipFill>
+                  <pic:spPr bwMode="auto">
+                    <a:xfrm>
+                      <a:off x="0" y="0"/>
+                      <a:ext cx="4990736" cy="1090444"/>
+                    </a:xfrm>
+                    <a:prstGeom prst="rect">
+                      <a:avLst/>
+                    </a:prstGeom>
+                    <a:noFill/>
+                  </pic:spPr>
+                </pic:pic>
+              </a:graphicData>
+            </a:graphic>
+          </wp:inline>
+        </w:drawing>
+      </w:r>
+      <w:r>
+        <w:rPr>
+          <w:noProof/>
+        </w:rPr>
+        <w:drawing>
+          <wp:inline distT="0" distB="0" distL="0" distR="0" wp14:anchorId="29DB790A">
+            <wp:extent cx="1266825" cy="1019175"/>
+            <wp:effectExtent l="0" t="0" r="9525" b="9525"/>
+            <wp:docPr id="145" name="Imagem 145"/>
+            <wp:cNvGraphicFramePr>
+              <a:graphicFrameLocks xmlns:a="http://schemas.openxmlformats.org/drawingml/2006/main" noChangeAspect="1"/>
+            </wp:cNvGraphicFramePr>
+            <a:graphic xmlns:a="http://schemas.openxmlformats.org/drawingml/2006/main">
+              <a:graphicData uri="http://schemas.openxmlformats.org/drawingml/2006/picture">
+                <pic:pic xmlns:pic="http://schemas.openxmlformats.org/drawingml/2006/picture">
+                  <pic:nvPicPr>
+                    <pic:cNvPr id="0" name="Picture 2"/>
+                    <pic:cNvPicPr>
+                      <a:picLocks noChangeAspect="1" noChangeArrowheads="1"/>
+                    </pic:cNvPicPr>
+                  </pic:nvPicPr>
+                  <pic:blipFill>
+                    <a:blip r:embed="rId153">
+                      <a:extLst>
+                        <a:ext uri="{28A0092B-C50C-407E-A947-70E740481C1C}">
+                          <a14:useLocalDpi xmlns:a14="http://schemas.microsoft.com/office/drawing/2010/main" val="0"/>
+                        </a:ext>
+                      </a:extLst>
+                    </a:blip>
+                    <a:srcRect/>
+                    <a:stretch>
+                      <a:fillRect/>
+                    </a:stretch>
+                  </pic:blipFill>
+                  <pic:spPr bwMode="auto">
+                    <a:xfrm>
+                      <a:off x="0" y="0"/>
+                      <a:ext cx="1266825" cy="1019175"/>
+                    </a:xfrm>
+                    <a:prstGeom prst="rect">
+                      <a:avLst/>
+                    </a:prstGeom>
+                    <a:noFill/>
+                  </pic:spPr>
+                </pic:pic>
+              </a:graphicData>
+            </a:graphic>
+          </wp:inline>
+        </w:drawing>
+      </w:r>
+    </w:p>
+    <w:p>
+      <w:pPr>
+        <w:tabs>
+          <w:tab w:val="left" w:pos="3105"/>
+        </w:tabs>
+        <w:ind w:left="720"/>
+      </w:pPr>
+    </w:p>
+    <w:p>
+      <w:pPr>
+        <w:tabs>
+          <w:tab w:val="left" w:pos="3105"/>
+        </w:tabs>
+        <w:ind w:left="720"/>
+      </w:pPr>
+      <w:r>
+        <w:t xml:space="preserve">92- Observamos que ao utilizar o </w:t>
+      </w:r>
+      <w:proofErr w:type="spellStart"/>
+      <w:r>
+        <w:t>float</w:t>
+      </w:r>
+      <w:proofErr w:type="spellEnd"/>
+      <w:r>
+        <w:t xml:space="preserve"> o elemento abaixo subiu para voltar ao estado anterior utilizamos o </w:t>
+      </w:r>
+      <w:proofErr w:type="spellStart"/>
+      <w:r>
+        <w:t>clear</w:t>
+      </w:r>
+      <w:proofErr w:type="spellEnd"/>
+      <w:r>
+        <w:t xml:space="preserve"> </w:t>
+      </w:r>
+    </w:p>
+    <w:p>
+      <w:pPr>
+        <w:tabs>
+          <w:tab w:val="left" w:pos="3105"/>
+        </w:tabs>
+        <w:ind w:left="720"/>
+      </w:pPr>
+      <w:r>
+        <w:rPr>
+          <w:noProof/>
+        </w:rPr>
+        <w:drawing>
+          <wp:inline distT="0" distB="0" distL="0" distR="0" wp14:anchorId="59DE22C7">
+            <wp:extent cx="1685925" cy="1152525"/>
+            <wp:effectExtent l="0" t="0" r="9525" b="9525"/>
+            <wp:docPr id="147" name="Imagem 147"/>
+            <wp:cNvGraphicFramePr>
+              <a:graphicFrameLocks xmlns:a="http://schemas.openxmlformats.org/drawingml/2006/main" noChangeAspect="1"/>
+            </wp:cNvGraphicFramePr>
+            <a:graphic xmlns:a="http://schemas.openxmlformats.org/drawingml/2006/main">
+              <a:graphicData uri="http://schemas.openxmlformats.org/drawingml/2006/picture">
+                <pic:pic xmlns:pic="http://schemas.openxmlformats.org/drawingml/2006/picture">
+                  <pic:nvPicPr>
+                    <pic:cNvPr id="0" name="Picture 4"/>
+                    <pic:cNvPicPr>
+                      <a:picLocks noChangeAspect="1" noChangeArrowheads="1"/>
+                    </pic:cNvPicPr>
+                  </pic:nvPicPr>
+                  <pic:blipFill>
+                    <a:blip r:embed="rId154">
+                      <a:extLst>
+                        <a:ext uri="{28A0092B-C50C-407E-A947-70E740481C1C}">
+                          <a14:useLocalDpi xmlns:a14="http://schemas.microsoft.com/office/drawing/2010/main" val="0"/>
+                        </a:ext>
+                      </a:extLst>
+                    </a:blip>
+                    <a:srcRect/>
+                    <a:stretch>
+                      <a:fillRect/>
+                    </a:stretch>
+                  </pic:blipFill>
+                  <pic:spPr bwMode="auto">
+                    <a:xfrm>
+                      <a:off x="0" y="0"/>
+                      <a:ext cx="1685925" cy="1152525"/>
+                    </a:xfrm>
+                    <a:prstGeom prst="rect">
+                      <a:avLst/>
+                    </a:prstGeom>
+                    <a:noFill/>
+                  </pic:spPr>
+                </pic:pic>
+              </a:graphicData>
+            </a:graphic>
+          </wp:inline>
+        </w:drawing>
+      </w:r>
+    </w:p>
+    <w:p>
+      <w:pPr>
+        <w:tabs>
+          <w:tab w:val="left" w:pos="3105"/>
+        </w:tabs>
+        <w:ind w:left="720"/>
+      </w:pPr>
+    </w:p>
+    <w:p>
+      <w:pPr>
+        <w:tabs>
+          <w:tab w:val="left" w:pos="3105"/>
+        </w:tabs>
+        <w:ind w:left="720"/>
+      </w:pPr>
+      <w:r>
+        <w:t xml:space="preserve">93- </w:t>
+      </w:r>
+      <w:proofErr w:type="gramStart"/>
+      <w:r>
+        <w:t>para</w:t>
+      </w:r>
+      <w:proofErr w:type="gramEnd"/>
+      <w:r>
+        <w:t xml:space="preserve"> o texto estavam muito colado com a imagem inserimos uma distancia externa de 20px para direita e 20px para baixo </w:t>
+      </w:r>
+    </w:p>
+    <w:p>
+      <w:pPr>
+        <w:tabs>
+          <w:tab w:val="left" w:pos="3105"/>
+        </w:tabs>
+        <w:ind w:left="720"/>
+      </w:pPr>
+      <w:r>
+        <w:rPr>
+          <w:noProof/>
+        </w:rPr>
+        <w:drawing>
+          <wp:inline distT="0" distB="0" distL="0" distR="0" wp14:anchorId="717B5D97" wp14:editId="24C25F0C">
+            <wp:extent cx="5235314" cy="1071135"/>
+            <wp:effectExtent l="0" t="0" r="3810" b="0"/>
+            <wp:docPr id="149" name="Imagem 149"/>
+            <wp:cNvGraphicFramePr>
+              <a:graphicFrameLocks xmlns:a="http://schemas.openxmlformats.org/drawingml/2006/main" noChangeAspect="1"/>
+            </wp:cNvGraphicFramePr>
+            <a:graphic xmlns:a="http://schemas.openxmlformats.org/drawingml/2006/main">
+              <a:graphicData uri="http://schemas.openxmlformats.org/drawingml/2006/picture">
+                <pic:pic xmlns:pic="http://schemas.openxmlformats.org/drawingml/2006/picture">
+                  <pic:nvPicPr>
+                    <pic:cNvPr id="0" name="Picture 6"/>
+                    <pic:cNvPicPr>
+                      <a:picLocks noChangeAspect="1" noChangeArrowheads="1"/>
+                    </pic:cNvPicPr>
+                  </pic:nvPicPr>
+                  <pic:blipFill>
+                    <a:blip r:embed="rId155">
+                      <a:extLst>
+                        <a:ext uri="{28A0092B-C50C-407E-A947-70E740481C1C}">
+                          <a14:useLocalDpi xmlns:a14="http://schemas.microsoft.com/office/drawing/2010/main" val="0"/>
+                        </a:ext>
+                      </a:extLst>
+                    </a:blip>
+                    <a:srcRect/>
+                    <a:stretch>
+                      <a:fillRect/>
+                    </a:stretch>
+                  </pic:blipFill>
+                  <pic:spPr bwMode="auto">
+                    <a:xfrm>
+                      <a:off x="0" y="0"/>
+                      <a:ext cx="5247070" cy="1073540"/>
+                    </a:xfrm>
+                    <a:prstGeom prst="rect">
+                      <a:avLst/>
+                    </a:prstGeom>
+                    <a:noFill/>
+                  </pic:spPr>
+                </pic:pic>
+              </a:graphicData>
+            </a:graphic>
+          </wp:inline>
+        </w:drawing>
+      </w:r>
+      <w:r>
+        <w:rPr>
+          <w:noProof/>
+        </w:rPr>
+        <w:drawing>
+          <wp:inline distT="0" distB="0" distL="0" distR="0" wp14:anchorId="4757F628">
+            <wp:extent cx="1647825" cy="962025"/>
+            <wp:effectExtent l="0" t="0" r="9525" b="9525"/>
+            <wp:docPr id="148" name="Imagem 148"/>
+            <wp:cNvGraphicFramePr>
+              <a:graphicFrameLocks xmlns:a="http://schemas.openxmlformats.org/drawingml/2006/main" noChangeAspect="1"/>
+            </wp:cNvGraphicFramePr>
+            <a:graphic xmlns:a="http://schemas.openxmlformats.org/drawingml/2006/main">
+              <a:graphicData uri="http://schemas.openxmlformats.org/drawingml/2006/picture">
+                <pic:pic xmlns:pic="http://schemas.openxmlformats.org/drawingml/2006/picture">
+                  <pic:nvPicPr>
+                    <pic:cNvPr id="0" name="Picture 5"/>
+                    <pic:cNvPicPr>
+                      <a:picLocks noChangeAspect="1" noChangeArrowheads="1"/>
+                    </pic:cNvPicPr>
+                  </pic:nvPicPr>
+                  <pic:blipFill>
+                    <a:blip r:embed="rId156">
+                      <a:extLst>
+                        <a:ext uri="{28A0092B-C50C-407E-A947-70E740481C1C}">
+                          <a14:useLocalDpi xmlns:a14="http://schemas.microsoft.com/office/drawing/2010/main" val="0"/>
+                        </a:ext>
+                      </a:extLst>
+                    </a:blip>
+                    <a:srcRect/>
+                    <a:stretch>
+                      <a:fillRect/>
+                    </a:stretch>
+                  </pic:blipFill>
+                  <pic:spPr bwMode="auto">
+                    <a:xfrm>
+                      <a:off x="0" y="0"/>
+                      <a:ext cx="1647825" cy="962025"/>
+                    </a:xfrm>
+                    <a:prstGeom prst="rect">
+                      <a:avLst/>
+                    </a:prstGeom>
+                    <a:noFill/>
+                  </pic:spPr>
+                </pic:pic>
+              </a:graphicData>
+            </a:graphic>
+          </wp:inline>
+        </w:drawing>
+      </w:r>
+    </w:p>
+    <w:p>
+      <w:pPr>
+        <w:tabs>
+          <w:tab w:val="left" w:pos="3105"/>
+        </w:tabs>
+        <w:ind w:left="720"/>
+      </w:pPr>
+    </w:p>
+    <w:p>
+      <w:pPr>
+        <w:tabs>
+          <w:tab w:val="left" w:pos="3105"/>
+        </w:tabs>
+        <w:ind w:left="720"/>
+      </w:pPr>
+    </w:p>
+    <w:p>
+      <w:pPr>
+        <w:tabs>
+          <w:tab w:val="left" w:pos="3105"/>
+        </w:tabs>
+        <w:ind w:left="720"/>
+      </w:pPr>
+      <w:r>
+        <w:t xml:space="preserve">94- Trabalhando com </w:t>
+      </w:r>
+      <w:proofErr w:type="spellStart"/>
+      <w:r>
+        <w:t>fonts</w:t>
+      </w:r>
+      <w:proofErr w:type="spellEnd"/>
+      <w:r>
+        <w:t xml:space="preserve"> da internet vamos escolher uma </w:t>
+      </w:r>
+      <w:proofErr w:type="spellStart"/>
+      <w:r>
+        <w:t>font</w:t>
+      </w:r>
+      <w:proofErr w:type="spellEnd"/>
+      <w:r>
+        <w:t xml:space="preserve"> para o nosso site que seja preparado pela internet</w:t>
+      </w:r>
+    </w:p>
+    <w:p>
+      <w:pPr>
+        <w:tabs>
+          <w:tab w:val="left" w:pos="3105"/>
+        </w:tabs>
+        <w:ind w:left="720"/>
+      </w:pPr>
+      <w:r>
+        <w:t xml:space="preserve"> Qual é a diferença se prepara ou não pela internet é que a </w:t>
+      </w:r>
+      <w:proofErr w:type="spellStart"/>
+      <w:r>
+        <w:t>font</w:t>
+      </w:r>
+      <w:proofErr w:type="spellEnd"/>
+      <w:r>
+        <w:t xml:space="preserve"> independente do navegador vai ser comportar da mesma forma </w:t>
+      </w:r>
+    </w:p>
+    <w:p>
+      <w:pPr>
+        <w:tabs>
+          <w:tab w:val="left" w:pos="3105"/>
+        </w:tabs>
+        <w:ind w:left="720"/>
+      </w:pPr>
+      <w:r>
+        <w:t xml:space="preserve">Entra no site: </w:t>
+      </w:r>
+      <w:hyperlink r:id="rId157" w:history="1">
+        <w:r>
+          <w:rPr>
+            <w:rStyle w:val="Hyperlink"/>
+          </w:rPr>
+          <w:t>http://fonts.google.com</w:t>
+        </w:r>
+      </w:hyperlink>
+      <w:r>
+        <w:t xml:space="preserve"> para escolher a fonte que desejamos</w:t>
+      </w:r>
+      <w:r>
+        <w:t xml:space="preserve"> e copia o código que é gerado pra colar no </w:t>
+      </w:r>
+      <w:proofErr w:type="spellStart"/>
+      <w:r>
+        <w:t>html</w:t>
+      </w:r>
+      <w:proofErr w:type="spellEnd"/>
+      <w:r>
+        <w:t xml:space="preserve"> e no </w:t>
+      </w:r>
+      <w:proofErr w:type="spellStart"/>
+      <w:r>
+        <w:t>css</w:t>
+      </w:r>
+      <w:proofErr w:type="spellEnd"/>
+      <w:r>
+        <w:t xml:space="preserve"> lembrando que no </w:t>
+      </w:r>
+      <w:proofErr w:type="spellStart"/>
+      <w:r>
+        <w:t>html</w:t>
+      </w:r>
+      <w:proofErr w:type="spellEnd"/>
+      <w:r>
+        <w:t xml:space="preserve"> precisamos colar dentro do </w:t>
+      </w:r>
+      <w:proofErr w:type="spellStart"/>
+      <w:r>
+        <w:t>head</w:t>
+      </w:r>
+      <w:proofErr w:type="spellEnd"/>
+      <w:r>
+        <w:t xml:space="preserve"> e no </w:t>
+      </w:r>
+      <w:proofErr w:type="spellStart"/>
+      <w:r>
+        <w:t>css</w:t>
+      </w:r>
+      <w:proofErr w:type="spellEnd"/>
+      <w:r>
+        <w:t xml:space="preserve"> colamos aonde queremos aplicar a </w:t>
+      </w:r>
+      <w:proofErr w:type="spellStart"/>
+      <w:r>
+        <w:t>font</w:t>
+      </w:r>
+      <w:proofErr w:type="spellEnd"/>
+    </w:p>
+    <w:p>
+      <w:pPr>
+        <w:tabs>
+          <w:tab w:val="left" w:pos="3105"/>
+        </w:tabs>
+        <w:ind w:left="720"/>
+      </w:pPr>
+    </w:p>
+    <w:p>
+      <w:pPr>
+        <w:tabs>
+          <w:tab w:val="left" w:pos="3105"/>
+        </w:tabs>
+        <w:ind w:left="720"/>
+      </w:pPr>
+      <w:r>
+        <w:rPr>
+          <w:noProof/>
+        </w:rPr>
+        <w:drawing>
+          <wp:inline distT="0" distB="0" distL="0" distR="0" wp14:anchorId="355608F6">
+            <wp:extent cx="5262572" cy="528691"/>
+            <wp:effectExtent l="0" t="0" r="0" b="5080"/>
+            <wp:docPr id="151" name="Imagem 151"/>
+            <wp:cNvGraphicFramePr>
+              <a:graphicFrameLocks xmlns:a="http://schemas.openxmlformats.org/drawingml/2006/main" noChangeAspect="1"/>
+            </wp:cNvGraphicFramePr>
+            <a:graphic xmlns:a="http://schemas.openxmlformats.org/drawingml/2006/main">
+              <a:graphicData uri="http://schemas.openxmlformats.org/drawingml/2006/picture">
+                <pic:pic xmlns:pic="http://schemas.openxmlformats.org/drawingml/2006/picture">
+                  <pic:nvPicPr>
+                    <pic:cNvPr id="0" name="Picture 8"/>
+                    <pic:cNvPicPr>
+                      <a:picLocks noChangeAspect="1" noChangeArrowheads="1"/>
+                    </pic:cNvPicPr>
+                  </pic:nvPicPr>
+                  <pic:blipFill>
+                    <a:blip r:embed="rId158">
+                      <a:extLst>
+                        <a:ext uri="{28A0092B-C50C-407E-A947-70E740481C1C}">
+                          <a14:useLocalDpi xmlns:a14="http://schemas.microsoft.com/office/drawing/2010/main" val="0"/>
+                        </a:ext>
+                      </a:extLst>
+                    </a:blip>
+                    <a:srcRect/>
+                    <a:stretch>
+                      <a:fillRect/>
+                    </a:stretch>
+                  </pic:blipFill>
+                  <pic:spPr bwMode="auto">
+                    <a:xfrm>
+                      <a:off x="0" y="0"/>
+                      <a:ext cx="5458693" cy="548394"/>
+                    </a:xfrm>
+                    <a:prstGeom prst="rect">
+                      <a:avLst/>
+                    </a:prstGeom>
+                    <a:noFill/>
+                  </pic:spPr>
+                </pic:pic>
+              </a:graphicData>
+            </a:graphic>
+          </wp:inline>
+        </w:drawing>
+      </w:r>
+    </w:p>
+    <w:p>
+      <w:pPr>
+        <w:tabs>
+          <w:tab w:val="left" w:pos="3105"/>
+        </w:tabs>
+        <w:ind w:left="720"/>
+      </w:pPr>
+      <w:r>
+        <w:rPr>
+          <w:noProof/>
+        </w:rPr>
+        <w:drawing>
+          <wp:inline distT="0" distB="0" distL="0" distR="0" wp14:anchorId="7833325A">
+            <wp:extent cx="2800985" cy="371475"/>
+            <wp:effectExtent l="0" t="0" r="0" b="9525"/>
+            <wp:docPr id="152" name="Imagem 152"/>
+            <wp:cNvGraphicFramePr>
+              <a:graphicFrameLocks xmlns:a="http://schemas.openxmlformats.org/drawingml/2006/main" noChangeAspect="1"/>
+            </wp:cNvGraphicFramePr>
+            <a:graphic xmlns:a="http://schemas.openxmlformats.org/drawingml/2006/main">
+              <a:graphicData uri="http://schemas.openxmlformats.org/drawingml/2006/picture">
+                <pic:pic xmlns:pic="http://schemas.openxmlformats.org/drawingml/2006/picture">
+                  <pic:nvPicPr>
+                    <pic:cNvPr id="0" name="Picture 9"/>
+                    <pic:cNvPicPr>
+                      <a:picLocks noChangeAspect="1" noChangeArrowheads="1"/>
+                    </pic:cNvPicPr>
+                  </pic:nvPicPr>
+                  <pic:blipFill>
+                    <a:blip r:embed="rId159">
+                      <a:extLst>
+                        <a:ext uri="{28A0092B-C50C-407E-A947-70E740481C1C}">
+                          <a14:useLocalDpi xmlns:a14="http://schemas.microsoft.com/office/drawing/2010/main" val="0"/>
+                        </a:ext>
+                      </a:extLst>
+                    </a:blip>
+                    <a:srcRect/>
+                    <a:stretch>
+                      <a:fillRect/>
+                    </a:stretch>
+                  </pic:blipFill>
+                  <pic:spPr bwMode="auto">
+                    <a:xfrm>
+                      <a:off x="0" y="0"/>
+                      <a:ext cx="2800985" cy="371475"/>
+                    </a:xfrm>
+                    <a:prstGeom prst="rect">
+                      <a:avLst/>
+                    </a:prstGeom>
+                    <a:noFill/>
+                  </pic:spPr>
+                </pic:pic>
+              </a:graphicData>
+            </a:graphic>
+          </wp:inline>
+        </w:drawing>
+      </w:r>
+      <w:r>
+        <w:rPr>
+          <w:noProof/>
+        </w:rPr>
+        <w:drawing>
+          <wp:inline distT="0" distB="0" distL="0" distR="0" wp14:anchorId="2FD2F08A">
+            <wp:extent cx="4392245" cy="2087875"/>
+            <wp:effectExtent l="0" t="0" r="0" b="8255"/>
+            <wp:docPr id="153" name="Imagem 153"/>
+            <wp:cNvGraphicFramePr>
+              <a:graphicFrameLocks xmlns:a="http://schemas.openxmlformats.org/drawingml/2006/main" noChangeAspect="1"/>
+            </wp:cNvGraphicFramePr>
+            <a:graphic xmlns:a="http://schemas.openxmlformats.org/drawingml/2006/main">
+              <a:graphicData uri="http://schemas.openxmlformats.org/drawingml/2006/picture">
+                <pic:pic xmlns:pic="http://schemas.openxmlformats.org/drawingml/2006/picture">
+                  <pic:nvPicPr>
+                    <pic:cNvPr id="0" name="Picture 10"/>
+                    <pic:cNvPicPr>
+                      <a:picLocks noChangeAspect="1" noChangeArrowheads="1"/>
+                    </pic:cNvPicPr>
+                  </pic:nvPicPr>
+                  <pic:blipFill>
+                    <a:blip r:embed="rId160" cstate="print">
+                      <a:extLst>
+                        <a:ext uri="{28A0092B-C50C-407E-A947-70E740481C1C}">
+                          <a14:useLocalDpi xmlns:a14="http://schemas.microsoft.com/office/drawing/2010/main" val="0"/>
+                        </a:ext>
+                      </a:extLst>
+                    </a:blip>
+                    <a:srcRect/>
+                    <a:stretch>
+                      <a:fillRect/>
+                    </a:stretch>
+                  </pic:blipFill>
+                  <pic:spPr bwMode="auto">
+                    <a:xfrm>
+                      <a:off x="0" y="0"/>
+                      <a:ext cx="4420990" cy="2101539"/>
+                    </a:xfrm>
+                    <a:prstGeom prst="rect">
+                      <a:avLst/>
+                    </a:prstGeom>
+                    <a:noFill/>
+                  </pic:spPr>
+                </pic:pic>
+              </a:graphicData>
+            </a:graphic>
+          </wp:inline>
+        </w:drawing>
+      </w:r>
+    </w:p>
+    <w:p>
+      <w:pPr>
+        <w:tabs>
+          <w:tab w:val="left" w:pos="3105"/>
+        </w:tabs>
+        <w:ind w:left="720"/>
+      </w:pPr>
+    </w:p>
+    <w:p>
+      <w:pPr>
+        <w:tabs>
+          <w:tab w:val="left" w:pos="3105"/>
+        </w:tabs>
+        <w:ind w:left="720"/>
+      </w:pPr>
+    </w:p>
+    <w:p>
+      <w:pPr>
+        <w:tabs>
+          <w:tab w:val="left" w:pos="3105"/>
+        </w:tabs>
+        <w:ind w:left="720"/>
+      </w:pPr>
+      <w:r>
+        <w:t>95-</w:t>
+      </w:r>
+      <w:r>
+        <w:t xml:space="preserve"> </w:t>
+      </w:r>
+      <w:r>
+        <w:t xml:space="preserve">Para inserir um mapa no site acessamos o </w:t>
+      </w:r>
+      <w:proofErr w:type="spellStart"/>
+      <w:r>
+        <w:t>google</w:t>
+      </w:r>
+      <w:proofErr w:type="spellEnd"/>
+      <w:r>
+        <w:t xml:space="preserve"> </w:t>
+      </w:r>
+      <w:proofErr w:type="spellStart"/>
+      <w:r>
+        <w:t>maps</w:t>
+      </w:r>
+      <w:proofErr w:type="spellEnd"/>
+      <w:r>
+        <w:t xml:space="preserve"> na pesquisa digitamos o estabelecimento desejado no nosso caso Barbearia Space for </w:t>
+      </w:r>
+      <w:proofErr w:type="spellStart"/>
+      <w:r>
+        <w:t>Men</w:t>
+      </w:r>
+      <w:proofErr w:type="spellEnd"/>
+      <w:r>
+        <w:t xml:space="preserve"> parecido </w:t>
+      </w:r>
       <w:bookmarkStart w:id="0" w:name="_GoBack"/>
       <w:bookmarkEnd w:id="0"/>
+      <w:r>
+        <w:t>3 pontinhos</w:t>
+      </w:r>
+      <w:r>
+        <w:t xml:space="preserve"> ou três linhas clica vai aparecer a seguinte tela com o campo compartilhar ou incorporar acessamos esse campo copiamos </w:t>
+      </w:r>
+      <w:proofErr w:type="spellStart"/>
+      <w:r>
+        <w:t>lik</w:t>
+      </w:r>
+      <w:proofErr w:type="spellEnd"/>
+      <w:r>
+        <w:t xml:space="preserve"> que gera para colocar no </w:t>
+      </w:r>
+      <w:proofErr w:type="spellStart"/>
+      <w:r>
+        <w:t>html</w:t>
+      </w:r>
+      <w:proofErr w:type="spellEnd"/>
+    </w:p>
+    <w:p>
+      <w:pPr>
+        <w:tabs>
+          <w:tab w:val="left" w:pos="3105"/>
+        </w:tabs>
+        <w:ind w:left="720"/>
+      </w:pPr>
+    </w:p>
+    <w:p>
+      <w:pPr>
+        <w:tabs>
+          <w:tab w:val="left" w:pos="3105"/>
+        </w:tabs>
+        <w:ind w:left="720"/>
+      </w:pPr>
+      <w:r>
+        <w:t xml:space="preserve"> </w:t>
+      </w:r>
+      <w:r>
+        <w:rPr>
+          <w:noProof/>
+        </w:rPr>
+        <w:drawing>
+          <wp:inline distT="0" distB="0" distL="0" distR="0" wp14:anchorId="45B42732">
+            <wp:extent cx="3277235" cy="2585734"/>
+            <wp:effectExtent l="0" t="0" r="0" b="5080"/>
+            <wp:docPr id="154" name="Imagem 154"/>
+            <wp:cNvGraphicFramePr>
+              <a:graphicFrameLocks xmlns:a="http://schemas.openxmlformats.org/drawingml/2006/main" noChangeAspect="1"/>
+            </wp:cNvGraphicFramePr>
+            <a:graphic xmlns:a="http://schemas.openxmlformats.org/drawingml/2006/main">
+              <a:graphicData uri="http://schemas.openxmlformats.org/drawingml/2006/picture">
+                <pic:pic xmlns:pic="http://schemas.openxmlformats.org/drawingml/2006/picture">
+                  <pic:nvPicPr>
+                    <pic:cNvPr id="0" name="Picture 11"/>
+                    <pic:cNvPicPr>
+                      <a:picLocks noChangeAspect="1" noChangeArrowheads="1"/>
+                    </pic:cNvPicPr>
+                  </pic:nvPicPr>
+                  <pic:blipFill>
+                    <a:blip r:embed="rId161">
+                      <a:extLst>
+                        <a:ext uri="{28A0092B-C50C-407E-A947-70E740481C1C}">
+                          <a14:useLocalDpi xmlns:a14="http://schemas.microsoft.com/office/drawing/2010/main" val="0"/>
+                        </a:ext>
+                      </a:extLst>
+                    </a:blip>
+                    <a:srcRect/>
+                    <a:stretch>
+                      <a:fillRect/>
+                    </a:stretch>
+                  </pic:blipFill>
+                  <pic:spPr bwMode="auto">
+                    <a:xfrm>
+                      <a:off x="0" y="0"/>
+                      <a:ext cx="3295857" cy="2600427"/>
+                    </a:xfrm>
+                    <a:prstGeom prst="rect">
+                      <a:avLst/>
+                    </a:prstGeom>
+                    <a:noFill/>
+                  </pic:spPr>
+                </pic:pic>
+              </a:graphicData>
+            </a:graphic>
+          </wp:inline>
+        </w:drawing>
+      </w:r>
+    </w:p>
+    <w:p>
+      <w:pPr>
+        <w:tabs>
+          <w:tab w:val="left" w:pos="3105"/>
+        </w:tabs>
+        <w:ind w:left="720"/>
+      </w:pPr>
+    </w:p>
+    <w:p>
+      <w:pPr>
+        <w:tabs>
+          <w:tab w:val="left" w:pos="3105"/>
+        </w:tabs>
+      </w:pPr>
     </w:p>
     <w:sectPr>
       <w:pgSz w:w="11906" w:h="16838"/>
@@ -11927,7 +13811,7 @@
 </file>
 
 <file path=customXml/itemProps1.xml><?xml version="1.0" encoding="utf-8"?>
-<ds:datastoreItem xmlns:ds="http://schemas.openxmlformats.org/officeDocument/2006/customXml" ds:itemID="{8837EB66-1D2B-43DA-A2E5-9F27702318A3}">
+<ds:datastoreItem xmlns:ds="http://schemas.openxmlformats.org/officeDocument/2006/customXml" ds:itemID="{FC2725A1-AF3B-4FB8-83D4-BF502251009A}">
   <ds:schemaRefs>
     <ds:schemaRef ds:uri="http://schemas.openxmlformats.org/officeDocument/2006/bibliography"/>
   </ds:schemaRefs>

</xml_diff>

<commit_message>
Atualização da aula 08/10/2026
</commit_message>
<xml_diff>
--- a/apostila/Projeto Space For Men.docx
+++ b/apostila/Projeto Space For Men.docx
@@ -13277,6 +13277,9 @@
         </w:tabs>
       </w:pPr>
       <w:r>
+        <w:rPr>
+          <w:noProof/>
+        </w:rPr>
         <w:drawing>
           <wp:inline distT="0" distB="0" distL="0" distR="0" wp14:anchorId="0C7AA0DE" wp14:editId="5FB04331">
             <wp:extent cx="3010320" cy="1609950"/>
@@ -13410,6 +13413,9 @@
         <w:t xml:space="preserve"> </w:t>
       </w:r>
       <w:r>
+        <w:rPr>
+          <w:noProof/>
+        </w:rPr>
         <w:drawing>
           <wp:inline distT="0" distB="0" distL="0" distR="0" wp14:anchorId="10C70D14" wp14:editId="5A9EFFFE">
             <wp:extent cx="1609950" cy="1009791"/>
@@ -13586,7 +13592,15 @@
       </w:r>
       <w:proofErr w:type="spellEnd"/>
       <w:r>
-        <w:t xml:space="preserve">: top, incluímos mais dois itens a lista no </w:t>
+        <w:t xml:space="preserve">: top, incluímos mais dois itens </w:t>
+      </w:r>
+      <w:proofErr w:type="spellStart"/>
+      <w:r>
+        <w:t>a</w:t>
+      </w:r>
+      <w:proofErr w:type="spellEnd"/>
+      <w:r>
+        <w:t xml:space="preserve"> lista no </w:t>
       </w:r>
       <w:proofErr w:type="spellStart"/>
       <w:r>
@@ -13921,6 +13935,9 @@
         </w:tabs>
       </w:pPr>
       <w:r>
+        <w:rPr>
+          <w:noProof/>
+        </w:rPr>
         <w:drawing>
           <wp:inline distT="0" distB="0" distL="0" distR="0" wp14:anchorId="65DE3F15" wp14:editId="684F2CDB">
             <wp:extent cx="1152525" cy="815466"/>
@@ -14034,6 +14051,9 @@
         </w:tabs>
       </w:pPr>
       <w:r>
+        <w:rPr>
+          <w:noProof/>
+        </w:rPr>
         <w:drawing>
           <wp:inline distT="0" distB="0" distL="0" distR="0" wp14:anchorId="63504AF1" wp14:editId="37A5FE37">
             <wp:extent cx="1295581" cy="647790"/>
@@ -14093,7 +14113,15 @@
       </w:r>
       <w:proofErr w:type="spellEnd"/>
       <w:r>
-        <w:t xml:space="preserve"> que contem a lista e a imagem benefícios demos uma largura e centralizamos o </w:t>
+        <w:t xml:space="preserve"> que </w:t>
+      </w:r>
+      <w:proofErr w:type="spellStart"/>
+      <w:r>
+        <w:t>contem</w:t>
+      </w:r>
+      <w:proofErr w:type="spellEnd"/>
+      <w:r>
+        <w:t xml:space="preserve"> a lista e a imagem benefícios demos uma largura e centralizamos o </w:t>
       </w:r>
       <w:proofErr w:type="gramStart"/>
       <w:r>
@@ -14183,62 +14211,1978 @@
       <w:r>
         <w:t xml:space="preserve">110- </w:t>
       </w:r>
+      <w:r>
+        <w:t xml:space="preserve">Aumentamos o espaço interno da </w:t>
+      </w:r>
+      <w:proofErr w:type="spellStart"/>
+      <w:r>
+        <w:t>section</w:t>
+      </w:r>
+      <w:proofErr w:type="spellEnd"/>
+      <w:r>
+        <w:t xml:space="preserve"> e adicionamos uma cor de fundo para fazer o degrade ou seja é a área onde duas ou mais cores são sobrepostas </w:t>
+      </w:r>
+    </w:p>
+    <w:p>
+      <w:pPr>
+        <w:tabs>
+          <w:tab w:val="left" w:pos="3105"/>
+        </w:tabs>
+      </w:pPr>
+      <w:r>
+        <w:rPr>
+          <w:noProof/>
+        </w:rPr>
+        <w:drawing>
+          <wp:inline distT="0" distB="0" distL="0" distR="0" wp14:anchorId="7E8B04A2" wp14:editId="77D68A12">
+            <wp:extent cx="2057687" cy="990738"/>
+            <wp:effectExtent l="0" t="0" r="0" b="0"/>
+            <wp:docPr id="171" name="Imagem 171"/>
+            <wp:cNvGraphicFramePr>
+              <a:graphicFrameLocks xmlns:a="http://schemas.openxmlformats.org/drawingml/2006/main" noChangeAspect="1"/>
+            </wp:cNvGraphicFramePr>
+            <a:graphic xmlns:a="http://schemas.openxmlformats.org/drawingml/2006/main">
+              <a:graphicData uri="http://schemas.openxmlformats.org/drawingml/2006/picture">
+                <pic:pic xmlns:pic="http://schemas.openxmlformats.org/drawingml/2006/picture">
+                  <pic:nvPicPr>
+                    <pic:cNvPr id="1" name=""/>
+                    <pic:cNvPicPr/>
+                  </pic:nvPicPr>
+                  <pic:blipFill>
+                    <a:blip r:embed="rId183"/>
+                    <a:stretch>
+                      <a:fillRect/>
+                    </a:stretch>
+                  </pic:blipFill>
+                  <pic:spPr>
+                    <a:xfrm>
+                      <a:off x="0" y="0"/>
+                      <a:ext cx="2057687" cy="990738"/>
+                    </a:xfrm>
+                    <a:prstGeom prst="rect">
+                      <a:avLst/>
+                    </a:prstGeom>
+                  </pic:spPr>
+                </pic:pic>
+              </a:graphicData>
+            </a:graphic>
+          </wp:inline>
+        </w:drawing>
+      </w:r>
+    </w:p>
+    <w:p>
+      <w:pPr>
+        <w:tabs>
+          <w:tab w:val="left" w:pos="3105"/>
+        </w:tabs>
+      </w:pPr>
+    </w:p>
+    <w:p>
+      <w:pPr>
+        <w:tabs>
+          <w:tab w:val="left" w:pos="3105"/>
+        </w:tabs>
+      </w:pPr>
+      <w:r>
+        <w:t xml:space="preserve">111- Colocamos uma cor de fundo na </w:t>
+      </w:r>
+      <w:proofErr w:type="spellStart"/>
+      <w:r>
+        <w:t>section</w:t>
+      </w:r>
+      <w:proofErr w:type="spellEnd"/>
+      <w:r>
+        <w:t xml:space="preserve"> benefícios para realizar o noss</w:t>
+      </w:r>
+      <w:r>
+        <w:t>o</w:t>
+      </w:r>
+      <w:r>
+        <w:t xml:space="preserve"> degrade </w:t>
+      </w:r>
+    </w:p>
+    <w:p>
+      <w:pPr>
+        <w:tabs>
+          <w:tab w:val="left" w:pos="3105"/>
+        </w:tabs>
+      </w:pPr>
+      <w:r>
+        <w:rPr>
+          <w:noProof/>
+        </w:rPr>
+        <w:drawing>
+          <wp:inline distT="0" distB="0" distL="0" distR="0" wp14:anchorId="0C13DDB1" wp14:editId="214D6C16">
+            <wp:extent cx="2067213" cy="695422"/>
+            <wp:effectExtent l="0" t="0" r="9525" b="9525"/>
+            <wp:docPr id="173" name="Imagem 173"/>
+            <wp:cNvGraphicFramePr>
+              <a:graphicFrameLocks xmlns:a="http://schemas.openxmlformats.org/drawingml/2006/main" noChangeAspect="1"/>
+            </wp:cNvGraphicFramePr>
+            <a:graphic xmlns:a="http://schemas.openxmlformats.org/drawingml/2006/main">
+              <a:graphicData uri="http://schemas.openxmlformats.org/drawingml/2006/picture">
+                <pic:pic xmlns:pic="http://schemas.openxmlformats.org/drawingml/2006/picture">
+                  <pic:nvPicPr>
+                    <pic:cNvPr id="1" name=""/>
+                    <pic:cNvPicPr/>
+                  </pic:nvPicPr>
+                  <pic:blipFill>
+                    <a:blip r:embed="rId184"/>
+                    <a:stretch>
+                      <a:fillRect/>
+                    </a:stretch>
+                  </pic:blipFill>
+                  <pic:spPr>
+                    <a:xfrm>
+                      <a:off x="0" y="0"/>
+                      <a:ext cx="2067213" cy="695422"/>
+                    </a:xfrm>
+                    <a:prstGeom prst="rect">
+                      <a:avLst/>
+                    </a:prstGeom>
+                  </pic:spPr>
+                </pic:pic>
+              </a:graphicData>
+            </a:graphic>
+          </wp:inline>
+        </w:drawing>
+      </w:r>
+    </w:p>
+    <w:p>
+      <w:pPr>
+        <w:tabs>
+          <w:tab w:val="left" w:pos="3105"/>
+        </w:tabs>
+      </w:pPr>
+    </w:p>
+    <w:p>
+      <w:pPr>
+        <w:tabs>
+          <w:tab w:val="left" w:pos="3105"/>
+        </w:tabs>
+      </w:pPr>
+      <w:r>
+        <w:t xml:space="preserve">112- </w:t>
+      </w:r>
+      <w:r>
+        <w:t xml:space="preserve">Para fazer o degrade tiramos o </w:t>
+      </w:r>
+      <w:proofErr w:type="spellStart"/>
+      <w:r>
+        <w:t>main</w:t>
+      </w:r>
+      <w:proofErr w:type="spellEnd"/>
+      <w:r>
+        <w:t xml:space="preserve"> que estava configurando a largura de 940px e centralizando o elemento em margin:0 auto,</w:t>
+      </w:r>
+    </w:p>
+    <w:p>
+      <w:pPr>
+        <w:tabs>
+          <w:tab w:val="left" w:pos="3105"/>
+        </w:tabs>
+      </w:pPr>
+      <w:proofErr w:type="spellStart"/>
+      <w:proofErr w:type="gramStart"/>
+      <w:r>
+        <w:t>Main</w:t>
+      </w:r>
+      <w:proofErr w:type="spellEnd"/>
+      <w:r>
+        <w:t>{</w:t>
+      </w:r>
+      <w:proofErr w:type="gramEnd"/>
+    </w:p>
+    <w:p>
+      <w:pPr>
+        <w:tabs>
+          <w:tab w:val="left" w:pos="3105"/>
+        </w:tabs>
+      </w:pPr>
+      <w:r>
+        <w:t>Width:940px</w:t>
+      </w:r>
+    </w:p>
+    <w:p>
+      <w:pPr>
+        <w:tabs>
+          <w:tab w:val="left" w:pos="3105"/>
+        </w:tabs>
+      </w:pPr>
+      <w:r>
+        <w:t>Margin:0 auto</w:t>
+      </w:r>
+    </w:p>
+    <w:p>
+      <w:pPr>
+        <w:tabs>
+          <w:tab w:val="left" w:pos="3105"/>
+        </w:tabs>
+      </w:pPr>
+      <w:r>
+        <w:t>}</w:t>
+      </w:r>
+    </w:p>
+    <w:p>
+      <w:pPr>
+        <w:tabs>
+          <w:tab w:val="left" w:pos="3105"/>
+        </w:tabs>
+      </w:pPr>
+      <w:r>
+        <w:t xml:space="preserve">Isso fazia com que todo o conteúdo do </w:t>
+      </w:r>
+      <w:proofErr w:type="spellStart"/>
+      <w:r>
+        <w:t>main</w:t>
+      </w:r>
+      <w:proofErr w:type="spellEnd"/>
+      <w:r>
+        <w:t xml:space="preserve"> ficasse limitado a 940px e centralizamos na </w:t>
+      </w:r>
+      <w:proofErr w:type="spellStart"/>
+      <w:r>
+        <w:t>pagina</w:t>
+      </w:r>
+      <w:proofErr w:type="spellEnd"/>
+      <w:r>
+        <w:t xml:space="preserve">. Consequentemente, quando colocávamos uma cor de fundo nos </w:t>
+      </w:r>
+      <w:proofErr w:type="spellStart"/>
+      <w:r>
+        <w:t>section</w:t>
+      </w:r>
+      <w:proofErr w:type="spellEnd"/>
+      <w:r>
+        <w:t>. O fundo também ficava limitado a essa largura.</w:t>
+      </w:r>
+    </w:p>
+    <w:p>
+      <w:pPr>
+        <w:tabs>
+          <w:tab w:val="left" w:pos="3105"/>
+        </w:tabs>
+      </w:pPr>
+      <w:r>
+        <w:t>Para permitir que cada seção tivesse seu próprio fundo e, ao mesmo tempo, manter o conteúdo centraliza</w:t>
+      </w:r>
+      <w:r>
+        <w:t xml:space="preserve">do, retiramos o </w:t>
+      </w:r>
+      <w:proofErr w:type="spellStart"/>
+      <w:r>
+        <w:t>width</w:t>
+      </w:r>
+      <w:proofErr w:type="spellEnd"/>
+      <w:r>
+        <w:t xml:space="preserve"> e o </w:t>
+      </w:r>
+      <w:proofErr w:type="spellStart"/>
+      <w:r>
+        <w:t>margin</w:t>
+      </w:r>
+      <w:proofErr w:type="spellEnd"/>
+      <w:r>
+        <w:t xml:space="preserve"> do </w:t>
+      </w:r>
+      <w:proofErr w:type="spellStart"/>
+      <w:r>
+        <w:t>main</w:t>
+      </w:r>
+      <w:proofErr w:type="spellEnd"/>
+      <w:r>
+        <w:t xml:space="preserve"> e passamos esse controle para seções principais</w:t>
+      </w:r>
+      <w:r>
+        <w:t xml:space="preserve"> </w:t>
+      </w:r>
+    </w:p>
+    <w:p>
+      <w:pPr>
+        <w:tabs>
+          <w:tab w:val="left" w:pos="3105"/>
+        </w:tabs>
+      </w:pPr>
+      <w:r>
+        <w:rPr>
+          <w:noProof/>
+        </w:rPr>
+        <w:drawing>
+          <wp:inline distT="0" distB="0" distL="0" distR="0" wp14:anchorId="12C8A7F1">
+            <wp:extent cx="2133600" cy="1171575"/>
+            <wp:effectExtent l="0" t="0" r="0" b="9525"/>
+            <wp:docPr id="178" name="Imagem 178"/>
+            <wp:cNvGraphicFramePr>
+              <a:graphicFrameLocks xmlns:a="http://schemas.openxmlformats.org/drawingml/2006/main" noChangeAspect="1"/>
+            </wp:cNvGraphicFramePr>
+            <a:graphic xmlns:a="http://schemas.openxmlformats.org/drawingml/2006/main">
+              <a:graphicData uri="http://schemas.openxmlformats.org/drawingml/2006/picture">
+                <pic:pic xmlns:pic="http://schemas.openxmlformats.org/drawingml/2006/picture">
+                  <pic:nvPicPr>
+                    <pic:cNvPr id="0" name="Picture 5"/>
+                    <pic:cNvPicPr>
+                      <a:picLocks noChangeAspect="1" noChangeArrowheads="1"/>
+                    </pic:cNvPicPr>
+                  </pic:nvPicPr>
+                  <pic:blipFill>
+                    <a:blip r:embed="rId185">
+                      <a:extLst>
+                        <a:ext uri="{28A0092B-C50C-407E-A947-70E740481C1C}">
+                          <a14:useLocalDpi xmlns:a14="http://schemas.microsoft.com/office/drawing/2010/main" val="0"/>
+                        </a:ext>
+                      </a:extLst>
+                    </a:blip>
+                    <a:srcRect/>
+                    <a:stretch>
+                      <a:fillRect/>
+                    </a:stretch>
+                  </pic:blipFill>
+                  <pic:spPr bwMode="auto">
+                    <a:xfrm>
+                      <a:off x="0" y="0"/>
+                      <a:ext cx="2133600" cy="1171575"/>
+                    </a:xfrm>
+                    <a:prstGeom prst="rect">
+                      <a:avLst/>
+                    </a:prstGeom>
+                    <a:noFill/>
+                  </pic:spPr>
+                </pic:pic>
+              </a:graphicData>
+            </a:graphic>
+          </wp:inline>
+        </w:drawing>
+      </w:r>
+      <w:r>
+        <w:rPr>
+          <w:noProof/>
+        </w:rPr>
+        <w:drawing>
+          <wp:inline distT="0" distB="0" distL="0" distR="0" wp14:anchorId="6AF37D07" wp14:editId="1A10578E">
+            <wp:extent cx="2095500" cy="704850"/>
+            <wp:effectExtent l="0" t="0" r="0" b="0"/>
+            <wp:docPr id="176" name="Imagem 176"/>
+            <wp:cNvGraphicFramePr>
+              <a:graphicFrameLocks xmlns:a="http://schemas.openxmlformats.org/drawingml/2006/main" noChangeAspect="1"/>
+            </wp:cNvGraphicFramePr>
+            <a:graphic xmlns:a="http://schemas.openxmlformats.org/drawingml/2006/main">
+              <a:graphicData uri="http://schemas.openxmlformats.org/drawingml/2006/picture">
+                <pic:pic xmlns:pic="http://schemas.openxmlformats.org/drawingml/2006/picture">
+                  <pic:nvPicPr>
+                    <pic:cNvPr id="0" name="Picture 3"/>
+                    <pic:cNvPicPr>
+                      <a:picLocks noChangeAspect="1" noChangeArrowheads="1"/>
+                    </pic:cNvPicPr>
+                  </pic:nvPicPr>
+                  <pic:blipFill>
+                    <a:blip r:embed="rId186">
+                      <a:extLst>
+                        <a:ext uri="{28A0092B-C50C-407E-A947-70E740481C1C}">
+                          <a14:useLocalDpi xmlns:a14="http://schemas.microsoft.com/office/drawing/2010/main" val="0"/>
+                        </a:ext>
+                      </a:extLst>
+                    </a:blip>
+                    <a:srcRect/>
+                    <a:stretch>
+                      <a:fillRect/>
+                    </a:stretch>
+                  </pic:blipFill>
+                  <pic:spPr bwMode="auto">
+                    <a:xfrm>
+                      <a:off x="0" y="0"/>
+                      <a:ext cx="2095500" cy="704850"/>
+                    </a:xfrm>
+                    <a:prstGeom prst="rect">
+                      <a:avLst/>
+                    </a:prstGeom>
+                    <a:noFill/>
+                  </pic:spPr>
+                </pic:pic>
+              </a:graphicData>
+            </a:graphic>
+          </wp:inline>
+        </w:drawing>
+      </w:r>
+    </w:p>
+    <w:p>
+      <w:pPr>
+        <w:tabs>
+          <w:tab w:val="left" w:pos="3105"/>
+        </w:tabs>
+      </w:pPr>
+    </w:p>
+    <w:p>
+      <w:pPr>
+        <w:tabs>
+          <w:tab w:val="left" w:pos="3105"/>
+        </w:tabs>
+      </w:pPr>
+      <w:r>
+        <w:t xml:space="preserve">113- </w:t>
+      </w:r>
+      <w:r>
+        <w:t>Centralizando o mapa</w:t>
+      </w:r>
+    </w:p>
+    <w:p>
+      <w:pPr>
+        <w:tabs>
+          <w:tab w:val="left" w:pos="3105"/>
+        </w:tabs>
+      </w:pPr>
+      <w:r>
+        <w:t xml:space="preserve">Durante os ajustes percebemos que o mapa não estava centralizado corretamente </w:t>
+      </w:r>
+    </w:p>
+    <w:p>
+      <w:pPr>
+        <w:tabs>
+          <w:tab w:val="left" w:pos="3105"/>
+        </w:tabs>
+      </w:pPr>
+      <w:r>
+        <w:t xml:space="preserve">Para solucionar esse problema, criamos uma </w:t>
+      </w:r>
+      <w:proofErr w:type="spellStart"/>
+      <w:r>
+        <w:t>div</w:t>
+      </w:r>
+      <w:proofErr w:type="spellEnd"/>
+      <w:r>
+        <w:t xml:space="preserve"> chamada mapa-</w:t>
+      </w:r>
+      <w:proofErr w:type="spellStart"/>
+      <w:r>
+        <w:t>conteudo</w:t>
+      </w:r>
+      <w:proofErr w:type="spellEnd"/>
+      <w:r>
+        <w:t xml:space="preserve">. Responsável por envolver o mapa </w:t>
+      </w:r>
+    </w:p>
+    <w:p>
+      <w:pPr>
+        <w:tabs>
+          <w:tab w:val="left" w:pos="3105"/>
+        </w:tabs>
+      </w:pPr>
+      <w:r>
+        <w:rPr>
+          <w:noProof/>
+        </w:rPr>
+        <w:drawing>
+          <wp:inline distT="0" distB="0" distL="0" distR="0" wp14:anchorId="7111FCFC">
+            <wp:extent cx="6124127" cy="666750"/>
+            <wp:effectExtent l="0" t="0" r="0" b="0"/>
+            <wp:docPr id="179" name="Imagem 179"/>
+            <wp:cNvGraphicFramePr>
+              <a:graphicFrameLocks xmlns:a="http://schemas.openxmlformats.org/drawingml/2006/main" noChangeAspect="1"/>
+            </wp:cNvGraphicFramePr>
+            <a:graphic xmlns:a="http://schemas.openxmlformats.org/drawingml/2006/main">
+              <a:graphicData uri="http://schemas.openxmlformats.org/drawingml/2006/picture">
+                <pic:pic xmlns:pic="http://schemas.openxmlformats.org/drawingml/2006/picture">
+                  <pic:nvPicPr>
+                    <pic:cNvPr id="0" name="Picture 6"/>
+                    <pic:cNvPicPr>
+                      <a:picLocks noChangeAspect="1" noChangeArrowheads="1"/>
+                    </pic:cNvPicPr>
+                  </pic:nvPicPr>
+                  <pic:blipFill>
+                    <a:blip r:embed="rId187">
+                      <a:extLst>
+                        <a:ext uri="{28A0092B-C50C-407E-A947-70E740481C1C}">
+                          <a14:useLocalDpi xmlns:a14="http://schemas.microsoft.com/office/drawing/2010/main" val="0"/>
+                        </a:ext>
+                      </a:extLst>
+                    </a:blip>
+                    <a:srcRect/>
+                    <a:stretch>
+                      <a:fillRect/>
+                    </a:stretch>
+                  </pic:blipFill>
+                  <pic:spPr bwMode="auto">
+                    <a:xfrm>
+                      <a:off x="0" y="0"/>
+                      <a:ext cx="6242809" cy="679671"/>
+                    </a:xfrm>
+                    <a:prstGeom prst="rect">
+                      <a:avLst/>
+                    </a:prstGeom>
+                    <a:noFill/>
+                  </pic:spPr>
+                </pic:pic>
+              </a:graphicData>
+            </a:graphic>
+          </wp:inline>
+        </w:drawing>
+      </w:r>
+    </w:p>
+    <w:p>
+      <w:pPr>
+        <w:tabs>
+          <w:tab w:val="left" w:pos="3105"/>
+        </w:tabs>
+      </w:pPr>
+      <w:r>
+        <w:rPr>
+          <w:noProof/>
+        </w:rPr>
+        <w:drawing>
+          <wp:inline distT="0" distB="0" distL="0" distR="0" wp14:anchorId="6FB0DDE3">
+            <wp:extent cx="1400175" cy="619125"/>
+            <wp:effectExtent l="0" t="0" r="9525" b="9525"/>
+            <wp:docPr id="180" name="Imagem 180"/>
+            <wp:cNvGraphicFramePr>
+              <a:graphicFrameLocks xmlns:a="http://schemas.openxmlformats.org/drawingml/2006/main" noChangeAspect="1"/>
+            </wp:cNvGraphicFramePr>
+            <a:graphic xmlns:a="http://schemas.openxmlformats.org/drawingml/2006/main">
+              <a:graphicData uri="http://schemas.openxmlformats.org/drawingml/2006/picture">
+                <pic:pic xmlns:pic="http://schemas.openxmlformats.org/drawingml/2006/picture">
+                  <pic:nvPicPr>
+                    <pic:cNvPr id="0" name="Picture 7"/>
+                    <pic:cNvPicPr>
+                      <a:picLocks noChangeAspect="1" noChangeArrowheads="1"/>
+                    </pic:cNvPicPr>
+                  </pic:nvPicPr>
+                  <pic:blipFill>
+                    <a:blip r:embed="rId188">
+                      <a:extLst>
+                        <a:ext uri="{28A0092B-C50C-407E-A947-70E740481C1C}">
+                          <a14:useLocalDpi xmlns:a14="http://schemas.microsoft.com/office/drawing/2010/main" val="0"/>
+                        </a:ext>
+                      </a:extLst>
+                    </a:blip>
+                    <a:srcRect/>
+                    <a:stretch>
+                      <a:fillRect/>
+                    </a:stretch>
+                  </pic:blipFill>
+                  <pic:spPr bwMode="auto">
+                    <a:xfrm>
+                      <a:off x="0" y="0"/>
+                      <a:ext cx="1400175" cy="619125"/>
+                    </a:xfrm>
+                    <a:prstGeom prst="rect">
+                      <a:avLst/>
+                    </a:prstGeom>
+                    <a:noFill/>
+                  </pic:spPr>
+                </pic:pic>
+              </a:graphicData>
+            </a:graphic>
+          </wp:inline>
+        </w:drawing>
+      </w:r>
+    </w:p>
+    <w:p>
+      <w:pPr>
+        <w:tabs>
+          <w:tab w:val="left" w:pos="3105"/>
+        </w:tabs>
+      </w:pPr>
+    </w:p>
+    <w:p>
+      <w:pPr>
+        <w:tabs>
+          <w:tab w:val="left" w:pos="3105"/>
+        </w:tabs>
+      </w:pPr>
+      <w:r>
+        <w:t xml:space="preserve">114- </w:t>
+      </w:r>
+      <w:r>
+        <w:t xml:space="preserve">Dessa forma, o fundo da </w:t>
+      </w:r>
+      <w:proofErr w:type="gramStart"/>
+      <w:r>
+        <w:t>seção .mapa</w:t>
+      </w:r>
+      <w:proofErr w:type="gramEnd"/>
+      <w:r>
+        <w:t xml:space="preserve"> pode ocupar toda área disponível, enquanto o conteúdo do mapa permanece centralizado em uma largura de 940px  </w:t>
+      </w:r>
+    </w:p>
+    <w:p>
+      <w:pPr>
+        <w:tabs>
+          <w:tab w:val="left" w:pos="3105"/>
+        </w:tabs>
+      </w:pPr>
+      <w:r>
+        <w:t xml:space="preserve">           Aplicando o degrade </w:t>
+      </w:r>
+    </w:p>
+    <w:p>
+      <w:pPr>
+        <w:tabs>
+          <w:tab w:val="left" w:pos="3105"/>
+        </w:tabs>
+      </w:pPr>
+      <w:r>
+        <w:t xml:space="preserve"> </w:t>
+      </w:r>
+      <w:r>
+        <w:t>Por fim, aplicamos o degrade na seção mapa</w:t>
+      </w:r>
+    </w:p>
+    <w:p>
+      <w:pPr>
+        <w:tabs>
+          <w:tab w:val="left" w:pos="3105"/>
+        </w:tabs>
+      </w:pPr>
+      <w:r>
+        <w:rPr>
+          <w:noProof/>
+        </w:rPr>
+        <w:drawing>
+          <wp:inline distT="0" distB="0" distL="0" distR="0" wp14:anchorId="2CEB36DD">
+            <wp:extent cx="3391535" cy="819150"/>
+            <wp:effectExtent l="0" t="0" r="0" b="0"/>
+            <wp:docPr id="181" name="Imagem 181"/>
+            <wp:cNvGraphicFramePr>
+              <a:graphicFrameLocks xmlns:a="http://schemas.openxmlformats.org/drawingml/2006/main" noChangeAspect="1"/>
+            </wp:cNvGraphicFramePr>
+            <a:graphic xmlns:a="http://schemas.openxmlformats.org/drawingml/2006/main">
+              <a:graphicData uri="http://schemas.openxmlformats.org/drawingml/2006/picture">
+                <pic:pic xmlns:pic="http://schemas.openxmlformats.org/drawingml/2006/picture">
+                  <pic:nvPicPr>
+                    <pic:cNvPr id="0" name="Picture 8"/>
+                    <pic:cNvPicPr>
+                      <a:picLocks noChangeAspect="1" noChangeArrowheads="1"/>
+                    </pic:cNvPicPr>
+                  </pic:nvPicPr>
+                  <pic:blipFill>
+                    <a:blip r:embed="rId189">
+                      <a:extLst>
+                        <a:ext uri="{28A0092B-C50C-407E-A947-70E740481C1C}">
+                          <a14:useLocalDpi xmlns:a14="http://schemas.microsoft.com/office/drawing/2010/main" val="0"/>
+                        </a:ext>
+                      </a:extLst>
+                    </a:blip>
+                    <a:srcRect/>
+                    <a:stretch>
+                      <a:fillRect/>
+                    </a:stretch>
+                  </pic:blipFill>
+                  <pic:spPr bwMode="auto">
+                    <a:xfrm>
+                      <a:off x="0" y="0"/>
+                      <a:ext cx="3391535" cy="819150"/>
+                    </a:xfrm>
+                    <a:prstGeom prst="rect">
+                      <a:avLst/>
+                    </a:prstGeom>
+                    <a:noFill/>
+                  </pic:spPr>
+                </pic:pic>
+              </a:graphicData>
+            </a:graphic>
+          </wp:inline>
+        </w:drawing>
+      </w:r>
+    </w:p>
+    <w:p>
+      <w:pPr>
+        <w:tabs>
+          <w:tab w:val="left" w:pos="3105"/>
+        </w:tabs>
+      </w:pPr>
+    </w:p>
+    <w:p>
+      <w:pPr>
+        <w:tabs>
+          <w:tab w:val="left" w:pos="3105"/>
+        </w:tabs>
+      </w:pPr>
+      <w:r>
+        <w:t xml:space="preserve">O objetivo é criar uma transição suave entre as cores </w:t>
+      </w:r>
+      <w:proofErr w:type="gramStart"/>
+      <w:r>
+        <w:t>das seção</w:t>
+      </w:r>
+      <w:proofErr w:type="gramEnd"/>
+      <w:r>
+        <w:t xml:space="preserve">. Como </w:t>
+      </w:r>
+      <w:r>
+        <w:t xml:space="preserve">o mapa está localizado entre a seção, degrade cria uma transição visual entre esses </w:t>
+      </w:r>
+      <w:proofErr w:type="gramStart"/>
+      <w:r>
+        <w:t>diferentes fundo</w:t>
+      </w:r>
+      <w:proofErr w:type="gramEnd"/>
+      <w:r>
+        <w:t>.</w:t>
+      </w:r>
+    </w:p>
+    <w:p>
+      <w:pPr>
+        <w:tabs>
+          <w:tab w:val="left" w:pos="3105"/>
+        </w:tabs>
+      </w:pPr>
+    </w:p>
+    <w:p>
+      <w:pPr>
+        <w:tabs>
+          <w:tab w:val="left" w:pos="3105"/>
+        </w:tabs>
+      </w:pPr>
+    </w:p>
+    <w:p>
+      <w:pPr>
+        <w:tabs>
+          <w:tab w:val="left" w:pos="3105"/>
+        </w:tabs>
+      </w:pPr>
+    </w:p>
+    <w:p>
+      <w:pPr>
+        <w:tabs>
+          <w:tab w:val="left" w:pos="3105"/>
+        </w:tabs>
+      </w:pPr>
+    </w:p>
+    <w:p>
+      <w:pPr>
+        <w:tabs>
+          <w:tab w:val="left" w:pos="3105"/>
+        </w:tabs>
+      </w:pPr>
+      <w:r>
+        <w:t>115-</w:t>
+      </w:r>
+      <w:r>
+        <w:t xml:space="preserve"> </w:t>
+      </w:r>
+      <w:r>
+        <w:t xml:space="preserve">Testamos o degrade diversos tipos com </w:t>
+      </w:r>
+      <w:r>
+        <w:t>mais de 3 cores usando:</w:t>
+      </w:r>
+    </w:p>
+    <w:p>
+      <w:pPr>
+        <w:pStyle w:val="PargrafodaLista"/>
+        <w:numPr>
+          <w:ilvl w:val="0"/>
+          <w:numId w:val="3"/>
+        </w:numPr>
+        <w:tabs>
+          <w:tab w:val="left" w:pos="3105"/>
+        </w:tabs>
+      </w:pPr>
+      <w:r>
+        <w:t xml:space="preserve"> </w:t>
+      </w:r>
+      <w:proofErr w:type="spellStart"/>
+      <w:r>
+        <w:t>Backgrond</w:t>
+      </w:r>
+      <w:proofErr w:type="spellEnd"/>
+      <w:r>
+        <w:t>: linear-</w:t>
+      </w:r>
+      <w:proofErr w:type="spellStart"/>
+      <w:proofErr w:type="gramStart"/>
+      <w:r>
+        <w:t>gradient</w:t>
+      </w:r>
+      <w:proofErr w:type="spellEnd"/>
+      <w:r>
+        <w:t>(</w:t>
+      </w:r>
+      <w:proofErr w:type="gramEnd"/>
+      <w:r>
+        <w:t xml:space="preserve">Orange, blue, </w:t>
+      </w:r>
+      <w:proofErr w:type="spellStart"/>
+      <w:r>
+        <w:t>red</w:t>
+      </w:r>
+      <w:proofErr w:type="spellEnd"/>
+      <w:r>
+        <w:t>)</w:t>
+      </w:r>
+    </w:p>
+    <w:p>
+      <w:pPr>
+        <w:pStyle w:val="PargrafodaLista"/>
+        <w:numPr>
+          <w:ilvl w:val="0"/>
+          <w:numId w:val="3"/>
+        </w:numPr>
+        <w:tabs>
+          <w:tab w:val="left" w:pos="3105"/>
+        </w:tabs>
+      </w:pPr>
+      <w:r>
+        <w:t xml:space="preserve">Colocamos em graus (45deg, Orange, blue, </w:t>
+      </w:r>
+      <w:proofErr w:type="spellStart"/>
+      <w:r>
+        <w:t>red</w:t>
+      </w:r>
+      <w:proofErr w:type="spellEnd"/>
+      <w:r>
+        <w:t xml:space="preserve"> e </w:t>
+      </w:r>
+      <w:proofErr w:type="spellStart"/>
+      <w:r>
+        <w:t>black</w:t>
+      </w:r>
+      <w:proofErr w:type="spellEnd"/>
+      <w:r>
+        <w:t>)</w:t>
+      </w:r>
+    </w:p>
+    <w:p>
+      <w:pPr>
+        <w:pStyle w:val="PargrafodaLista"/>
+        <w:numPr>
+          <w:ilvl w:val="0"/>
+          <w:numId w:val="3"/>
+        </w:numPr>
+        <w:tabs>
+          <w:tab w:val="left" w:pos="3105"/>
+        </w:tabs>
+      </w:pPr>
+      <w:r>
+        <w:t xml:space="preserve">Utilizamos porcentagem para cada cor por exemplo: </w:t>
+      </w:r>
+      <w:proofErr w:type="gramStart"/>
+      <w:r>
+        <w:t xml:space="preserve">( </w:t>
+      </w:r>
+      <w:proofErr w:type="spellStart"/>
+      <w:r>
+        <w:t>Orage</w:t>
+      </w:r>
+      <w:proofErr w:type="spellEnd"/>
+      <w:proofErr w:type="gramEnd"/>
+      <w:r>
+        <w:t xml:space="preserve"> 50%, Blue, </w:t>
+      </w:r>
+      <w:proofErr w:type="spellStart"/>
+      <w:r>
+        <w:t>red</w:t>
+      </w:r>
+      <w:proofErr w:type="spellEnd"/>
+      <w:r>
+        <w:t xml:space="preserve">, </w:t>
+      </w:r>
+      <w:proofErr w:type="spellStart"/>
+      <w:r>
+        <w:t>black</w:t>
+      </w:r>
+      <w:proofErr w:type="spellEnd"/>
+      <w:r>
+        <w:t>)</w:t>
+      </w:r>
+    </w:p>
+    <w:p>
+      <w:pPr>
+        <w:pStyle w:val="PargrafodaLista"/>
+        <w:numPr>
+          <w:ilvl w:val="0"/>
+          <w:numId w:val="3"/>
+        </w:numPr>
+        <w:tabs>
+          <w:tab w:val="left" w:pos="3105"/>
+        </w:tabs>
+      </w:pPr>
+      <w:r>
+        <w:t>E também podemos utilizar o degrade em círculos: Background: radial-</w:t>
+      </w:r>
+      <w:proofErr w:type="spellStart"/>
+      <w:proofErr w:type="gramStart"/>
+      <w:r>
+        <w:t>gradient</w:t>
+      </w:r>
+      <w:proofErr w:type="spellEnd"/>
+      <w:r>
+        <w:t>(</w:t>
+      </w:r>
+      <w:proofErr w:type="gramEnd"/>
+      <w:r>
+        <w:t>Orange, blue</w:t>
+      </w:r>
+      <w:r>
+        <w:t xml:space="preserve"> </w:t>
+      </w:r>
+      <w:r>
+        <w:t>,</w:t>
+      </w:r>
+      <w:proofErr w:type="spellStart"/>
+      <w:r>
+        <w:t>black</w:t>
+      </w:r>
+      <w:proofErr w:type="spellEnd"/>
+      <w:r>
+        <w:t>)</w:t>
+      </w:r>
+    </w:p>
+    <w:p>
+      <w:pPr>
+        <w:tabs>
+          <w:tab w:val="left" w:pos="3105"/>
+        </w:tabs>
+      </w:pPr>
+    </w:p>
+    <w:p>
+      <w:pPr>
+        <w:tabs>
+          <w:tab w:val="left" w:pos="3105"/>
+        </w:tabs>
+      </w:pPr>
+      <w:r>
+        <w:t>116-</w:t>
+      </w:r>
+      <w:r>
+        <w:t xml:space="preserve"> </w:t>
+      </w:r>
+      <w:r>
+        <w:rPr>
+          <w:b/>
+        </w:rPr>
+        <w:t>Capacidade e sombra</w:t>
+      </w:r>
+    </w:p>
+    <w:p>
+      <w:pPr>
+        <w:tabs>
+          <w:tab w:val="left" w:pos="3105"/>
+        </w:tabs>
+      </w:pPr>
+      <w:r>
+        <w:t>O que é capacidade?</w:t>
+      </w:r>
+    </w:p>
+    <w:p>
+      <w:pPr>
+        <w:tabs>
+          <w:tab w:val="left" w:pos="3105"/>
+        </w:tabs>
+      </w:pPr>
+      <w:r>
+        <w:t>Capacidade é uma camada a mais que coloca em cima do elemento</w:t>
+      </w:r>
+    </w:p>
+    <w:p>
+      <w:pPr>
+        <w:tabs>
+          <w:tab w:val="left" w:pos="3105"/>
+        </w:tabs>
+      </w:pPr>
+      <w:r>
+        <w:t xml:space="preserve">essa camada ajuda a luz a passar ou não como for exemplo: um tipo de insulfilme de um carro que ao ser aplicado ajuda a luz do lado de fora a não passar completamente </w:t>
+      </w:r>
+    </w:p>
+    <w:p>
+      <w:pPr>
+        <w:tabs>
+          <w:tab w:val="left" w:pos="3105"/>
+        </w:tabs>
+      </w:pPr>
+      <w:r>
+        <w:t xml:space="preserve"> </w:t>
+      </w:r>
+      <w:r>
+        <w:t xml:space="preserve">na </w:t>
+      </w:r>
+      <w:proofErr w:type="spellStart"/>
+      <w:r>
+        <w:t>class</w:t>
+      </w:r>
+      <w:proofErr w:type="spellEnd"/>
+      <w:r>
+        <w:t xml:space="preserve"> imagem benefícios colocamos </w:t>
+      </w:r>
+      <w:proofErr w:type="spellStart"/>
+      <w:r>
+        <w:t>opacity</w:t>
+      </w:r>
+      <w:proofErr w:type="spellEnd"/>
+    </w:p>
+    <w:p>
+      <w:pPr>
+        <w:tabs>
+          <w:tab w:val="left" w:pos="3105"/>
+        </w:tabs>
+      </w:pPr>
+      <w:r>
+        <w:t xml:space="preserve">o </w:t>
+      </w:r>
+      <w:proofErr w:type="spellStart"/>
+      <w:r>
+        <w:t>opacity</w:t>
+      </w:r>
+      <w:proofErr w:type="spellEnd"/>
+      <w:r>
+        <w:t xml:space="preserve"> vai de 1 a 0 </w:t>
+      </w:r>
+    </w:p>
+    <w:p>
+      <w:pPr>
+        <w:pStyle w:val="PargrafodaLista"/>
+        <w:numPr>
+          <w:ilvl w:val="0"/>
+          <w:numId w:val="5"/>
+        </w:numPr>
+        <w:tabs>
+          <w:tab w:val="left" w:pos="3105"/>
+        </w:tabs>
+      </w:pPr>
+      <w:r>
+        <w:t>Exibe nada</w:t>
+      </w:r>
+    </w:p>
+    <w:p>
+      <w:pPr>
+        <w:pStyle w:val="PargrafodaLista"/>
+        <w:numPr>
+          <w:ilvl w:val="0"/>
+          <w:numId w:val="5"/>
+        </w:numPr>
+        <w:tabs>
+          <w:tab w:val="left" w:pos="3105"/>
+        </w:tabs>
+      </w:pPr>
+      <w:r>
+        <w:t>Exibe o elemento inteiro</w:t>
+      </w:r>
+    </w:p>
+    <w:p>
+      <w:pPr>
+        <w:tabs>
+          <w:tab w:val="left" w:pos="3105"/>
+        </w:tabs>
+      </w:pPr>
+      <w:r>
+        <w:t xml:space="preserve">       Então colocamos de 0</w:t>
+      </w:r>
+      <w:r>
+        <w:t xml:space="preserve">.3 que </w:t>
+      </w:r>
+      <w:proofErr w:type="gramStart"/>
+      <w:r>
+        <w:t>exibe  30</w:t>
+      </w:r>
+      <w:proofErr w:type="gramEnd"/>
+      <w:r>
+        <w:t>% ou 7.3 exibe 70%</w:t>
+      </w:r>
+    </w:p>
+    <w:p>
+      <w:pPr>
+        <w:tabs>
+          <w:tab w:val="left" w:pos="3105"/>
+        </w:tabs>
+      </w:pPr>
+    </w:p>
+    <w:p>
+      <w:pPr>
+        <w:tabs>
+          <w:tab w:val="left" w:pos="3105"/>
+        </w:tabs>
+      </w:pPr>
+      <w:r>
+        <w:t xml:space="preserve">117- </w:t>
+      </w:r>
+      <w:r>
+        <w:t xml:space="preserve">Aplicamos a </w:t>
+      </w:r>
+      <w:r>
+        <w:t xml:space="preserve">capacidade no nosso site utilizando o feito do houver que ao passar o mousse na imagem </w:t>
+      </w:r>
+      <w:proofErr w:type="spellStart"/>
+      <w:r>
+        <w:t>beneficios</w:t>
+      </w:r>
+      <w:proofErr w:type="spellEnd"/>
+      <w:r>
+        <w:t xml:space="preserve"> ele fica com apenas 30% de visibilidade e também adicionamos um </w:t>
+      </w:r>
+      <w:proofErr w:type="spellStart"/>
+      <w:r>
+        <w:t>transition</w:t>
+      </w:r>
+      <w:proofErr w:type="spellEnd"/>
+      <w:r>
+        <w:t xml:space="preserve"> para que ocorra um tempo para essa passagem ao utilizar o </w:t>
+      </w:r>
+      <w:proofErr w:type="spellStart"/>
+      <w:r>
+        <w:t>hover</w:t>
+      </w:r>
+      <w:proofErr w:type="spellEnd"/>
+    </w:p>
+    <w:p>
+      <w:pPr>
+        <w:tabs>
+          <w:tab w:val="left" w:pos="3105"/>
+        </w:tabs>
+      </w:pPr>
+      <w:r>
+        <w:rPr>
+          <w:noProof/>
+        </w:rPr>
+        <w:drawing>
+          <wp:inline distT="0" distB="0" distL="0" distR="0" wp14:anchorId="7735C062" wp14:editId="194776A7">
+            <wp:extent cx="1676634" cy="1848108"/>
+            <wp:effectExtent l="0" t="0" r="0" b="0"/>
+            <wp:docPr id="174" name="Imagem 174"/>
+            <wp:cNvGraphicFramePr>
+              <a:graphicFrameLocks xmlns:a="http://schemas.openxmlformats.org/drawingml/2006/main" noChangeAspect="1"/>
+            </wp:cNvGraphicFramePr>
+            <a:graphic xmlns:a="http://schemas.openxmlformats.org/drawingml/2006/main">
+              <a:graphicData uri="http://schemas.openxmlformats.org/drawingml/2006/picture">
+                <pic:pic xmlns:pic="http://schemas.openxmlformats.org/drawingml/2006/picture">
+                  <pic:nvPicPr>
+                    <pic:cNvPr id="1" name=""/>
+                    <pic:cNvPicPr/>
+                  </pic:nvPicPr>
+                  <pic:blipFill>
+                    <a:blip r:embed="rId190"/>
+                    <a:stretch>
+                      <a:fillRect/>
+                    </a:stretch>
+                  </pic:blipFill>
+                  <pic:spPr>
+                    <a:xfrm>
+                      <a:off x="0" y="0"/>
+                      <a:ext cx="1676634" cy="1848108"/>
+                    </a:xfrm>
+                    <a:prstGeom prst="rect">
+                      <a:avLst/>
+                    </a:prstGeom>
+                  </pic:spPr>
+                </pic:pic>
+              </a:graphicData>
+            </a:graphic>
+          </wp:inline>
+        </w:drawing>
+      </w:r>
+    </w:p>
+    <w:p>
+      <w:pPr>
+        <w:tabs>
+          <w:tab w:val="left" w:pos="3105"/>
+        </w:tabs>
+      </w:pPr>
+    </w:p>
+    <w:p>
+      <w:pPr>
+        <w:tabs>
+          <w:tab w:val="left" w:pos="3105"/>
+        </w:tabs>
+      </w:pPr>
+      <w:r>
+        <w:t xml:space="preserve">118- </w:t>
+      </w:r>
+      <w:r>
+        <w:rPr>
+          <w:b/>
+        </w:rPr>
+        <w:t>Sombra nos elementos</w:t>
+      </w:r>
+      <w:r>
+        <w:t xml:space="preserve"> </w:t>
+      </w:r>
+    </w:p>
+    <w:p>
+      <w:pPr>
+        <w:tabs>
+          <w:tab w:val="left" w:pos="3105"/>
+        </w:tabs>
+      </w:pPr>
+      <w:r>
+        <w:t>Como funciona a sombra?</w:t>
+      </w:r>
+    </w:p>
+    <w:p>
+      <w:pPr>
+        <w:tabs>
+          <w:tab w:val="left" w:pos="3105"/>
+        </w:tabs>
+      </w:pPr>
+      <w:r>
+        <w:t xml:space="preserve">É como se coloca uma luz em cima do elemento que vai refletir a sombra em baixo </w:t>
+      </w:r>
+    </w:p>
+    <w:p>
+      <w:pPr>
+        <w:tabs>
+          <w:tab w:val="left" w:pos="3105"/>
+        </w:tabs>
+      </w:pPr>
+      <w:r>
+        <w:t xml:space="preserve">Na </w:t>
+      </w:r>
+      <w:proofErr w:type="spellStart"/>
+      <w:r>
+        <w:t>class</w:t>
+      </w:r>
+      <w:proofErr w:type="spellEnd"/>
+      <w:r>
+        <w:t xml:space="preserve"> </w:t>
+      </w:r>
+      <w:proofErr w:type="spellStart"/>
+      <w:r>
+        <w:t>imagembeneficios</w:t>
+      </w:r>
+      <w:proofErr w:type="spellEnd"/>
+      <w:r>
+        <w:t xml:space="preserve"> vamos colocar box-</w:t>
+      </w:r>
+      <w:proofErr w:type="spellStart"/>
+      <w:r>
+        <w:t>shadow</w:t>
+      </w:r>
+      <w:proofErr w:type="spellEnd"/>
+      <w:r>
+        <w:t xml:space="preserve"> que significa sombra em caixa que possuem a propriedade </w:t>
+      </w:r>
+      <w:r>
+        <w:t>do eixo x e y parecido com o exemplo abaixo:</w:t>
+      </w:r>
+    </w:p>
+    <w:p>
+      <w:pPr>
+        <w:tabs>
+          <w:tab w:val="left" w:pos="3105"/>
+        </w:tabs>
+      </w:pPr>
+      <w:r>
+        <w:rPr>
+          <w:noProof/>
+        </w:rPr>
+        <w:drawing>
+          <wp:inline distT="0" distB="0" distL="0" distR="0" wp14:anchorId="2C023199">
+            <wp:extent cx="2458085" cy="1085850"/>
+            <wp:effectExtent l="0" t="0" r="0" b="0"/>
+            <wp:docPr id="175" name="Imagem 175"/>
+            <wp:cNvGraphicFramePr>
+              <a:graphicFrameLocks xmlns:a="http://schemas.openxmlformats.org/drawingml/2006/main" noChangeAspect="1"/>
+            </wp:cNvGraphicFramePr>
+            <a:graphic xmlns:a="http://schemas.openxmlformats.org/drawingml/2006/main">
+              <a:graphicData uri="http://schemas.openxmlformats.org/drawingml/2006/picture">
+                <pic:pic xmlns:pic="http://schemas.openxmlformats.org/drawingml/2006/picture">
+                  <pic:nvPicPr>
+                    <pic:cNvPr id="0" name="Picture 2"/>
+                    <pic:cNvPicPr>
+                      <a:picLocks noChangeAspect="1" noChangeArrowheads="1"/>
+                    </pic:cNvPicPr>
+                  </pic:nvPicPr>
+                  <pic:blipFill>
+                    <a:blip r:embed="rId191">
+                      <a:extLst>
+                        <a:ext uri="{28A0092B-C50C-407E-A947-70E740481C1C}">
+                          <a14:useLocalDpi xmlns:a14="http://schemas.microsoft.com/office/drawing/2010/main" val="0"/>
+                        </a:ext>
+                      </a:extLst>
+                    </a:blip>
+                    <a:srcRect/>
+                    <a:stretch>
+                      <a:fillRect/>
+                    </a:stretch>
+                  </pic:blipFill>
+                  <pic:spPr bwMode="auto">
+                    <a:xfrm>
+                      <a:off x="0" y="0"/>
+                      <a:ext cx="2458085" cy="1085850"/>
+                    </a:xfrm>
+                    <a:prstGeom prst="rect">
+                      <a:avLst/>
+                    </a:prstGeom>
+                    <a:noFill/>
+                  </pic:spPr>
+                </pic:pic>
+              </a:graphicData>
+            </a:graphic>
+          </wp:inline>
+        </w:drawing>
+      </w:r>
+    </w:p>
+    <w:p>
+      <w:pPr>
+        <w:tabs>
+          <w:tab w:val="left" w:pos="3105"/>
+        </w:tabs>
+      </w:pPr>
+    </w:p>
+    <w:p>
+      <w:pPr>
+        <w:tabs>
+          <w:tab w:val="left" w:pos="3105"/>
+        </w:tabs>
+      </w:pPr>
+      <w:r>
+        <w:t xml:space="preserve">119- Para espalhar a sombra utilizamos um valor chamado </w:t>
+      </w:r>
+      <w:proofErr w:type="spellStart"/>
+      <w:r>
+        <w:t>bluer</w:t>
+      </w:r>
+      <w:proofErr w:type="spellEnd"/>
+      <w:r>
+        <w:t xml:space="preserve"> </w:t>
+      </w:r>
+    </w:p>
+    <w:p>
+      <w:pPr>
+        <w:tabs>
+          <w:tab w:val="left" w:pos="3105"/>
+        </w:tabs>
+      </w:pPr>
+      <w:r>
+        <w:rPr>
+          <w:noProof/>
+        </w:rPr>
+        <w:drawing>
+          <wp:inline distT="0" distB="0" distL="0" distR="0" wp14:anchorId="4782865E">
+            <wp:extent cx="2257425" cy="1343025"/>
+            <wp:effectExtent l="0" t="0" r="9525" b="9525"/>
+            <wp:docPr id="177" name="Imagem 177"/>
+            <wp:cNvGraphicFramePr>
+              <a:graphicFrameLocks xmlns:a="http://schemas.openxmlformats.org/drawingml/2006/main" noChangeAspect="1"/>
+            </wp:cNvGraphicFramePr>
+            <a:graphic xmlns:a="http://schemas.openxmlformats.org/drawingml/2006/main">
+              <a:graphicData uri="http://schemas.openxmlformats.org/drawingml/2006/picture">
+                <pic:pic xmlns:pic="http://schemas.openxmlformats.org/drawingml/2006/picture">
+                  <pic:nvPicPr>
+                    <pic:cNvPr id="0" name="Picture 3"/>
+                    <pic:cNvPicPr>
+                      <a:picLocks noChangeAspect="1" noChangeArrowheads="1"/>
+                    </pic:cNvPicPr>
+                  </pic:nvPicPr>
+                  <pic:blipFill>
+                    <a:blip r:embed="rId192">
+                      <a:extLst>
+                        <a:ext uri="{28A0092B-C50C-407E-A947-70E740481C1C}">
+                          <a14:useLocalDpi xmlns:a14="http://schemas.microsoft.com/office/drawing/2010/main" val="0"/>
+                        </a:ext>
+                      </a:extLst>
+                    </a:blip>
+                    <a:srcRect/>
+                    <a:stretch>
+                      <a:fillRect/>
+                    </a:stretch>
+                  </pic:blipFill>
+                  <pic:spPr bwMode="auto">
+                    <a:xfrm>
+                      <a:off x="0" y="0"/>
+                      <a:ext cx="2257425" cy="1343025"/>
+                    </a:xfrm>
+                    <a:prstGeom prst="rect">
+                      <a:avLst/>
+                    </a:prstGeom>
+                    <a:noFill/>
+                  </pic:spPr>
+                </pic:pic>
+              </a:graphicData>
+            </a:graphic>
+          </wp:inline>
+        </w:drawing>
+      </w:r>
+    </w:p>
+    <w:p>
+      <w:pPr>
+        <w:tabs>
+          <w:tab w:val="left" w:pos="3105"/>
+        </w:tabs>
+      </w:pPr>
+      <w:r>
+        <w:rPr>
+          <w:noProof/>
+        </w:rPr>
+        <w:drawing>
+          <wp:inline distT="0" distB="0" distL="0" distR="0" wp14:anchorId="55630B1A">
+            <wp:extent cx="5296535" cy="2343785"/>
+            <wp:effectExtent l="0" t="0" r="0" b="0"/>
+            <wp:docPr id="182" name="Imagem 182"/>
+            <wp:cNvGraphicFramePr>
+              <a:graphicFrameLocks xmlns:a="http://schemas.openxmlformats.org/drawingml/2006/main" noChangeAspect="1"/>
+            </wp:cNvGraphicFramePr>
+            <a:graphic xmlns:a="http://schemas.openxmlformats.org/drawingml/2006/main">
+              <a:graphicData uri="http://schemas.openxmlformats.org/drawingml/2006/picture">
+                <pic:pic xmlns:pic="http://schemas.openxmlformats.org/drawingml/2006/picture">
+                  <pic:nvPicPr>
+                    <pic:cNvPr id="0" name="Picture 4"/>
+                    <pic:cNvPicPr>
+                      <a:picLocks noChangeAspect="1" noChangeArrowheads="1"/>
+                    </pic:cNvPicPr>
+                  </pic:nvPicPr>
+                  <pic:blipFill>
+                    <a:blip r:embed="rId193">
+                      <a:extLst>
+                        <a:ext uri="{28A0092B-C50C-407E-A947-70E740481C1C}">
+                          <a14:useLocalDpi xmlns:a14="http://schemas.microsoft.com/office/drawing/2010/main" val="0"/>
+                        </a:ext>
+                      </a:extLst>
+                    </a:blip>
+                    <a:srcRect/>
+                    <a:stretch>
+                      <a:fillRect/>
+                    </a:stretch>
+                  </pic:blipFill>
+                  <pic:spPr bwMode="auto">
+                    <a:xfrm>
+                      <a:off x="0" y="0"/>
+                      <a:ext cx="5296535" cy="2343785"/>
+                    </a:xfrm>
+                    <a:prstGeom prst="rect">
+                      <a:avLst/>
+                    </a:prstGeom>
+                    <a:noFill/>
+                  </pic:spPr>
+                </pic:pic>
+              </a:graphicData>
+            </a:graphic>
+          </wp:inline>
+        </w:drawing>
+      </w:r>
+    </w:p>
+    <w:p>
+      <w:pPr>
+        <w:tabs>
+          <w:tab w:val="left" w:pos="3105"/>
+        </w:tabs>
+      </w:pPr>
+    </w:p>
+    <w:p>
+      <w:pPr>
+        <w:tabs>
+          <w:tab w:val="left" w:pos="3105"/>
+        </w:tabs>
+      </w:pPr>
+    </w:p>
+    <w:p>
+      <w:pPr>
+        <w:tabs>
+          <w:tab w:val="left" w:pos="3105"/>
+        </w:tabs>
+      </w:pPr>
+      <w:r>
+        <w:t xml:space="preserve">120- </w:t>
+      </w:r>
+      <w:r>
+        <w:t>No box-</w:t>
+      </w:r>
+      <w:proofErr w:type="spellStart"/>
+      <w:r>
+        <w:t>shadow</w:t>
+      </w:r>
+      <w:proofErr w:type="spellEnd"/>
+      <w:r>
+        <w:t xml:space="preserve"> existe o qu</w:t>
+      </w:r>
+      <w:r>
+        <w:t>a</w:t>
+      </w:r>
+      <w:r>
+        <w:t xml:space="preserve">rto </w:t>
+      </w:r>
+      <w:r>
+        <w:t>valor que seria a propriedade que configura a intensidade da borda a partir do tamanho do elemento, isto é, o tamanho da sombra projetando nesta casa inserimos 20px</w:t>
+      </w:r>
+    </w:p>
+    <w:p>
+      <w:pPr>
+        <w:tabs>
+          <w:tab w:val="left" w:pos="3105"/>
+        </w:tabs>
+      </w:pPr>
+    </w:p>
+    <w:p>
+      <w:pPr>
+        <w:tabs>
+          <w:tab w:val="left" w:pos="3105"/>
+        </w:tabs>
+      </w:pPr>
+      <w:r>
+        <w:drawing>
+          <wp:inline distT="0" distB="0" distL="0" distR="0" wp14:anchorId="717D6EDC" wp14:editId="3B199149">
+            <wp:extent cx="2562583" cy="1333686"/>
+            <wp:effectExtent l="0" t="0" r="9525" b="0"/>
+            <wp:docPr id="183" name="Imagem 183"/>
+            <wp:cNvGraphicFramePr>
+              <a:graphicFrameLocks xmlns:a="http://schemas.openxmlformats.org/drawingml/2006/main" noChangeAspect="1"/>
+            </wp:cNvGraphicFramePr>
+            <a:graphic xmlns:a="http://schemas.openxmlformats.org/drawingml/2006/main">
+              <a:graphicData uri="http://schemas.openxmlformats.org/drawingml/2006/picture">
+                <pic:pic xmlns:pic="http://schemas.openxmlformats.org/drawingml/2006/picture">
+                  <pic:nvPicPr>
+                    <pic:cNvPr id="1" name=""/>
+                    <pic:cNvPicPr/>
+                  </pic:nvPicPr>
+                  <pic:blipFill>
+                    <a:blip r:embed="rId194"/>
+                    <a:stretch>
+                      <a:fillRect/>
+                    </a:stretch>
+                  </pic:blipFill>
+                  <pic:spPr>
+                    <a:xfrm>
+                      <a:off x="0" y="0"/>
+                      <a:ext cx="2562583" cy="1333686"/>
+                    </a:xfrm>
+                    <a:prstGeom prst="rect">
+                      <a:avLst/>
+                    </a:prstGeom>
+                  </pic:spPr>
+                </pic:pic>
+              </a:graphicData>
+            </a:graphic>
+          </wp:inline>
+        </w:drawing>
+      </w:r>
+    </w:p>
+    <w:p>
+      <w:pPr>
+        <w:tabs>
+          <w:tab w:val="left" w:pos="3105"/>
+        </w:tabs>
+      </w:pPr>
+    </w:p>
+    <w:p>
+      <w:pPr>
+        <w:tabs>
+          <w:tab w:val="left" w:pos="3105"/>
+        </w:tabs>
+      </w:pPr>
+      <w:r>
+        <w:t>121- Design</w:t>
+      </w:r>
+      <w:r>
+        <w:t xml:space="preserve"> responsável</w:t>
+      </w:r>
+    </w:p>
+    <w:p>
+      <w:pPr>
+        <w:tabs>
+          <w:tab w:val="left" w:pos="3105"/>
+        </w:tabs>
+      </w:pPr>
+      <w:r>
+        <w:t xml:space="preserve"> O que podemos para saber se a nossa página está adaptada para uso do celular </w:t>
+      </w:r>
+    </w:p>
+    <w:p>
+      <w:pPr>
+        <w:tabs>
+          <w:tab w:val="left" w:pos="3105"/>
+        </w:tabs>
+      </w:pPr>
+      <w:r>
+        <w:t>Tem duas formas de abrir e para verificar a ferramenta do desenvolvimento onde podemos verificar.</w:t>
+      </w:r>
+    </w:p>
+    <w:p>
+      <w:pPr>
+        <w:pStyle w:val="PargrafodaLista"/>
+        <w:tabs>
+          <w:tab w:val="left" w:pos="3105"/>
+        </w:tabs>
+      </w:pPr>
+      <w:r>
+        <w:t>1-</w:t>
+      </w:r>
+      <w:proofErr w:type="gramStart"/>
+      <w:r>
+        <w:t>contr</w:t>
+      </w:r>
+      <w:proofErr w:type="gramEnd"/>
+      <w:r>
+        <w:t xml:space="preserve"> + </w:t>
+      </w:r>
+      <w:proofErr w:type="spellStart"/>
+      <w:r>
+        <w:t>shitf+</w:t>
+      </w:r>
+      <w:r>
+        <w:t>I</w:t>
+      </w:r>
+      <w:proofErr w:type="spellEnd"/>
+    </w:p>
+    <w:p>
+      <w:pPr>
+        <w:pStyle w:val="PargrafodaLista"/>
+        <w:tabs>
+          <w:tab w:val="left" w:pos="3105"/>
+        </w:tabs>
+      </w:pPr>
+      <w:r>
+        <w:t>2-F12</w:t>
+      </w:r>
+    </w:p>
+    <w:p>
+      <w:pPr>
+        <w:tabs>
+          <w:tab w:val="left" w:pos="3105"/>
+        </w:tabs>
+      </w:pPr>
+      <w:r>
+        <w:rPr>
+          <w:noProof/>
+        </w:rPr>
+        <w:drawing>
+          <wp:inline distT="0" distB="0" distL="0" distR="0" wp14:anchorId="37CB7F85">
+            <wp:extent cx="6259054" cy="1266825"/>
+            <wp:effectExtent l="0" t="0" r="8890" b="0"/>
+            <wp:docPr id="184" name="Imagem 184"/>
+            <wp:cNvGraphicFramePr>
+              <a:graphicFrameLocks xmlns:a="http://schemas.openxmlformats.org/drawingml/2006/main" noChangeAspect="1"/>
+            </wp:cNvGraphicFramePr>
+            <a:graphic xmlns:a="http://schemas.openxmlformats.org/drawingml/2006/main">
+              <a:graphicData uri="http://schemas.openxmlformats.org/drawingml/2006/picture">
+                <pic:pic xmlns:pic="http://schemas.openxmlformats.org/drawingml/2006/picture">
+                  <pic:nvPicPr>
+                    <pic:cNvPr id="0" name="Picture 2"/>
+                    <pic:cNvPicPr>
+                      <a:picLocks noChangeAspect="1" noChangeArrowheads="1"/>
+                    </pic:cNvPicPr>
+                  </pic:nvPicPr>
+                  <pic:blipFill>
+                    <a:blip r:embed="rId195">
+                      <a:extLst>
+                        <a:ext uri="{28A0092B-C50C-407E-A947-70E740481C1C}">
+                          <a14:useLocalDpi xmlns:a14="http://schemas.microsoft.com/office/drawing/2010/main" val="0"/>
+                        </a:ext>
+                      </a:extLst>
+                    </a:blip>
+                    <a:srcRect/>
+                    <a:stretch>
+                      <a:fillRect/>
+                    </a:stretch>
+                  </pic:blipFill>
+                  <pic:spPr bwMode="auto">
+                    <a:xfrm>
+                      <a:off x="0" y="0"/>
+                      <a:ext cx="6366853" cy="1288643"/>
+                    </a:xfrm>
+                    <a:prstGeom prst="rect">
+                      <a:avLst/>
+                    </a:prstGeom>
+                    <a:noFill/>
+                  </pic:spPr>
+                </pic:pic>
+              </a:graphicData>
+            </a:graphic>
+          </wp:inline>
+        </w:drawing>
+      </w:r>
+    </w:p>
+    <w:p/>
+    <w:p>
+      <w:pPr>
+        <w:tabs>
+          <w:tab w:val="left" w:pos="1305"/>
+        </w:tabs>
+      </w:pPr>
+      <w:r>
+        <w:t xml:space="preserve"> Ao clicar no botão </w:t>
+      </w:r>
+      <w:r>
+        <w:t>conforme desenho acima p</w:t>
+      </w:r>
+      <w:r>
+        <w:t>odemos ver o nosso site como ele se comporta com o formato de celular</w:t>
+      </w:r>
+    </w:p>
+    <w:p>
+      <w:pPr>
+        <w:tabs>
+          <w:tab w:val="left" w:pos="1305"/>
+        </w:tabs>
+      </w:pPr>
+    </w:p>
+    <w:p>
+      <w:pPr>
+        <w:tabs>
+          <w:tab w:val="left" w:pos="1305"/>
+        </w:tabs>
+      </w:pPr>
+      <w:r>
+        <w:t xml:space="preserve">122- Precisamos compreender quantos pixels existe na tela para trabalharmos em uma melhor exibição atualmente a nossa tela esta adaptada ao tamanho disponibilizado </w:t>
+      </w:r>
+      <w:r>
+        <w:t>pelo navegador de 940px mínimo.</w:t>
+      </w:r>
+    </w:p>
+    <w:p>
+      <w:pPr>
+        <w:tabs>
+          <w:tab w:val="left" w:pos="1305"/>
+        </w:tabs>
+      </w:pPr>
+      <w:r>
+        <w:t xml:space="preserve">No caso dos celulares o panorama é mais diferente mesmo que a resolução de dispositivo de celular seja de 2000px a quantidade de pixels na tela sempre será diferente esses valores são chamados de </w:t>
+      </w:r>
+      <w:proofErr w:type="spellStart"/>
+      <w:r>
+        <w:t>dpi</w:t>
+      </w:r>
+      <w:proofErr w:type="spellEnd"/>
+      <w:r>
+        <w:t xml:space="preserve"> que a densidade de pixels por polegada.</w:t>
+      </w:r>
+    </w:p>
+    <w:p>
+      <w:pPr>
+        <w:tabs>
+          <w:tab w:val="left" w:pos="1305"/>
+        </w:tabs>
+      </w:pPr>
+      <w:r>
+        <w:t>Geralmente ainda possuem 320px de largura de tela, alguns maiores 350px a 480px.</w:t>
+      </w:r>
+    </w:p>
+    <w:p>
+      <w:pPr>
+        <w:tabs>
+          <w:tab w:val="left" w:pos="1305"/>
+        </w:tabs>
+        <w:rPr>
+          <w:b/>
+        </w:rPr>
+      </w:pPr>
+      <w:r>
+        <w:rPr>
+          <w:b/>
+        </w:rPr>
+        <w:t xml:space="preserve">Para saber a quantidade de pixels o navegador utiliza uma </w:t>
+      </w:r>
+      <w:proofErr w:type="spellStart"/>
+      <w:r>
+        <w:rPr>
+          <w:b/>
+        </w:rPr>
+        <w:t>tag</w:t>
+      </w:r>
+      <w:proofErr w:type="spellEnd"/>
+      <w:r>
+        <w:rPr>
+          <w:b/>
+        </w:rPr>
+        <w:t xml:space="preserve"> do </w:t>
+      </w:r>
+      <w:proofErr w:type="spellStart"/>
+      <w:r>
+        <w:rPr>
+          <w:b/>
+        </w:rPr>
+        <w:t>html</w:t>
+      </w:r>
+      <w:proofErr w:type="spellEnd"/>
+      <w:r>
+        <w:rPr>
+          <w:b/>
+        </w:rPr>
+        <w:t xml:space="preserve"> </w:t>
+      </w:r>
+      <w:proofErr w:type="gramStart"/>
+      <w:r>
+        <w:rPr>
+          <w:b/>
+        </w:rPr>
+        <w:t>( ou</w:t>
+      </w:r>
+      <w:proofErr w:type="gramEnd"/>
+      <w:r>
+        <w:rPr>
+          <w:b/>
+        </w:rPr>
+        <w:t xml:space="preserve"> seja para saber o tamanho da tela que </w:t>
+      </w:r>
+      <w:proofErr w:type="spellStart"/>
+      <w:r>
+        <w:rPr>
+          <w:b/>
+        </w:rPr>
+        <w:t>esta</w:t>
+      </w:r>
+      <w:proofErr w:type="spellEnd"/>
+      <w:r>
+        <w:rPr>
+          <w:b/>
+        </w:rPr>
+        <w:t xml:space="preserve"> sendo renderizado o site</w:t>
+      </w:r>
+    </w:p>
+    <w:p>
+      <w:pPr>
+        <w:tabs>
+          <w:tab w:val="left" w:pos="1305"/>
+        </w:tabs>
+        <w:rPr>
+          <w:b/>
+        </w:rPr>
+      </w:pPr>
+      <w:r>
+        <w:rPr>
+          <w:b/>
+          <w:noProof/>
+        </w:rPr>
+        <w:drawing>
+          <wp:inline distT="0" distB="0" distL="0" distR="0" wp14:anchorId="5B250213">
+            <wp:extent cx="4363085" cy="209550"/>
+            <wp:effectExtent l="0" t="0" r="0" b="0"/>
+            <wp:docPr id="186" name="Imagem 186"/>
+            <wp:cNvGraphicFramePr>
+              <a:graphicFrameLocks xmlns:a="http://schemas.openxmlformats.org/drawingml/2006/main" noChangeAspect="1"/>
+            </wp:cNvGraphicFramePr>
+            <a:graphic xmlns:a="http://schemas.openxmlformats.org/drawingml/2006/main">
+              <a:graphicData uri="http://schemas.openxmlformats.org/drawingml/2006/picture">
+                <pic:pic xmlns:pic="http://schemas.openxmlformats.org/drawingml/2006/picture">
+                  <pic:nvPicPr>
+                    <pic:cNvPr id="0" name="Picture 4"/>
+                    <pic:cNvPicPr>
+                      <a:picLocks noChangeAspect="1" noChangeArrowheads="1"/>
+                    </pic:cNvPicPr>
+                  </pic:nvPicPr>
+                  <pic:blipFill>
+                    <a:blip r:embed="rId196">
+                      <a:extLst>
+                        <a:ext uri="{28A0092B-C50C-407E-A947-70E740481C1C}">
+                          <a14:useLocalDpi xmlns:a14="http://schemas.microsoft.com/office/drawing/2010/main" val="0"/>
+                        </a:ext>
+                      </a:extLst>
+                    </a:blip>
+                    <a:srcRect/>
+                    <a:stretch>
+                      <a:fillRect/>
+                    </a:stretch>
+                  </pic:blipFill>
+                  <pic:spPr bwMode="auto">
+                    <a:xfrm>
+                      <a:off x="0" y="0"/>
+                      <a:ext cx="4363085" cy="209550"/>
+                    </a:xfrm>
+                    <a:prstGeom prst="rect">
+                      <a:avLst/>
+                    </a:prstGeom>
+                    <a:noFill/>
+                  </pic:spPr>
+                </pic:pic>
+              </a:graphicData>
+            </a:graphic>
+          </wp:inline>
+        </w:drawing>
+      </w:r>
+    </w:p>
+    <w:p>
+      <w:pPr>
+        <w:tabs>
+          <w:tab w:val="left" w:pos="1305"/>
+        </w:tabs>
+        <w:rPr>
+          <w:b/>
+        </w:rPr>
+      </w:pPr>
+    </w:p>
+    <w:p>
+      <w:pPr>
+        <w:tabs>
+          <w:tab w:val="left" w:pos="1305"/>
+        </w:tabs>
+      </w:pPr>
+      <w:r>
+        <w:t>123-</w:t>
+      </w:r>
+      <w:r>
+        <w:t xml:space="preserve"> Estamos informando ao navegador ao fazer uma pesquisa a onde possui </w:t>
+      </w:r>
+      <w:proofErr w:type="gramStart"/>
+      <w:r>
+        <w:t>um tela</w:t>
+      </w:r>
+      <w:proofErr w:type="gramEnd"/>
+      <w:r>
+        <w:t xml:space="preserve"> que </w:t>
+      </w:r>
       <w:bookmarkStart w:id="0" w:name="_GoBack"/>
       <w:bookmarkEnd w:id="0"/>
-    </w:p>
-    <w:p>
-      <w:pPr>
-        <w:tabs>
-          <w:tab w:val="left" w:pos="3105"/>
-        </w:tabs>
-      </w:pPr>
-      <w:r>
-        <w:t xml:space="preserve"> </w:t>
-      </w:r>
-    </w:p>
-    <w:p>
-      <w:pPr>
-        <w:tabs>
-          <w:tab w:val="left" w:pos="3105"/>
-        </w:tabs>
-      </w:pPr>
-    </w:p>
-    <w:p>
-      <w:pPr>
-        <w:tabs>
-          <w:tab w:val="left" w:pos="3105"/>
-        </w:tabs>
-      </w:pPr>
-    </w:p>
-    <w:p>
-      <w:pPr>
-        <w:tabs>
-          <w:tab w:val="left" w:pos="3105"/>
-        </w:tabs>
-      </w:pPr>
-    </w:p>
-    <w:p>
-      <w:pPr>
-        <w:tabs>
-          <w:tab w:val="left" w:pos="3105"/>
-        </w:tabs>
-      </w:pPr>
-    </w:p>
-    <w:p>
-      <w:pPr>
-        <w:tabs>
-          <w:tab w:val="left" w:pos="3105"/>
-        </w:tabs>
-      </w:pPr>
-    </w:p>
-    <w:p>
-      <w:pPr>
-        <w:tabs>
-          <w:tab w:val="left" w:pos="3105"/>
-        </w:tabs>
-      </w:pPr>
-      <w:r>
-        <w:t xml:space="preserve"> </w:t>
+      <w:r>
+        <w:t xml:space="preserve">a largura máxima seja 480px precisa entregar seguintes configurações </w:t>
+      </w:r>
+    </w:p>
+    <w:p>
+      <w:pPr>
+        <w:tabs>
+          <w:tab w:val="left" w:pos="1305"/>
+        </w:tabs>
+      </w:pPr>
+      <w:r>
+        <w:rPr>
+          <w:noProof/>
+        </w:rPr>
+        <w:drawing>
+          <wp:inline distT="0" distB="0" distL="0" distR="0" wp14:anchorId="21D426C1">
+            <wp:extent cx="2439035" cy="514350"/>
+            <wp:effectExtent l="0" t="0" r="0" b="0"/>
+            <wp:docPr id="187" name="Imagem 187"/>
+            <wp:cNvGraphicFramePr>
+              <a:graphicFrameLocks xmlns:a="http://schemas.openxmlformats.org/drawingml/2006/main" noChangeAspect="1"/>
+            </wp:cNvGraphicFramePr>
+            <a:graphic xmlns:a="http://schemas.openxmlformats.org/drawingml/2006/main">
+              <a:graphicData uri="http://schemas.openxmlformats.org/drawingml/2006/picture">
+                <pic:pic xmlns:pic="http://schemas.openxmlformats.org/drawingml/2006/picture">
+                  <pic:nvPicPr>
+                    <pic:cNvPr id="0" name="Picture 5"/>
+                    <pic:cNvPicPr>
+                      <a:picLocks noChangeAspect="1" noChangeArrowheads="1"/>
+                    </pic:cNvPicPr>
+                  </pic:nvPicPr>
+                  <pic:blipFill>
+                    <a:blip r:embed="rId197">
+                      <a:extLst>
+                        <a:ext uri="{28A0092B-C50C-407E-A947-70E740481C1C}">
+                          <a14:useLocalDpi xmlns:a14="http://schemas.microsoft.com/office/drawing/2010/main" val="0"/>
+                        </a:ext>
+                      </a:extLst>
+                    </a:blip>
+                    <a:srcRect/>
+                    <a:stretch>
+                      <a:fillRect/>
+                    </a:stretch>
+                  </pic:blipFill>
+                  <pic:spPr bwMode="auto">
+                    <a:xfrm>
+                      <a:off x="0" y="0"/>
+                      <a:ext cx="2439035" cy="514350"/>
+                    </a:xfrm>
+                    <a:prstGeom prst="rect">
+                      <a:avLst/>
+                    </a:prstGeom>
+                    <a:noFill/>
+                  </pic:spPr>
+                </pic:pic>
+              </a:graphicData>
+            </a:graphic>
+          </wp:inline>
+        </w:drawing>
+      </w:r>
+    </w:p>
+    <w:p>
+      <w:pPr>
+        <w:tabs>
+          <w:tab w:val="left" w:pos="1305"/>
+        </w:tabs>
+      </w:pPr>
+    </w:p>
+    <w:p>
+      <w:pPr>
+        <w:tabs>
+          <w:tab w:val="left" w:pos="1305"/>
+        </w:tabs>
+      </w:pPr>
+      <w:r>
+        <w:t>124</w:t>
       </w:r>
     </w:p>
     <w:sectPr>
@@ -14304,13 +16248,12 @@
 <file path=word/numbering.xml><?xml version="1.0" encoding="utf-8"?>
 <w:numbering xmlns:wpc="http://schemas.microsoft.com/office/word/2010/wordprocessingCanvas" xmlns:cx="http://schemas.microsoft.com/office/drawing/2014/chartex" xmlns:cx1="http://schemas.microsoft.com/office/drawing/2015/9/8/chartex" xmlns:cx2="http://schemas.microsoft.com/office/drawing/2015/10/21/chartex" xmlns:cx3="http://schemas.microsoft.com/office/drawing/2016/5/9/chartex" xmlns:cx4="http://schemas.microsoft.com/office/drawing/2016/5/10/chartex" xmlns:cx5="http://schemas.microsoft.com/office/drawing/2016/5/11/chartex" xmlns:cx6="http://schemas.microsoft.com/office/drawing/2016/5/12/chartex" xmlns:cx7="http://schemas.microsoft.com/office/drawing/2016/5/13/chartex" xmlns:cx8="http://schemas.microsoft.com/office/drawing/2016/5/14/chartex" xmlns:mc="http://schemas.openxmlformats.org/markup-compatibility/2006" xmlns:aink="http://schemas.microsoft.com/office/drawing/2016/ink" xmlns:am3d="http://schemas.microsoft.com/office/drawing/2017/model3d" xmlns:o="urn:schemas-microsoft-com:office:office" xmlns:r="http://schemas.openxmlformats.org/officeDocument/2006/relationships" xmlns:m="http://schemas.openxmlformats.org/officeDocument/2006/math" xmlns:v="urn:schemas-microsoft-com:vml" xmlns:wp14="http://schemas.microsoft.com/office/word/2010/wordprocessingDrawing" xmlns:wp="http://schemas.openxmlformats.org/drawingml/2006/wordprocessingDrawing" xmlns:w10="urn:schemas-microsoft-com:office:word" xmlns:w="http://schemas.openxmlformats.org/wordprocessingml/2006/main" xmlns:w14="http://schemas.microsoft.com/office/word/2010/wordml" xmlns:w15="http://schemas.microsoft.com/office/word/2012/wordml" xmlns:w16cid="http://schemas.microsoft.com/office/word/2016/wordml/cid" xmlns:w16se="http://schemas.microsoft.com/office/word/2015/wordml/symex" xmlns:wpg="http://schemas.microsoft.com/office/word/2010/wordprocessingGroup" xmlns:wpi="http://schemas.microsoft.com/office/word/2010/wordprocessingInk" xmlns:wne="http://schemas.microsoft.com/office/word/2006/wordml" xmlns:wps="http://schemas.microsoft.com/office/word/2010/wordprocessingShape" mc:Ignorable="w14 w15 w16se w16cid wp14">
   <w:abstractNum w:abstractNumId="0" w15:restartNumberingAfterBreak="0">
-    <w:nsid w:val="0EAB796B"/>
+    <w:nsid w:val="0D4A0D7B"/>
     <w:multiLevelType w:val="hybridMultilevel"/>
-    <w:tmpl w:val="858CE26E"/>
-    <w:lvl w:ilvl="0" w:tplc="0416000F">
-      <w:start w:val="1"/>
+    <w:tmpl w:val="E8686B28"/>
+    <w:lvl w:ilvl="0" w:tplc="09F425B4">
       <w:numFmt w:val="decimal"/>
-      <w:lvlText w:val="%1."/>
+      <w:lvlText w:val="%1-"/>
       <w:lvlJc w:val="left"/>
       <w:pPr>
         <w:ind w:left="720" w:hanging="360"/>
@@ -14393,6 +16336,95 @@
     </w:lvl>
   </w:abstractNum>
   <w:abstractNum w:abstractNumId="1" w15:restartNumberingAfterBreak="0">
+    <w:nsid w:val="0EAB796B"/>
+    <w:multiLevelType w:val="hybridMultilevel"/>
+    <w:tmpl w:val="858CE26E"/>
+    <w:lvl w:ilvl="0" w:tplc="0416000F">
+      <w:start w:val="1"/>
+      <w:numFmt w:val="decimal"/>
+      <w:lvlText w:val="%1."/>
+      <w:lvlJc w:val="left"/>
+      <w:pPr>
+        <w:ind w:left="720" w:hanging="360"/>
+      </w:pPr>
+      <w:rPr>
+        <w:rFonts w:hint="default"/>
+      </w:rPr>
+    </w:lvl>
+    <w:lvl w:ilvl="1" w:tplc="04160019" w:tentative="1">
+      <w:start w:val="1"/>
+      <w:numFmt w:val="lowerLetter"/>
+      <w:lvlText w:val="%2."/>
+      <w:lvlJc w:val="left"/>
+      <w:pPr>
+        <w:ind w:left="1440" w:hanging="360"/>
+      </w:pPr>
+    </w:lvl>
+    <w:lvl w:ilvl="2" w:tplc="0416001B" w:tentative="1">
+      <w:start w:val="1"/>
+      <w:numFmt w:val="lowerRoman"/>
+      <w:lvlText w:val="%3."/>
+      <w:lvlJc w:val="right"/>
+      <w:pPr>
+        <w:ind w:left="2160" w:hanging="180"/>
+      </w:pPr>
+    </w:lvl>
+    <w:lvl w:ilvl="3" w:tplc="0416000F" w:tentative="1">
+      <w:start w:val="1"/>
+      <w:numFmt w:val="decimal"/>
+      <w:lvlText w:val="%4."/>
+      <w:lvlJc w:val="left"/>
+      <w:pPr>
+        <w:ind w:left="2880" w:hanging="360"/>
+      </w:pPr>
+    </w:lvl>
+    <w:lvl w:ilvl="4" w:tplc="04160019" w:tentative="1">
+      <w:start w:val="1"/>
+      <w:numFmt w:val="lowerLetter"/>
+      <w:lvlText w:val="%5."/>
+      <w:lvlJc w:val="left"/>
+      <w:pPr>
+        <w:ind w:left="3600" w:hanging="360"/>
+      </w:pPr>
+    </w:lvl>
+    <w:lvl w:ilvl="5" w:tplc="0416001B" w:tentative="1">
+      <w:start w:val="1"/>
+      <w:numFmt w:val="lowerRoman"/>
+      <w:lvlText w:val="%6."/>
+      <w:lvlJc w:val="right"/>
+      <w:pPr>
+        <w:ind w:left="4320" w:hanging="180"/>
+      </w:pPr>
+    </w:lvl>
+    <w:lvl w:ilvl="6" w:tplc="0416000F" w:tentative="1">
+      <w:start w:val="1"/>
+      <w:numFmt w:val="decimal"/>
+      <w:lvlText w:val="%7."/>
+      <w:lvlJc w:val="left"/>
+      <w:pPr>
+        <w:ind w:left="5040" w:hanging="360"/>
+      </w:pPr>
+    </w:lvl>
+    <w:lvl w:ilvl="7" w:tplc="04160019" w:tentative="1">
+      <w:start w:val="1"/>
+      <w:numFmt w:val="lowerLetter"/>
+      <w:lvlText w:val="%8."/>
+      <w:lvlJc w:val="left"/>
+      <w:pPr>
+        <w:ind w:left="5760" w:hanging="360"/>
+      </w:pPr>
+    </w:lvl>
+    <w:lvl w:ilvl="8" w:tplc="0416001B" w:tentative="1">
+      <w:start w:val="1"/>
+      <w:numFmt w:val="lowerRoman"/>
+      <w:lvlText w:val="%9."/>
+      <w:lvlJc w:val="right"/>
+      <w:pPr>
+        <w:ind w:left="6480" w:hanging="180"/>
+      </w:pPr>
+    </w:lvl>
+  </w:abstractNum>
+  <w:abstractNum w:abstractNumId="2" w15:restartNumberingAfterBreak="0">
     <w:nsid w:val="3179215A"/>
     <w:multiLevelType w:val="hybridMultilevel"/>
     <w:tmpl w:val="8D66FFBA"/>
@@ -14505,7 +16537,7 @@
       </w:rPr>
     </w:lvl>
   </w:abstractNum>
-  <w:abstractNum w:abstractNumId="2" w15:restartNumberingAfterBreak="0">
+  <w:abstractNum w:abstractNumId="3" w15:restartNumberingAfterBreak="0">
     <w:nsid w:val="61DF6460"/>
     <w:multiLevelType w:val="hybridMultilevel"/>
     <w:tmpl w:val="C696E49E"/>
@@ -14594,7 +16626,7 @@
       </w:pPr>
     </w:lvl>
   </w:abstractNum>
-  <w:abstractNum w:abstractNumId="3" w15:restartNumberingAfterBreak="0">
+  <w:abstractNum w:abstractNumId="4" w15:restartNumberingAfterBreak="0">
     <w:nsid w:val="66186F18"/>
     <w:multiLevelType w:val="hybridMultilevel"/>
     <w:tmpl w:val="B7828770"/>
@@ -14684,16 +16716,19 @@
     </w:lvl>
   </w:abstractNum>
   <w:num w:numId="1">
-    <w:abstractNumId w:val="0"/>
+    <w:abstractNumId w:val="1"/>
   </w:num>
   <w:num w:numId="2">
+    <w:abstractNumId w:val="3"/>
+  </w:num>
+  <w:num w:numId="3">
     <w:abstractNumId w:val="2"/>
   </w:num>
-  <w:num w:numId="3">
-    <w:abstractNumId w:val="1"/>
+  <w:num w:numId="4">
+    <w:abstractNumId w:val="4"/>
   </w:num>
-  <w:num w:numId="4">
-    <w:abstractNumId w:val="3"/>
+  <w:num w:numId="5">
+    <w:abstractNumId w:val="0"/>
   </w:num>
 </w:numbering>
 </file>
@@ -15504,7 +17539,7 @@
 </file>
 
 <file path=customXml/itemProps1.xml><?xml version="1.0" encoding="utf-8"?>
-<ds:datastoreItem xmlns:ds="http://schemas.openxmlformats.org/officeDocument/2006/customXml" ds:itemID="{7775E608-6D19-41D9-A78D-C93A97E5E174}">
+<ds:datastoreItem xmlns:ds="http://schemas.openxmlformats.org/officeDocument/2006/customXml" ds:itemID="{4BCE72E7-FEF5-44E2-92D9-C82D49622FEA}">
   <ds:schemaRefs>
     <ds:schemaRef ds:uri="http://schemas.openxmlformats.org/officeDocument/2006/bibliography"/>
   </ds:schemaRefs>

</xml_diff>

<commit_message>
Atualização da aula 19/10/2026
</commit_message>
<xml_diff>
--- a/apostila/Projeto Space For Men.docx
+++ b/apostila/Projeto Space For Men.docx
@@ -17672,13 +17672,156 @@
       </w:r>
       <w:proofErr w:type="spellEnd"/>
       <w:r>
-        <w:t xml:space="preserve"> utilizando o github</w:t>
-      </w:r>
+        <w:t xml:space="preserve"> utilizando o </w:t>
+      </w:r>
+      <w:proofErr w:type="spellStart"/>
+      <w:r>
+        <w:t>github</w:t>
+      </w:r>
+      <w:proofErr w:type="spellEnd"/>
+      <w:r>
+        <w:t xml:space="preserve"> </w:t>
+      </w:r>
+      <w:r>
+        <w:t xml:space="preserve"> </w:t>
+      </w:r>
+    </w:p>
+    <w:p>
+      <w:pPr>
+        <w:pStyle w:val="PargrafodaLista"/>
+        <w:numPr>
+          <w:ilvl w:val="0"/>
+          <w:numId w:val="3"/>
+        </w:numPr>
+        <w:tabs>
+          <w:tab w:val="left" w:pos="1305"/>
+        </w:tabs>
+      </w:pPr>
+      <w:r>
+        <w:t xml:space="preserve">Entre no </w:t>
+      </w:r>
+      <w:proofErr w:type="spellStart"/>
+      <w:r>
+        <w:t>github</w:t>
+      </w:r>
+      <w:proofErr w:type="spellEnd"/>
+      <w:r>
+        <w:t xml:space="preserve"> no repositório que estamos trabalhando </w:t>
+      </w:r>
+    </w:p>
+    <w:p>
+      <w:pPr>
+        <w:pStyle w:val="PargrafodaLista"/>
+        <w:numPr>
+          <w:ilvl w:val="0"/>
+          <w:numId w:val="3"/>
+        </w:numPr>
+        <w:tabs>
+          <w:tab w:val="left" w:pos="1305"/>
+        </w:tabs>
+      </w:pPr>
+      <w:r>
+        <w:t xml:space="preserve">Nas configurações vamos e </w:t>
+      </w:r>
+      <w:proofErr w:type="spellStart"/>
+      <w:r>
+        <w:t>pages</w:t>
+      </w:r>
+      <w:proofErr w:type="spellEnd"/>
+      <w:r>
+        <w:t xml:space="preserve"> </w:t>
+      </w:r>
+    </w:p>
+    <w:p>
+      <w:pPr>
+        <w:pStyle w:val="PargrafodaLista"/>
+        <w:tabs>
+          <w:tab w:val="left" w:pos="1305"/>
+        </w:tabs>
+        <w:ind w:left="1080"/>
+      </w:pPr>
+    </w:p>
+    <w:p>
+      <w:pPr>
+        <w:pStyle w:val="PargrafodaLista"/>
+        <w:tabs>
+          <w:tab w:val="left" w:pos="1305"/>
+        </w:tabs>
+        <w:ind w:left="1080"/>
+      </w:pPr>
+      <w:r>
+        <w:t xml:space="preserve"> </w:t>
+      </w:r>
+      <w:r>
+        <w:rPr>
+          <w:noProof/>
+        </w:rPr>
+        <w:drawing>
+          <wp:inline distT="0" distB="0" distL="0" distR="0" wp14:anchorId="4D67328F">
+            <wp:extent cx="5183505" cy="2450060"/>
+            <wp:effectExtent l="0" t="0" r="0" b="7620"/>
+            <wp:docPr id="204" name="Imagem 204"/>
+            <wp:cNvGraphicFramePr>
+              <a:graphicFrameLocks xmlns:a="http://schemas.openxmlformats.org/drawingml/2006/main" noChangeAspect="1"/>
+            </wp:cNvGraphicFramePr>
+            <a:graphic xmlns:a="http://schemas.openxmlformats.org/drawingml/2006/main">
+              <a:graphicData uri="http://schemas.openxmlformats.org/drawingml/2006/picture">
+                <pic:pic xmlns:pic="http://schemas.openxmlformats.org/drawingml/2006/picture">
+                  <pic:nvPicPr>
+                    <pic:cNvPr id="0" name="Picture 6"/>
+                    <pic:cNvPicPr>
+                      <a:picLocks noChangeAspect="1" noChangeArrowheads="1"/>
+                    </pic:cNvPicPr>
+                  </pic:nvPicPr>
+                  <pic:blipFill>
+                    <a:blip r:embed="rId215" cstate="print">
+                      <a:extLst>
+                        <a:ext uri="{28A0092B-C50C-407E-A947-70E740481C1C}">
+                          <a14:useLocalDpi xmlns:a14="http://schemas.microsoft.com/office/drawing/2010/main" val="0"/>
+                        </a:ext>
+                      </a:extLst>
+                    </a:blip>
+                    <a:srcRect/>
+                    <a:stretch>
+                      <a:fillRect/>
+                    </a:stretch>
+                  </pic:blipFill>
+                  <pic:spPr bwMode="auto">
+                    <a:xfrm>
+                      <a:off x="0" y="0"/>
+                      <a:ext cx="5254355" cy="2483548"/>
+                    </a:xfrm>
+                    <a:prstGeom prst="rect">
+                      <a:avLst/>
+                    </a:prstGeom>
+                    <a:noFill/>
+                  </pic:spPr>
+                </pic:pic>
+              </a:graphicData>
+            </a:graphic>
+          </wp:inline>
+        </w:drawing>
+      </w:r>
+    </w:p>
+    <w:p>
+      <w:pPr>
+        <w:pStyle w:val="PargrafodaLista"/>
+        <w:tabs>
+          <w:tab w:val="left" w:pos="1305"/>
+        </w:tabs>
+        <w:ind w:left="1080"/>
+      </w:pPr>
+    </w:p>
+    <w:p>
+      <w:pPr>
+        <w:pStyle w:val="PargrafodaLista"/>
+        <w:tabs>
+          <w:tab w:val="left" w:pos="1305"/>
+        </w:tabs>
+        <w:ind w:left="1080"/>
+      </w:pPr>
       <w:bookmarkStart w:id="0" w:name="_GoBack"/>
       <w:bookmarkEnd w:id="0"/>
-      <w:r>
-        <w:t xml:space="preserve"> </w:t>
-      </w:r>
     </w:p>
     <w:sectPr>
       <w:pgSz w:w="11906" w:h="16838"/>
@@ -19034,7 +19177,7 @@
 </file>
 
 <file path=customXml/itemProps1.xml><?xml version="1.0" encoding="utf-8"?>
-<ds:datastoreItem xmlns:ds="http://schemas.openxmlformats.org/officeDocument/2006/customXml" ds:itemID="{C7562083-1EFB-461E-80A6-98368F3C33A9}">
+<ds:datastoreItem xmlns:ds="http://schemas.openxmlformats.org/officeDocument/2006/customXml" ds:itemID="{7C4147C7-91F1-4D59-A080-6886D6CCA852}">
   <ds:schemaRefs>
     <ds:schemaRef ds:uri="http://schemas.openxmlformats.org/officeDocument/2006/bibliography"/>
   </ds:schemaRefs>

</xml_diff>